<commit_message>
Reorganizacion del menu principal, para no tener que importar controller a main, nueva funcion llamada invalido en utilis funge como helper
</commit_message>
<xml_diff>
--- a/Doc/Documentación Externa.docx
+++ b/Doc/Documentación Externa.docx
@@ -85,6 +85,16 @@
         <w:jc w:val="center"/>
         <w:rPr>
           <w:rFonts w:ascii="Times New Roman" w:hAnsi="Times New Roman" w:cs="Times New Roman"/>
+          <w:lang w:val="es-ES"/>
+        </w:rPr>
+      </w:pPr>
+    </w:p>
+    <w:p>
+      <w:pPr>
+        <w:spacing w:after="0" w:line="480" w:lineRule="auto"/>
+        <w:jc w:val="center"/>
+        <w:rPr>
+          <w:rFonts w:ascii="Times New Roman" w:hAnsi="Times New Roman" w:cs="Times New Roman"/>
           <w:b/>
           <w:bCs/>
           <w:lang w:val="es-ES"/>
@@ -97,9 +107,8 @@
           <w:bCs/>
           <w:lang w:val="es-ES"/>
         </w:rPr>
-        <w:t xml:space="preserve">Proyecto Programado: </w:t>
-      </w:r>
-      <w:proofErr w:type="spellStart"/>
+        <w:t xml:space="preserve">Documentación Externa del Primer </w:t>
+      </w:r>
       <w:r>
         <w:rPr>
           <w:rFonts w:ascii="Times New Roman" w:hAnsi="Times New Roman" w:cs="Times New Roman"/>
@@ -107,9 +116,26 @@
           <w:bCs/>
           <w:lang w:val="es-ES"/>
         </w:rPr>
-        <w:t>Devspaces</w:t>
-      </w:r>
-      <w:proofErr w:type="spellEnd"/>
+        <w:t>Proyecto Programado: Devspaces</w:t>
+      </w:r>
+    </w:p>
+    <w:p>
+      <w:pPr>
+        <w:spacing w:after="0" w:line="480" w:lineRule="auto"/>
+        <w:rPr>
+          <w:rFonts w:ascii="Times New Roman" w:hAnsi="Times New Roman" w:cs="Times New Roman"/>
+          <w:lang w:val="es-ES"/>
+        </w:rPr>
+      </w:pPr>
+    </w:p>
+    <w:p>
+      <w:pPr>
+        <w:spacing w:after="0" w:line="480" w:lineRule="auto"/>
+        <w:rPr>
+          <w:rFonts w:ascii="Times New Roman" w:hAnsi="Times New Roman" w:cs="Times New Roman"/>
+          <w:lang w:val="es-ES"/>
+        </w:rPr>
+      </w:pPr>
     </w:p>
     <w:p>
       <w:pPr>
@@ -130,6 +156,13 @@
           <w:lang w:val="es-ES"/>
         </w:rPr>
       </w:pPr>
+      <w:r>
+        <w:rPr>
+          <w:rFonts w:ascii="Times New Roman" w:hAnsi="Times New Roman" w:cs="Times New Roman"/>
+          <w:lang w:val="es-ES"/>
+        </w:rPr>
+        <w:t>Alonso Rodríguez Bolaños</w:t>
+      </w:r>
     </w:p>
     <w:p>
       <w:pPr>
@@ -140,13 +173,6 @@
           <w:lang w:val="es-ES"/>
         </w:rPr>
       </w:pPr>
-      <w:r>
-        <w:rPr>
-          <w:rFonts w:ascii="Times New Roman" w:hAnsi="Times New Roman" w:cs="Times New Roman"/>
-          <w:lang w:val="es-ES"/>
-        </w:rPr>
-        <w:t>Alonso Rodríguez Bolaños</w:t>
-      </w:r>
     </w:p>
     <w:p>
       <w:pPr>
@@ -171,12 +197,46 @@
     <w:p>
       <w:pPr>
         <w:spacing w:after="0" w:line="480" w:lineRule="auto"/>
+        <w:rPr>
+          <w:rFonts w:ascii="Times New Roman" w:hAnsi="Times New Roman" w:cs="Times New Roman"/>
+          <w:lang w:val="es-ES"/>
+        </w:rPr>
+      </w:pPr>
+    </w:p>
+    <w:p>
+      <w:pPr>
+        <w:spacing w:after="0" w:line="480" w:lineRule="auto"/>
+        <w:rPr>
+          <w:rFonts w:ascii="Times New Roman" w:hAnsi="Times New Roman" w:cs="Times New Roman"/>
+          <w:lang w:val="es-ES"/>
+        </w:rPr>
+      </w:pPr>
+    </w:p>
+    <w:p>
+      <w:pPr>
+        <w:spacing w:after="0" w:line="480" w:lineRule="auto"/>
+        <w:rPr>
+          <w:rFonts w:ascii="Times New Roman" w:hAnsi="Times New Roman" w:cs="Times New Roman"/>
+          <w:lang w:val="es-ES"/>
+        </w:rPr>
+      </w:pPr>
+    </w:p>
+    <w:p>
+      <w:pPr>
+        <w:spacing w:after="0" w:line="480" w:lineRule="auto"/>
         <w:jc w:val="center"/>
         <w:rPr>
           <w:rFonts w:ascii="Times New Roman" w:hAnsi="Times New Roman" w:cs="Times New Roman"/>
           <w:lang w:val="es-ES"/>
         </w:rPr>
       </w:pPr>
+      <w:r>
+        <w:rPr>
+          <w:rFonts w:ascii="Times New Roman" w:hAnsi="Times New Roman" w:cs="Times New Roman"/>
+          <w:lang w:val="es-ES"/>
+        </w:rPr>
+        <w:t>Sede San Carlos</w:t>
+      </w:r>
     </w:p>
     <w:p>
       <w:pPr>
@@ -207,79 +267,3456 @@
           <w:lang w:val="es-ES"/>
         </w:rPr>
       </w:pPr>
-    </w:p>
-    <w:p>
-      <w:pPr>
-        <w:spacing w:after="0" w:line="480" w:lineRule="auto"/>
+      <w:r>
+        <w:rPr>
+          <w:rFonts w:ascii="Times New Roman" w:hAnsi="Times New Roman" w:cs="Times New Roman"/>
+          <w:lang w:val="es-ES"/>
+        </w:rPr>
+        <w:t>24 de abril de 2026</w:t>
+      </w:r>
+      <w:r>
+        <w:rPr>
+          <w:rFonts w:ascii="Times New Roman" w:hAnsi="Times New Roman" w:cs="Times New Roman"/>
+          <w:lang w:val="es-ES"/>
+        </w:rPr>
+        <w:br w:type="page"/>
+      </w:r>
+    </w:p>
+    <w:sdt>
+      <w:sdtPr>
+        <w:id w:val="146710072"/>
+        <w:docPartObj>
+          <w:docPartGallery w:val="Table of Contents"/>
+          <w:docPartUnique/>
+        </w:docPartObj>
+      </w:sdtPr>
+      <w:sdtEndPr>
+        <w:rPr>
+          <w:rFonts w:asciiTheme="minorHAnsi" w:eastAsiaTheme="minorHAnsi" w:hAnsiTheme="minorHAnsi" w:cstheme="minorBidi"/>
+          <w:noProof/>
+          <w:color w:val="auto"/>
+          <w:kern w:val="2"/>
+          <w:sz w:val="24"/>
+          <w:szCs w:val="24"/>
+          <w:lang w:val="en-CR"/>
+          <w14:ligatures w14:val="standardContextual"/>
+        </w:rPr>
+      </w:sdtEndPr>
+      <w:sdtContent>
+        <w:p>
+          <w:pPr>
+            <w:pStyle w:val="TOCHeading"/>
+            <w:rPr>
+              <w:rFonts w:ascii="Times New Roman" w:hAnsi="Times New Roman" w:cs="Times New Roman"/>
+              <w:color w:val="000000" w:themeColor="text1"/>
+              <w:sz w:val="24"/>
+              <w:szCs w:val="24"/>
+            </w:rPr>
+          </w:pPr>
+          <w:proofErr w:type="spellStart"/>
+          <w:r>
+            <w:rPr>
+              <w:rFonts w:ascii="Times New Roman" w:hAnsi="Times New Roman" w:cs="Times New Roman"/>
+              <w:color w:val="000000" w:themeColor="text1"/>
+              <w:sz w:val="24"/>
+              <w:szCs w:val="24"/>
+            </w:rPr>
+            <w:t>Tabl</w:t>
+          </w:r>
+          <w:r>
+            <w:rPr>
+              <w:rFonts w:ascii="Times New Roman" w:hAnsi="Times New Roman" w:cs="Times New Roman"/>
+              <w:color w:val="000000" w:themeColor="text1"/>
+              <w:sz w:val="24"/>
+              <w:szCs w:val="24"/>
+            </w:rPr>
+            <w:t>a</w:t>
+          </w:r>
+          <w:proofErr w:type="spellEnd"/>
+          <w:r>
+            <w:rPr>
+              <w:rFonts w:ascii="Times New Roman" w:hAnsi="Times New Roman" w:cs="Times New Roman"/>
+              <w:color w:val="000000" w:themeColor="text1"/>
+              <w:sz w:val="24"/>
+              <w:szCs w:val="24"/>
+            </w:rPr>
+            <w:t xml:space="preserve"> de Contenidos</w:t>
+          </w:r>
+        </w:p>
+        <w:p>
+          <w:pPr>
+            <w:pStyle w:val="TOC1"/>
+            <w:tabs>
+              <w:tab w:val="right" w:leader="dot" w:pos="9350"/>
+            </w:tabs>
+            <w:rPr>
+              <w:rFonts w:eastAsiaTheme="minorEastAsia"/>
+              <w:b w:val="0"/>
+              <w:bCs w:val="0"/>
+              <w:i w:val="0"/>
+              <w:iCs w:val="0"/>
+              <w:noProof/>
+            </w:rPr>
+          </w:pPr>
+          <w:r>
+            <w:rPr>
+              <w:rFonts w:ascii="Times New Roman" w:hAnsi="Times New Roman" w:cs="Times New Roman"/>
+              <w:b w:val="0"/>
+              <w:bCs w:val="0"/>
+              <w:color w:val="000000" w:themeColor="text1"/>
+            </w:rPr>
+            <w:fldChar w:fldCharType="begin"/>
+          </w:r>
+          <w:r>
+            <w:rPr>
+              <w:rFonts w:ascii="Times New Roman" w:hAnsi="Times New Roman" w:cs="Times New Roman"/>
+              <w:color w:val="000000" w:themeColor="text1"/>
+            </w:rPr>
+            <w:instrText xml:space="preserve"> TOC \o "1-3" \h \z \u </w:instrText>
+          </w:r>
+          <w:r>
+            <w:rPr>
+              <w:rFonts w:ascii="Times New Roman" w:hAnsi="Times New Roman" w:cs="Times New Roman"/>
+              <w:b w:val="0"/>
+              <w:bCs w:val="0"/>
+              <w:color w:val="000000" w:themeColor="text1"/>
+            </w:rPr>
+            <w:fldChar w:fldCharType="separate"/>
+          </w:r>
+          <w:hyperlink w:anchor="_Toc227886400" w:history="1">
+            <w:r>
+              <w:rPr>
+                <w:rStyle w:val="Hyperlink"/>
+                <w:rFonts w:ascii="Times New Roman" w:hAnsi="Times New Roman" w:cs="Times New Roman"/>
+                <w:noProof/>
+                <w:lang w:val="es-ES"/>
+              </w:rPr>
+              <w:t>Introducción</w:t>
+            </w:r>
+            <w:r>
+              <w:rPr>
+                <w:noProof/>
+                <w:webHidden/>
+              </w:rPr>
+              <w:tab/>
+            </w:r>
+            <w:r>
+              <w:rPr>
+                <w:noProof/>
+                <w:webHidden/>
+              </w:rPr>
+              <w:fldChar w:fldCharType="begin"/>
+            </w:r>
+            <w:r>
+              <w:rPr>
+                <w:noProof/>
+                <w:webHidden/>
+              </w:rPr>
+              <w:instrText xml:space="preserve"> PAGEREF _Toc227886400 \h </w:instrText>
+            </w:r>
+            <w:r>
+              <w:rPr>
+                <w:noProof/>
+                <w:webHidden/>
+              </w:rPr>
+            </w:r>
+            <w:r>
+              <w:rPr>
+                <w:noProof/>
+                <w:webHidden/>
+              </w:rPr>
+              <w:fldChar w:fldCharType="separate"/>
+            </w:r>
+            <w:r>
+              <w:rPr>
+                <w:noProof/>
+                <w:webHidden/>
+              </w:rPr>
+              <w:t>3</w:t>
+            </w:r>
+            <w:r>
+              <w:rPr>
+                <w:noProof/>
+                <w:webHidden/>
+              </w:rPr>
+              <w:fldChar w:fldCharType="end"/>
+            </w:r>
+          </w:hyperlink>
+        </w:p>
+        <w:p>
+          <w:pPr>
+            <w:pStyle w:val="TOC1"/>
+            <w:tabs>
+              <w:tab w:val="right" w:leader="dot" w:pos="9350"/>
+            </w:tabs>
+            <w:rPr>
+              <w:rFonts w:eastAsiaTheme="minorEastAsia"/>
+              <w:b w:val="0"/>
+              <w:bCs w:val="0"/>
+              <w:i w:val="0"/>
+              <w:iCs w:val="0"/>
+              <w:noProof/>
+            </w:rPr>
+          </w:pPr>
+          <w:hyperlink w:anchor="_Toc227886401" w:history="1">
+            <w:r>
+              <w:rPr>
+                <w:rStyle w:val="Hyperlink"/>
+                <w:rFonts w:ascii="Times New Roman" w:hAnsi="Times New Roman" w:cs="Times New Roman"/>
+                <w:noProof/>
+                <w:lang w:val="es-ES"/>
+              </w:rPr>
+              <w:t>Análisis del problema</w:t>
+            </w:r>
+            <w:r>
+              <w:rPr>
+                <w:noProof/>
+                <w:webHidden/>
+              </w:rPr>
+              <w:tab/>
+            </w:r>
+            <w:r>
+              <w:rPr>
+                <w:noProof/>
+                <w:webHidden/>
+              </w:rPr>
+              <w:fldChar w:fldCharType="begin"/>
+            </w:r>
+            <w:r>
+              <w:rPr>
+                <w:noProof/>
+                <w:webHidden/>
+              </w:rPr>
+              <w:instrText xml:space="preserve"> PAGEREF _Toc227886401 \h </w:instrText>
+            </w:r>
+            <w:r>
+              <w:rPr>
+                <w:noProof/>
+                <w:webHidden/>
+              </w:rPr>
+            </w:r>
+            <w:r>
+              <w:rPr>
+                <w:noProof/>
+                <w:webHidden/>
+              </w:rPr>
+              <w:fldChar w:fldCharType="separate"/>
+            </w:r>
+            <w:r>
+              <w:rPr>
+                <w:noProof/>
+                <w:webHidden/>
+              </w:rPr>
+              <w:t>4</w:t>
+            </w:r>
+            <w:r>
+              <w:rPr>
+                <w:noProof/>
+                <w:webHidden/>
+              </w:rPr>
+              <w:fldChar w:fldCharType="end"/>
+            </w:r>
+          </w:hyperlink>
+        </w:p>
+        <w:p>
+          <w:pPr>
+            <w:pStyle w:val="TOC2"/>
+            <w:tabs>
+              <w:tab w:val="right" w:leader="dot" w:pos="9350"/>
+            </w:tabs>
+            <w:rPr>
+              <w:rFonts w:eastAsiaTheme="minorEastAsia"/>
+              <w:b w:val="0"/>
+              <w:bCs w:val="0"/>
+              <w:noProof/>
+              <w:sz w:val="24"/>
+              <w:szCs w:val="24"/>
+            </w:rPr>
+          </w:pPr>
+          <w:hyperlink w:anchor="_Toc227886402" w:history="1">
+            <w:r>
+              <w:rPr>
+                <w:rStyle w:val="Hyperlink"/>
+                <w:rFonts w:ascii="Times New Roman" w:eastAsia="Times New Roman" w:hAnsi="Times New Roman" w:cs="Times New Roman"/>
+                <w:noProof/>
+              </w:rPr>
+              <w:t>Requerimientos Funcionales</w:t>
+            </w:r>
+            <w:r>
+              <w:rPr>
+                <w:noProof/>
+                <w:webHidden/>
+              </w:rPr>
+              <w:tab/>
+            </w:r>
+            <w:r>
+              <w:rPr>
+                <w:noProof/>
+                <w:webHidden/>
+              </w:rPr>
+              <w:fldChar w:fldCharType="begin"/>
+            </w:r>
+            <w:r>
+              <w:rPr>
+                <w:noProof/>
+                <w:webHidden/>
+              </w:rPr>
+              <w:instrText xml:space="preserve"> PAGEREF _Toc227886402 \h </w:instrText>
+            </w:r>
+            <w:r>
+              <w:rPr>
+                <w:noProof/>
+                <w:webHidden/>
+              </w:rPr>
+            </w:r>
+            <w:r>
+              <w:rPr>
+                <w:noProof/>
+                <w:webHidden/>
+              </w:rPr>
+              <w:fldChar w:fldCharType="separate"/>
+            </w:r>
+            <w:r>
+              <w:rPr>
+                <w:noProof/>
+                <w:webHidden/>
+              </w:rPr>
+              <w:t>4</w:t>
+            </w:r>
+            <w:r>
+              <w:rPr>
+                <w:noProof/>
+                <w:webHidden/>
+              </w:rPr>
+              <w:fldChar w:fldCharType="end"/>
+            </w:r>
+          </w:hyperlink>
+        </w:p>
+        <w:p>
+          <w:pPr>
+            <w:pStyle w:val="TOC2"/>
+            <w:tabs>
+              <w:tab w:val="right" w:leader="dot" w:pos="9350"/>
+            </w:tabs>
+            <w:rPr>
+              <w:rFonts w:eastAsiaTheme="minorEastAsia"/>
+              <w:b w:val="0"/>
+              <w:bCs w:val="0"/>
+              <w:noProof/>
+              <w:sz w:val="24"/>
+              <w:szCs w:val="24"/>
+            </w:rPr>
+          </w:pPr>
+          <w:hyperlink w:anchor="_Toc227886403" w:history="1">
+            <w:r>
+              <w:rPr>
+                <w:rStyle w:val="Hyperlink"/>
+                <w:rFonts w:ascii="Times New Roman" w:eastAsia="Times New Roman" w:hAnsi="Times New Roman" w:cs="Times New Roman"/>
+                <w:noProof/>
+              </w:rPr>
+              <w:t>Requerimientos No Funcionales</w:t>
+            </w:r>
+            <w:r>
+              <w:rPr>
+                <w:noProof/>
+                <w:webHidden/>
+              </w:rPr>
+              <w:tab/>
+            </w:r>
+            <w:r>
+              <w:rPr>
+                <w:noProof/>
+                <w:webHidden/>
+              </w:rPr>
+              <w:fldChar w:fldCharType="begin"/>
+            </w:r>
+            <w:r>
+              <w:rPr>
+                <w:noProof/>
+                <w:webHidden/>
+              </w:rPr>
+              <w:instrText xml:space="preserve"> PAGEREF _Toc227886403 \h </w:instrText>
+            </w:r>
+            <w:r>
+              <w:rPr>
+                <w:noProof/>
+                <w:webHidden/>
+              </w:rPr>
+            </w:r>
+            <w:r>
+              <w:rPr>
+                <w:noProof/>
+                <w:webHidden/>
+              </w:rPr>
+              <w:fldChar w:fldCharType="separate"/>
+            </w:r>
+            <w:r>
+              <w:rPr>
+                <w:noProof/>
+                <w:webHidden/>
+              </w:rPr>
+              <w:t>4</w:t>
+            </w:r>
+            <w:r>
+              <w:rPr>
+                <w:noProof/>
+                <w:webHidden/>
+              </w:rPr>
+              <w:fldChar w:fldCharType="end"/>
+            </w:r>
+          </w:hyperlink>
+        </w:p>
+        <w:p>
+          <w:pPr>
+            <w:pStyle w:val="TOC2"/>
+            <w:tabs>
+              <w:tab w:val="right" w:leader="dot" w:pos="9350"/>
+            </w:tabs>
+            <w:rPr>
+              <w:rFonts w:eastAsiaTheme="minorEastAsia"/>
+              <w:b w:val="0"/>
+              <w:bCs w:val="0"/>
+              <w:noProof/>
+              <w:sz w:val="24"/>
+              <w:szCs w:val="24"/>
+            </w:rPr>
+          </w:pPr>
+          <w:hyperlink w:anchor="_Toc227886404" w:history="1">
+            <w:r>
+              <w:rPr>
+                <w:rStyle w:val="Hyperlink"/>
+                <w:rFonts w:ascii="Times New Roman" w:eastAsia="Times New Roman" w:hAnsi="Times New Roman" w:cs="Times New Roman"/>
+                <w:noProof/>
+              </w:rPr>
+              <w:t>Restricciones</w:t>
+            </w:r>
+            <w:r>
+              <w:rPr>
+                <w:noProof/>
+                <w:webHidden/>
+              </w:rPr>
+              <w:tab/>
+            </w:r>
+            <w:r>
+              <w:rPr>
+                <w:noProof/>
+                <w:webHidden/>
+              </w:rPr>
+              <w:fldChar w:fldCharType="begin"/>
+            </w:r>
+            <w:r>
+              <w:rPr>
+                <w:noProof/>
+                <w:webHidden/>
+              </w:rPr>
+              <w:instrText xml:space="preserve"> PAGEREF _Toc227886404 \h </w:instrText>
+            </w:r>
+            <w:r>
+              <w:rPr>
+                <w:noProof/>
+                <w:webHidden/>
+              </w:rPr>
+            </w:r>
+            <w:r>
+              <w:rPr>
+                <w:noProof/>
+                <w:webHidden/>
+              </w:rPr>
+              <w:fldChar w:fldCharType="separate"/>
+            </w:r>
+            <w:r>
+              <w:rPr>
+                <w:noProof/>
+                <w:webHidden/>
+              </w:rPr>
+              <w:t>5</w:t>
+            </w:r>
+            <w:r>
+              <w:rPr>
+                <w:noProof/>
+                <w:webHidden/>
+              </w:rPr>
+              <w:fldChar w:fldCharType="end"/>
+            </w:r>
+          </w:hyperlink>
+        </w:p>
+        <w:p>
+          <w:pPr>
+            <w:pStyle w:val="TOC1"/>
+            <w:tabs>
+              <w:tab w:val="right" w:leader="dot" w:pos="9350"/>
+            </w:tabs>
+            <w:rPr>
+              <w:rFonts w:eastAsiaTheme="minorEastAsia"/>
+              <w:b w:val="0"/>
+              <w:bCs w:val="0"/>
+              <w:i w:val="0"/>
+              <w:iCs w:val="0"/>
+              <w:noProof/>
+            </w:rPr>
+          </w:pPr>
+          <w:hyperlink w:anchor="_Toc227886405" w:history="1">
+            <w:r>
+              <w:rPr>
+                <w:rStyle w:val="Hyperlink"/>
+                <w:rFonts w:ascii="Times New Roman" w:hAnsi="Times New Roman" w:cs="Times New Roman"/>
+                <w:noProof/>
+                <w:lang w:val="es-ES"/>
+              </w:rPr>
+              <w:t>Solución del Problema</w:t>
+            </w:r>
+            <w:r>
+              <w:rPr>
+                <w:noProof/>
+                <w:webHidden/>
+              </w:rPr>
+              <w:tab/>
+            </w:r>
+            <w:r>
+              <w:rPr>
+                <w:noProof/>
+                <w:webHidden/>
+              </w:rPr>
+              <w:fldChar w:fldCharType="begin"/>
+            </w:r>
+            <w:r>
+              <w:rPr>
+                <w:noProof/>
+                <w:webHidden/>
+              </w:rPr>
+              <w:instrText xml:space="preserve"> PAGEREF _Toc227886405 \h </w:instrText>
+            </w:r>
+            <w:r>
+              <w:rPr>
+                <w:noProof/>
+                <w:webHidden/>
+              </w:rPr>
+            </w:r>
+            <w:r>
+              <w:rPr>
+                <w:noProof/>
+                <w:webHidden/>
+              </w:rPr>
+              <w:fldChar w:fldCharType="separate"/>
+            </w:r>
+            <w:r>
+              <w:rPr>
+                <w:noProof/>
+                <w:webHidden/>
+              </w:rPr>
+              <w:t>6</w:t>
+            </w:r>
+            <w:r>
+              <w:rPr>
+                <w:noProof/>
+                <w:webHidden/>
+              </w:rPr>
+              <w:fldChar w:fldCharType="end"/>
+            </w:r>
+          </w:hyperlink>
+        </w:p>
+        <w:p>
+          <w:pPr>
+            <w:pStyle w:val="TOC1"/>
+            <w:tabs>
+              <w:tab w:val="right" w:leader="dot" w:pos="9350"/>
+            </w:tabs>
+            <w:rPr>
+              <w:rFonts w:eastAsiaTheme="minorEastAsia"/>
+              <w:b w:val="0"/>
+              <w:bCs w:val="0"/>
+              <w:i w:val="0"/>
+              <w:iCs w:val="0"/>
+              <w:noProof/>
+            </w:rPr>
+          </w:pPr>
+          <w:hyperlink w:anchor="_Toc227886406" w:history="1">
+            <w:r>
+              <w:rPr>
+                <w:rStyle w:val="Hyperlink"/>
+                <w:rFonts w:ascii="Times New Roman" w:hAnsi="Times New Roman" w:cs="Times New Roman"/>
+                <w:noProof/>
+                <w:lang w:val="es-ES"/>
+              </w:rPr>
+              <w:t>Análisis de Resultados</w:t>
+            </w:r>
+            <w:r>
+              <w:rPr>
+                <w:noProof/>
+                <w:webHidden/>
+              </w:rPr>
+              <w:tab/>
+            </w:r>
+            <w:r>
+              <w:rPr>
+                <w:noProof/>
+                <w:webHidden/>
+              </w:rPr>
+              <w:fldChar w:fldCharType="begin"/>
+            </w:r>
+            <w:r>
+              <w:rPr>
+                <w:noProof/>
+                <w:webHidden/>
+              </w:rPr>
+              <w:instrText xml:space="preserve"> PAGEREF _Toc227886406 \h </w:instrText>
+            </w:r>
+            <w:r>
+              <w:rPr>
+                <w:noProof/>
+                <w:webHidden/>
+              </w:rPr>
+            </w:r>
+            <w:r>
+              <w:rPr>
+                <w:noProof/>
+                <w:webHidden/>
+              </w:rPr>
+              <w:fldChar w:fldCharType="separate"/>
+            </w:r>
+            <w:r>
+              <w:rPr>
+                <w:noProof/>
+                <w:webHidden/>
+              </w:rPr>
+              <w:t>7</w:t>
+            </w:r>
+            <w:r>
+              <w:rPr>
+                <w:noProof/>
+                <w:webHidden/>
+              </w:rPr>
+              <w:fldChar w:fldCharType="end"/>
+            </w:r>
+          </w:hyperlink>
+        </w:p>
+        <w:p>
+          <w:pPr>
+            <w:pStyle w:val="TOC1"/>
+            <w:tabs>
+              <w:tab w:val="right" w:leader="dot" w:pos="9350"/>
+            </w:tabs>
+            <w:rPr>
+              <w:rFonts w:eastAsiaTheme="minorEastAsia"/>
+              <w:b w:val="0"/>
+              <w:bCs w:val="0"/>
+              <w:i w:val="0"/>
+              <w:iCs w:val="0"/>
+              <w:noProof/>
+            </w:rPr>
+          </w:pPr>
+          <w:hyperlink w:anchor="_Toc227886407" w:history="1">
+            <w:r>
+              <w:rPr>
+                <w:rStyle w:val="Hyperlink"/>
+                <w:rFonts w:ascii="Times New Roman" w:hAnsi="Times New Roman" w:cs="Times New Roman"/>
+                <w:noProof/>
+                <w:lang w:val="es-ES"/>
+              </w:rPr>
+              <w:t>Conclusiones</w:t>
+            </w:r>
+            <w:r>
+              <w:rPr>
+                <w:noProof/>
+                <w:webHidden/>
+              </w:rPr>
+              <w:tab/>
+            </w:r>
+            <w:r>
+              <w:rPr>
+                <w:noProof/>
+                <w:webHidden/>
+              </w:rPr>
+              <w:fldChar w:fldCharType="begin"/>
+            </w:r>
+            <w:r>
+              <w:rPr>
+                <w:noProof/>
+                <w:webHidden/>
+              </w:rPr>
+              <w:instrText xml:space="preserve"> PAGEREF _Toc227886407 \h </w:instrText>
+            </w:r>
+            <w:r>
+              <w:rPr>
+                <w:noProof/>
+                <w:webHidden/>
+              </w:rPr>
+            </w:r>
+            <w:r>
+              <w:rPr>
+                <w:noProof/>
+                <w:webHidden/>
+              </w:rPr>
+              <w:fldChar w:fldCharType="separate"/>
+            </w:r>
+            <w:r>
+              <w:rPr>
+                <w:noProof/>
+                <w:webHidden/>
+              </w:rPr>
+              <w:t>8</w:t>
+            </w:r>
+            <w:r>
+              <w:rPr>
+                <w:noProof/>
+                <w:webHidden/>
+              </w:rPr>
+              <w:fldChar w:fldCharType="end"/>
+            </w:r>
+          </w:hyperlink>
+        </w:p>
+        <w:p>
+          <w:pPr>
+            <w:pStyle w:val="TOC1"/>
+            <w:tabs>
+              <w:tab w:val="right" w:leader="dot" w:pos="9350"/>
+            </w:tabs>
+            <w:rPr>
+              <w:rFonts w:eastAsiaTheme="minorEastAsia"/>
+              <w:b w:val="0"/>
+              <w:bCs w:val="0"/>
+              <w:i w:val="0"/>
+              <w:iCs w:val="0"/>
+              <w:noProof/>
+            </w:rPr>
+          </w:pPr>
+          <w:hyperlink w:anchor="_Toc227886408" w:history="1">
+            <w:r>
+              <w:rPr>
+                <w:rStyle w:val="Hyperlink"/>
+                <w:rFonts w:ascii="Times New Roman" w:hAnsi="Times New Roman" w:cs="Times New Roman"/>
+                <w:noProof/>
+                <w:lang w:val="es-ES"/>
+              </w:rPr>
+              <w:t>Recomendaciones</w:t>
+            </w:r>
+            <w:r>
+              <w:rPr>
+                <w:noProof/>
+                <w:webHidden/>
+              </w:rPr>
+              <w:tab/>
+            </w:r>
+            <w:r>
+              <w:rPr>
+                <w:noProof/>
+                <w:webHidden/>
+              </w:rPr>
+              <w:fldChar w:fldCharType="begin"/>
+            </w:r>
+            <w:r>
+              <w:rPr>
+                <w:noProof/>
+                <w:webHidden/>
+              </w:rPr>
+              <w:instrText xml:space="preserve"> PAGEREF _Toc227886408 \h </w:instrText>
+            </w:r>
+            <w:r>
+              <w:rPr>
+                <w:noProof/>
+                <w:webHidden/>
+              </w:rPr>
+            </w:r>
+            <w:r>
+              <w:rPr>
+                <w:noProof/>
+                <w:webHidden/>
+              </w:rPr>
+              <w:fldChar w:fldCharType="separate"/>
+            </w:r>
+            <w:r>
+              <w:rPr>
+                <w:noProof/>
+                <w:webHidden/>
+              </w:rPr>
+              <w:t>8</w:t>
+            </w:r>
+            <w:r>
+              <w:rPr>
+                <w:noProof/>
+                <w:webHidden/>
+              </w:rPr>
+              <w:fldChar w:fldCharType="end"/>
+            </w:r>
+          </w:hyperlink>
+        </w:p>
+        <w:p>
+          <w:pPr>
+            <w:pStyle w:val="TOC1"/>
+            <w:tabs>
+              <w:tab w:val="right" w:leader="dot" w:pos="9350"/>
+            </w:tabs>
+            <w:rPr>
+              <w:rFonts w:eastAsiaTheme="minorEastAsia"/>
+              <w:b w:val="0"/>
+              <w:bCs w:val="0"/>
+              <w:i w:val="0"/>
+              <w:iCs w:val="0"/>
+              <w:noProof/>
+            </w:rPr>
+          </w:pPr>
+          <w:hyperlink w:anchor="_Toc227886409" w:history="1">
+            <w:r>
+              <w:rPr>
+                <w:rStyle w:val="Hyperlink"/>
+                <w:rFonts w:ascii="Times New Roman" w:hAnsi="Times New Roman" w:cs="Times New Roman"/>
+                <w:noProof/>
+                <w:lang w:val="es-ES"/>
+              </w:rPr>
+              <w:t>Referencias</w:t>
+            </w:r>
+            <w:r>
+              <w:rPr>
+                <w:noProof/>
+                <w:webHidden/>
+              </w:rPr>
+              <w:tab/>
+            </w:r>
+            <w:r>
+              <w:rPr>
+                <w:noProof/>
+                <w:webHidden/>
+              </w:rPr>
+              <w:fldChar w:fldCharType="begin"/>
+            </w:r>
+            <w:r>
+              <w:rPr>
+                <w:noProof/>
+                <w:webHidden/>
+              </w:rPr>
+              <w:instrText xml:space="preserve"> PAGEREF _Toc227886409 \h </w:instrText>
+            </w:r>
+            <w:r>
+              <w:rPr>
+                <w:noProof/>
+                <w:webHidden/>
+              </w:rPr>
+            </w:r>
+            <w:r>
+              <w:rPr>
+                <w:noProof/>
+                <w:webHidden/>
+              </w:rPr>
+              <w:fldChar w:fldCharType="separate"/>
+            </w:r>
+            <w:r>
+              <w:rPr>
+                <w:noProof/>
+                <w:webHidden/>
+              </w:rPr>
+              <w:t>9</w:t>
+            </w:r>
+            <w:r>
+              <w:rPr>
+                <w:noProof/>
+                <w:webHidden/>
+              </w:rPr>
+              <w:fldChar w:fldCharType="end"/>
+            </w:r>
+          </w:hyperlink>
+        </w:p>
+        <w:p>
+          <w:r>
+            <w:rPr>
+              <w:rFonts w:ascii="Times New Roman" w:hAnsi="Times New Roman" w:cs="Times New Roman"/>
+              <w:b/>
+              <w:bCs/>
+              <w:noProof/>
+              <w:color w:val="000000" w:themeColor="text1"/>
+            </w:rPr>
+            <w:fldChar w:fldCharType="end"/>
+          </w:r>
+        </w:p>
+      </w:sdtContent>
+    </w:sdt>
+    <w:p>
+      <w:pPr>
+        <w:rPr>
+          <w:rFonts w:ascii="Times New Roman" w:hAnsi="Times New Roman" w:cs="Times New Roman"/>
+          <w:lang w:val="es-ES"/>
+        </w:rPr>
+      </w:pPr>
+    </w:p>
+    <w:p>
+      <w:pPr>
+        <w:rPr>
+          <w:rFonts w:ascii="Times New Roman" w:hAnsi="Times New Roman" w:cs="Times New Roman"/>
+          <w:lang w:val="es-ES"/>
+        </w:rPr>
+      </w:pPr>
+    </w:p>
+    <w:p>
+      <w:pPr>
+        <w:rPr>
+          <w:rFonts w:ascii="Times New Roman" w:hAnsi="Times New Roman" w:cs="Times New Roman"/>
+          <w:lang w:val="es-ES"/>
+        </w:rPr>
+      </w:pPr>
+    </w:p>
+    <w:p>
+      <w:pPr>
+        <w:rPr>
+          <w:rFonts w:ascii="Times New Roman" w:hAnsi="Times New Roman" w:cs="Times New Roman"/>
+          <w:lang w:val="es-ES"/>
+        </w:rPr>
+      </w:pPr>
+    </w:p>
+    <w:p>
+      <w:pPr>
+        <w:rPr>
+          <w:rFonts w:ascii="Times New Roman" w:hAnsi="Times New Roman" w:cs="Times New Roman"/>
+          <w:lang w:val="es-ES"/>
+        </w:rPr>
+      </w:pPr>
+    </w:p>
+    <w:p>
+      <w:pPr>
+        <w:rPr>
+          <w:rFonts w:ascii="Times New Roman" w:hAnsi="Times New Roman" w:cs="Times New Roman"/>
+          <w:lang w:val="es-ES"/>
+        </w:rPr>
+      </w:pPr>
+    </w:p>
+    <w:p>
+      <w:pPr>
+        <w:rPr>
+          <w:rFonts w:ascii="Times New Roman" w:hAnsi="Times New Roman" w:cs="Times New Roman"/>
+          <w:lang w:val="es-ES"/>
+        </w:rPr>
+      </w:pPr>
+    </w:p>
+    <w:p>
+      <w:pPr>
+        <w:rPr>
+          <w:rFonts w:ascii="Times New Roman" w:hAnsi="Times New Roman" w:cs="Times New Roman"/>
+          <w:lang w:val="es-ES"/>
+        </w:rPr>
+      </w:pPr>
+    </w:p>
+    <w:p>
+      <w:pPr>
+        <w:rPr>
+          <w:rFonts w:ascii="Times New Roman" w:hAnsi="Times New Roman" w:cs="Times New Roman"/>
+          <w:lang w:val="es-ES"/>
+        </w:rPr>
+      </w:pPr>
+    </w:p>
+    <w:p>
+      <w:pPr>
+        <w:rPr>
+          <w:rFonts w:ascii="Times New Roman" w:hAnsi="Times New Roman" w:cs="Times New Roman"/>
+          <w:lang w:val="es-ES"/>
+        </w:rPr>
+      </w:pPr>
+    </w:p>
+    <w:p>
+      <w:pPr>
+        <w:rPr>
+          <w:rFonts w:ascii="Times New Roman" w:hAnsi="Times New Roman" w:cs="Times New Roman"/>
+          <w:lang w:val="es-ES"/>
+        </w:rPr>
+      </w:pPr>
+    </w:p>
+    <w:p>
+      <w:pPr>
+        <w:rPr>
+          <w:rFonts w:ascii="Times New Roman" w:hAnsi="Times New Roman" w:cs="Times New Roman"/>
+          <w:lang w:val="es-ES"/>
+        </w:rPr>
+      </w:pPr>
+    </w:p>
+    <w:p>
+      <w:pPr>
+        <w:rPr>
+          <w:rFonts w:ascii="Times New Roman" w:hAnsi="Times New Roman" w:cs="Times New Roman"/>
+          <w:lang w:val="es-ES"/>
+        </w:rPr>
+      </w:pPr>
+    </w:p>
+    <w:p>
+      <w:pPr>
+        <w:rPr>
+          <w:rFonts w:ascii="Times New Roman" w:hAnsi="Times New Roman" w:cs="Times New Roman"/>
+          <w:lang w:val="es-ES"/>
+        </w:rPr>
+      </w:pPr>
+    </w:p>
+    <w:p>
+      <w:pPr>
+        <w:rPr>
+          <w:rFonts w:ascii="Times New Roman" w:hAnsi="Times New Roman" w:cs="Times New Roman"/>
+          <w:lang w:val="es-ES"/>
+        </w:rPr>
+      </w:pPr>
+    </w:p>
+    <w:p>
+      <w:pPr>
+        <w:rPr>
+          <w:rFonts w:ascii="Times New Roman" w:hAnsi="Times New Roman" w:cs="Times New Roman"/>
+          <w:lang w:val="es-ES"/>
+        </w:rPr>
+      </w:pPr>
+    </w:p>
+    <w:p>
+      <w:pPr>
+        <w:rPr>
+          <w:rFonts w:ascii="Times New Roman" w:hAnsi="Times New Roman" w:cs="Times New Roman"/>
+          <w:lang w:val="es-ES"/>
+        </w:rPr>
+      </w:pPr>
+    </w:p>
+    <w:p>
+      <w:pPr>
+        <w:rPr>
+          <w:rFonts w:ascii="Times New Roman" w:hAnsi="Times New Roman" w:cs="Times New Roman"/>
+          <w:lang w:val="es-ES"/>
+        </w:rPr>
+      </w:pPr>
+    </w:p>
+    <w:p>
+      <w:pPr>
+        <w:pStyle w:val="Heading1"/>
+        <w:spacing w:before="0" w:after="0" w:line="480" w:lineRule="auto"/>
         <w:jc w:val="center"/>
         <w:rPr>
           <w:rFonts w:ascii="Times New Roman" w:hAnsi="Times New Roman" w:cs="Times New Roman"/>
-          <w:lang w:val="es-ES"/>
-        </w:rPr>
-      </w:pPr>
-    </w:p>
-    <w:p>
-      <w:pPr>
-        <w:spacing w:after="0" w:line="480" w:lineRule="auto"/>
+          <w:color w:val="000000" w:themeColor="text1"/>
+          <w:sz w:val="24"/>
+          <w:szCs w:val="24"/>
+          <w:lang w:val="es-ES"/>
+        </w:rPr>
+      </w:pPr>
+      <w:bookmarkStart w:id="0" w:name="_Toc227886400"/>
+      <w:r>
+        <w:rPr>
+          <w:rFonts w:ascii="Times New Roman" w:hAnsi="Times New Roman" w:cs="Times New Roman"/>
+          <w:color w:val="000000" w:themeColor="text1"/>
+          <w:sz w:val="24"/>
+          <w:szCs w:val="24"/>
+          <w:lang w:val="es-ES"/>
+        </w:rPr>
+        <w:t>Introducción</w:t>
+      </w:r>
+      <w:bookmarkEnd w:id="0"/>
+    </w:p>
+    <w:p>
+      <w:pPr>
+        <w:spacing w:after="0" w:line="480" w:lineRule="auto"/>
+        <w:ind w:firstLine="720"/>
+        <w:jc w:val="both"/>
+        <w:rPr>
+          <w:rFonts w:ascii="Times New Roman" w:hAnsi="Times New Roman" w:cs="Times New Roman"/>
+          <w:lang w:val="es-ES"/>
+        </w:rPr>
+      </w:pPr>
+      <w:r>
+        <w:rPr>
+          <w:rFonts w:ascii="Times New Roman" w:hAnsi="Times New Roman" w:cs="Times New Roman"/>
+          <w:lang w:val="es-ES"/>
+        </w:rPr>
+        <w:t xml:space="preserve">El </w:t>
+      </w:r>
+      <w:r>
+        <w:rPr>
+          <w:rFonts w:ascii="Times New Roman" w:hAnsi="Times New Roman" w:cs="Times New Roman"/>
+          <w:lang w:val="es-ES"/>
+        </w:rPr>
+        <w:t xml:space="preserve">proyecto consiste en el desarrollo de una aplicación en terminal, desarrollada exclusivamente en </w:t>
+      </w:r>
+      <w:r>
+        <w:rPr>
+          <w:rFonts w:ascii="Times New Roman" w:hAnsi="Times New Roman" w:cs="Times New Roman"/>
+        </w:rPr>
+        <w:t>el</w:t>
+      </w:r>
+      <w:r>
+        <w:rPr>
+          <w:rFonts w:ascii="Times New Roman" w:hAnsi="Times New Roman" w:cs="Times New Roman"/>
+          <w:lang w:val="es-ES"/>
+        </w:rPr>
+        <w:t xml:space="preserve"> lenguaje </w:t>
+      </w:r>
+      <w:r>
+        <w:rPr>
+          <w:rFonts w:ascii="Times New Roman" w:hAnsi="Times New Roman" w:cs="Times New Roman"/>
+          <w:lang w:val="es-ES"/>
+        </w:rPr>
+        <w:t>Python, cuyo propósito es permitir las diferentes interacciones del usuario con los spaces, que son espacios para subir post</w:t>
+      </w:r>
+      <w:r>
+        <w:rPr>
+          <w:rFonts w:ascii="Times New Roman" w:hAnsi="Times New Roman" w:cs="Times New Roman"/>
+          <w:lang w:val="es-ES"/>
+        </w:rPr>
+        <w:t>s</w:t>
+      </w:r>
+      <w:r>
+        <w:rPr>
+          <w:rFonts w:ascii="Times New Roman" w:hAnsi="Times New Roman" w:cs="Times New Roman"/>
+          <w:lang w:val="es-ES"/>
+        </w:rPr>
+        <w:t>,</w:t>
+      </w:r>
+      <w:r>
+        <w:rPr>
+          <w:rFonts w:ascii="Times New Roman" w:hAnsi="Times New Roman" w:cs="Times New Roman"/>
+          <w:lang w:val="es-ES"/>
+        </w:rPr>
+        <w:t xml:space="preserve"> además de efectos visuales al momento de ver los diferentes posts de un space y funciones que permiten seguir diferentes spaces y a su vez gestionar los seguidores de los spaces propios.</w:t>
+      </w:r>
+    </w:p>
+    <w:p>
+      <w:pPr>
+        <w:spacing w:after="0" w:line="480" w:lineRule="auto"/>
+        <w:rPr>
+          <w:rFonts w:ascii="Times New Roman" w:hAnsi="Times New Roman" w:cs="Times New Roman"/>
+          <w:lang w:val="es-ES"/>
+        </w:rPr>
+      </w:pPr>
+      <w:r>
+        <w:rPr>
+          <w:rFonts w:ascii="Times New Roman" w:hAnsi="Times New Roman" w:cs="Times New Roman"/>
+          <w:lang w:val="es-ES"/>
+        </w:rPr>
+        <w:br w:type="page"/>
+      </w:r>
+    </w:p>
+    <w:p>
+      <w:pPr>
+        <w:pStyle w:val="Heading1"/>
+        <w:spacing w:before="0" w:after="0" w:line="480" w:lineRule="auto"/>
         <w:jc w:val="center"/>
         <w:rPr>
           <w:rFonts w:ascii="Times New Roman" w:hAnsi="Times New Roman" w:cs="Times New Roman"/>
-          <w:lang w:val="es-ES"/>
-        </w:rPr>
-      </w:pPr>
-    </w:p>
-    <w:p>
-      <w:pPr>
-        <w:spacing w:after="0" w:line="480" w:lineRule="auto"/>
+          <w:color w:val="000000" w:themeColor="text1"/>
+          <w:sz w:val="24"/>
+          <w:szCs w:val="24"/>
+          <w:lang w:val="es-ES"/>
+        </w:rPr>
+      </w:pPr>
+      <w:bookmarkStart w:id="1" w:name="_Toc227886401"/>
+      <w:r>
+        <w:rPr>
+          <w:rFonts w:ascii="Times New Roman" w:hAnsi="Times New Roman" w:cs="Times New Roman"/>
+          <w:color w:val="000000" w:themeColor="text1"/>
+          <w:sz w:val="24"/>
+          <w:szCs w:val="24"/>
+          <w:lang w:val="es-ES"/>
+        </w:rPr>
+        <w:lastRenderedPageBreak/>
+        <w:t>Análisis del problema</w:t>
+      </w:r>
+      <w:bookmarkEnd w:id="1"/>
+    </w:p>
+    <w:p>
+      <w:pPr>
+        <w:spacing w:after="0" w:line="480" w:lineRule="auto"/>
+        <w:ind w:firstLine="720"/>
+        <w:jc w:val="both"/>
+        <w:rPr>
+          <w:rFonts w:ascii="Times New Roman" w:hAnsi="Times New Roman" w:cs="Times New Roman"/>
+        </w:rPr>
+      </w:pPr>
+      <w:r>
+        <w:rPr>
+          <w:rFonts w:ascii="Times New Roman" w:eastAsia="Times New Roman" w:hAnsi="Times New Roman" w:cs="Times New Roman"/>
+        </w:rPr>
+        <w:t xml:space="preserve">El sistema </w:t>
+      </w:r>
+      <w:r>
+        <w:rPr>
+          <w:rFonts w:ascii="Times New Roman" w:hAnsi="Times New Roman" w:cs="Times New Roman"/>
+        </w:rPr>
+        <w:t>D</w:t>
+      </w:r>
+      <w:r>
+        <w:rPr>
+          <w:rFonts w:ascii="Times New Roman" w:hAnsi="Times New Roman" w:cs="Times New Roman"/>
+        </w:rPr>
+        <w:t>evspaces</w:t>
+      </w:r>
+      <w:r>
+        <w:rPr>
+          <w:rFonts w:ascii="Times New Roman" w:eastAsia="Times New Roman" w:hAnsi="Times New Roman" w:cs="Times New Roman"/>
+        </w:rPr>
+        <w:t xml:space="preserve">, plantea un sistema de terminal que permite al usuario aplicar diferentes funciones sobre los espacios que contienen posts, llamados spaces </w:t>
+      </w:r>
+    </w:p>
+    <w:p>
+      <w:pPr>
+        <w:pStyle w:val="Heading2"/>
+        <w:spacing w:before="0" w:after="0" w:line="480" w:lineRule="auto"/>
+        <w:rPr>
+          <w:rFonts w:ascii="Times New Roman" w:eastAsia="Times New Roman" w:hAnsi="Times New Roman" w:cs="Times New Roman"/>
+          <w:b/>
+          <w:bCs/>
+          <w:color w:val="000000" w:themeColor="text1"/>
+          <w:sz w:val="24"/>
+          <w:szCs w:val="24"/>
+        </w:rPr>
+      </w:pPr>
+      <w:bookmarkStart w:id="2" w:name="_Toc227886402"/>
+      <w:r>
+        <w:rPr>
+          <w:rFonts w:ascii="Times New Roman" w:eastAsia="Times New Roman" w:hAnsi="Times New Roman" w:cs="Times New Roman"/>
+          <w:b/>
+          <w:bCs/>
+          <w:color w:val="000000" w:themeColor="text1"/>
+          <w:sz w:val="24"/>
+          <w:szCs w:val="24"/>
+        </w:rPr>
+        <w:t>Requerimientos Funcionales</w:t>
+      </w:r>
+      <w:bookmarkEnd w:id="2"/>
+    </w:p>
+    <w:p>
+      <w:pPr>
+        <w:spacing w:after="0" w:line="480" w:lineRule="auto"/>
+        <w:ind w:firstLine="720"/>
+        <w:jc w:val="both"/>
+        <w:rPr>
+          <w:rFonts w:ascii="Times New Roman" w:hAnsi="Times New Roman" w:cs="Times New Roman"/>
+        </w:rPr>
+      </w:pPr>
+      <w:r>
+        <w:rPr>
+          <w:rFonts w:ascii="Times New Roman" w:hAnsi="Times New Roman" w:cs="Times New Roman"/>
+        </w:rPr>
+        <w:t>Las funciones que requiere el sistema Devspaces, referentes a menus, interaciones con spaces y posts, visualización y navegación son:</w:t>
+      </w:r>
+    </w:p>
+    <w:p>
+      <w:pPr>
+        <w:pStyle w:val="Subtitle"/>
+        <w:spacing w:after="0" w:line="480" w:lineRule="auto"/>
+        <w:rPr>
+          <w:rFonts w:ascii="Times New Roman" w:eastAsia="Times New Roman" w:hAnsi="Times New Roman" w:cs="Times New Roman"/>
+          <w:b/>
+          <w:bCs/>
+          <w:i/>
+          <w:iCs/>
+          <w:color w:val="000000" w:themeColor="text1"/>
+          <w:sz w:val="24"/>
+          <w:szCs w:val="24"/>
+        </w:rPr>
+      </w:pPr>
+      <w:r>
+        <w:rPr>
+          <w:rFonts w:ascii="Times New Roman" w:eastAsia="Times New Roman" w:hAnsi="Times New Roman" w:cs="Times New Roman"/>
+          <w:b/>
+          <w:bCs/>
+          <w:i/>
+          <w:iCs/>
+          <w:color w:val="000000" w:themeColor="text1"/>
+          <w:sz w:val="24"/>
+          <w:szCs w:val="24"/>
+        </w:rPr>
+        <w:t>Login</w:t>
+      </w:r>
+    </w:p>
+    <w:p>
+      <w:pPr>
+        <w:spacing w:after="0" w:line="480" w:lineRule="auto"/>
+        <w:ind w:firstLine="720"/>
+        <w:jc w:val="both"/>
+        <w:rPr>
+          <w:rFonts w:ascii="Times New Roman" w:hAnsi="Times New Roman" w:cs="Times New Roman"/>
+        </w:rPr>
+      </w:pPr>
+      <w:r>
+        <w:rPr>
+          <w:rFonts w:ascii="Times New Roman" w:eastAsia="Times New Roman" w:hAnsi="Times New Roman" w:cs="Times New Roman"/>
+        </w:rPr>
+        <w:t>Validación del usuario por medio de la aprovación</w:t>
+      </w:r>
+      <w:r>
+        <w:rPr>
+          <w:rFonts w:ascii="Times New Roman" w:eastAsia="Times New Roman" w:hAnsi="Times New Roman" w:cs="Times New Roman"/>
+        </w:rPr>
+        <w:t xml:space="preserve"> de</w:t>
+      </w:r>
+      <w:r>
+        <w:rPr>
+          <w:rFonts w:ascii="Times New Roman" w:eastAsia="Times New Roman" w:hAnsi="Times New Roman" w:cs="Times New Roman"/>
+        </w:rPr>
+        <w:t xml:space="preserve"> las</w:t>
+      </w:r>
+      <w:r>
+        <w:rPr>
+          <w:rFonts w:ascii="Times New Roman" w:eastAsia="Times New Roman" w:hAnsi="Times New Roman" w:cs="Times New Roman"/>
+        </w:rPr>
+        <w:t xml:space="preserve"> credenciales</w:t>
+      </w:r>
+      <w:r>
+        <w:rPr>
+          <w:rFonts w:ascii="Times New Roman" w:eastAsia="Times New Roman" w:hAnsi="Times New Roman" w:cs="Times New Roman"/>
+        </w:rPr>
+        <w:t xml:space="preserve"> (usuario y contraseña)</w:t>
+      </w:r>
+      <w:r>
+        <w:rPr>
+          <w:rFonts w:ascii="Times New Roman" w:eastAsia="Times New Roman" w:hAnsi="Times New Roman" w:cs="Times New Roman"/>
+        </w:rPr>
+        <w:t xml:space="preserve"> </w:t>
+      </w:r>
+      <w:r>
+        <w:rPr>
+          <w:rFonts w:ascii="Times New Roman" w:eastAsia="Times New Roman" w:hAnsi="Times New Roman" w:cs="Times New Roman"/>
+        </w:rPr>
+        <w:t>con</w:t>
+      </w:r>
+      <w:r>
+        <w:rPr>
+          <w:rFonts w:ascii="Times New Roman" w:eastAsia="Times New Roman" w:hAnsi="Times New Roman" w:cs="Times New Roman"/>
+        </w:rPr>
+        <w:t xml:space="preserve"> el módulo devspace.py.</w:t>
+      </w:r>
+    </w:p>
+    <w:p>
+      <w:pPr>
+        <w:pStyle w:val="Subtitle"/>
+        <w:spacing w:after="0" w:line="480" w:lineRule="auto"/>
+        <w:rPr>
+          <w:rFonts w:ascii="Times New Roman" w:eastAsia="Times New Roman" w:hAnsi="Times New Roman" w:cs="Times New Roman"/>
+          <w:b/>
+          <w:bCs/>
+          <w:i/>
+          <w:iCs/>
+          <w:color w:val="000000" w:themeColor="text1"/>
+          <w:sz w:val="24"/>
+          <w:szCs w:val="24"/>
+        </w:rPr>
+      </w:pPr>
+      <w:r>
+        <w:rPr>
+          <w:rFonts w:ascii="Times New Roman" w:eastAsia="Times New Roman" w:hAnsi="Times New Roman" w:cs="Times New Roman"/>
+          <w:b/>
+          <w:bCs/>
+          <w:i/>
+          <w:iCs/>
+          <w:color w:val="000000" w:themeColor="text1"/>
+          <w:sz w:val="24"/>
+          <w:szCs w:val="24"/>
+        </w:rPr>
+        <w:t>Consultas</w:t>
+      </w:r>
+    </w:p>
+    <w:p>
+      <w:pPr>
+        <w:spacing w:after="0" w:line="480" w:lineRule="auto"/>
+        <w:ind w:firstLine="720"/>
+        <w:jc w:val="both"/>
+        <w:rPr>
+          <w:rFonts w:ascii="Times New Roman" w:eastAsia="Times New Roman" w:hAnsi="Times New Roman" w:cs="Times New Roman"/>
+        </w:rPr>
+      </w:pPr>
+      <w:r>
+        <w:rPr>
+          <w:rFonts w:ascii="Times New Roman" w:eastAsia="Times New Roman" w:hAnsi="Times New Roman" w:cs="Times New Roman"/>
+        </w:rPr>
+        <w:t>Permite obtener un listado de usuarios registrados en el sistema y un listado de todos los spaces disponibles en el sistema.</w:t>
+      </w:r>
+    </w:p>
+    <w:p>
+      <w:pPr>
+        <w:pStyle w:val="Subtitle"/>
+        <w:spacing w:after="0" w:line="480" w:lineRule="auto"/>
+        <w:rPr>
+          <w:rFonts w:ascii="Times New Roman" w:eastAsia="Times New Roman" w:hAnsi="Times New Roman" w:cs="Times New Roman"/>
+          <w:b/>
+          <w:bCs/>
+          <w:i/>
+          <w:iCs/>
+          <w:color w:val="000000" w:themeColor="text1"/>
+          <w:sz w:val="24"/>
+          <w:szCs w:val="24"/>
+        </w:rPr>
+      </w:pPr>
+      <w:r>
+        <w:rPr>
+          <w:rFonts w:ascii="Times New Roman" w:eastAsia="Times New Roman" w:hAnsi="Times New Roman" w:cs="Times New Roman"/>
+          <w:b/>
+          <w:bCs/>
+          <w:i/>
+          <w:iCs/>
+          <w:color w:val="000000" w:themeColor="text1"/>
+          <w:sz w:val="24"/>
+          <w:szCs w:val="24"/>
+        </w:rPr>
+        <w:t>Seguimiento</w:t>
+      </w:r>
+    </w:p>
+    <w:p>
+      <w:pPr>
+        <w:spacing w:after="0" w:line="480" w:lineRule="auto"/>
+        <w:ind w:firstLine="720"/>
+        <w:jc w:val="both"/>
+        <w:rPr>
+          <w:rFonts w:ascii="Times New Roman" w:hAnsi="Times New Roman" w:cs="Times New Roman"/>
+        </w:rPr>
+      </w:pPr>
+      <w:r>
+        <w:rPr>
+          <w:rFonts w:ascii="Times New Roman" w:eastAsia="Times New Roman" w:hAnsi="Times New Roman" w:cs="Times New Roman"/>
+        </w:rPr>
+        <w:t>Per mite al usuario</w:t>
+      </w:r>
+      <w:r>
+        <w:rPr>
+          <w:rFonts w:ascii="Times New Roman" w:eastAsia="Times New Roman" w:hAnsi="Times New Roman" w:cs="Times New Roman"/>
+        </w:rPr>
+        <w:t xml:space="preserve"> </w:t>
+      </w:r>
+      <w:r>
+        <w:rPr>
+          <w:rFonts w:ascii="Times New Roman" w:hAnsi="Times New Roman" w:cs="Times New Roman"/>
+        </w:rPr>
+        <w:t>seguir</w:t>
+      </w:r>
+      <w:r>
+        <w:rPr>
+          <w:rFonts w:ascii="Times New Roman" w:eastAsia="Times New Roman" w:hAnsi="Times New Roman" w:cs="Times New Roman"/>
+        </w:rPr>
+        <w:t xml:space="preserve"> spaces y gestión de </w:t>
+      </w:r>
+      <w:r>
+        <w:rPr>
+          <w:rFonts w:ascii="Times New Roman" w:eastAsia="Times New Roman" w:hAnsi="Times New Roman" w:cs="Times New Roman"/>
+        </w:rPr>
+        <w:t>estos mismos seguimientos activos</w:t>
+      </w:r>
+      <w:r>
+        <w:rPr>
+          <w:rFonts w:ascii="Times New Roman" w:eastAsia="Times New Roman" w:hAnsi="Times New Roman" w:cs="Times New Roman"/>
+        </w:rPr>
+        <w:t xml:space="preserve"> activas.</w:t>
+      </w:r>
+    </w:p>
+    <w:p>
+      <w:pPr>
+        <w:pStyle w:val="Subtitle"/>
+        <w:spacing w:after="0" w:line="480" w:lineRule="auto"/>
+        <w:rPr>
+          <w:rFonts w:ascii="Times New Roman" w:eastAsia="Times New Roman" w:hAnsi="Times New Roman" w:cs="Times New Roman"/>
+          <w:b/>
+          <w:bCs/>
+          <w:i/>
+          <w:iCs/>
+          <w:color w:val="000000" w:themeColor="text1"/>
+          <w:sz w:val="24"/>
+          <w:szCs w:val="24"/>
+        </w:rPr>
+      </w:pPr>
+      <w:r>
+        <w:rPr>
+          <w:rFonts w:ascii="Times New Roman" w:eastAsia="Times New Roman" w:hAnsi="Times New Roman" w:cs="Times New Roman"/>
+          <w:b/>
+          <w:bCs/>
+          <w:i/>
+          <w:iCs/>
+          <w:color w:val="000000" w:themeColor="text1"/>
+          <w:sz w:val="24"/>
+          <w:szCs w:val="24"/>
+        </w:rPr>
+        <w:t>Gestión de Seguidores</w:t>
+      </w:r>
+    </w:p>
+    <w:p>
+      <w:pPr>
+        <w:spacing w:after="0" w:line="480" w:lineRule="auto"/>
+        <w:ind w:firstLine="720"/>
+        <w:jc w:val="both"/>
+        <w:rPr>
+          <w:rFonts w:ascii="Times New Roman" w:hAnsi="Times New Roman" w:cs="Times New Roman"/>
+        </w:rPr>
+      </w:pPr>
+      <w:r>
+        <w:rPr>
+          <w:rFonts w:ascii="Times New Roman" w:hAnsi="Times New Roman" w:cs="Times New Roman"/>
+        </w:rPr>
+        <w:t>Permite al usuario ver y  administrar sus seguidores, aceptando o rechazando sus solicitudes de seguimiento, lo que les permite tener los posts que tiene el space</w:t>
+      </w:r>
+    </w:p>
+    <w:p>
+      <w:pPr>
+        <w:pStyle w:val="Subtitle"/>
+        <w:spacing w:after="0" w:line="480" w:lineRule="auto"/>
+        <w:rPr>
+          <w:rFonts w:ascii="Times New Roman" w:eastAsia="Times New Roman" w:hAnsi="Times New Roman" w:cs="Times New Roman"/>
+          <w:b/>
+          <w:bCs/>
+          <w:i/>
+          <w:iCs/>
+          <w:color w:val="000000" w:themeColor="text1"/>
+          <w:sz w:val="24"/>
+          <w:szCs w:val="24"/>
+        </w:rPr>
+      </w:pPr>
+      <w:r>
+        <w:rPr>
+          <w:rFonts w:ascii="Times New Roman" w:eastAsia="Times New Roman" w:hAnsi="Times New Roman" w:cs="Times New Roman"/>
+          <w:b/>
+          <w:bCs/>
+          <w:i/>
+          <w:iCs/>
+          <w:color w:val="000000" w:themeColor="text1"/>
+          <w:sz w:val="24"/>
+          <w:szCs w:val="24"/>
+        </w:rPr>
+        <w:t xml:space="preserve">Visualización </w:t>
+      </w:r>
+    </w:p>
+    <w:p>
+      <w:pPr>
+        <w:spacing w:after="0" w:line="480" w:lineRule="auto"/>
+        <w:ind w:firstLine="720"/>
+        <w:jc w:val="both"/>
+        <w:rPr>
+          <w:rFonts w:ascii="Times New Roman" w:hAnsi="Times New Roman" w:cs="Times New Roman"/>
+        </w:rPr>
+      </w:pPr>
+      <w:r>
+        <w:rPr>
+          <w:rFonts w:ascii="Times New Roman" w:eastAsia="Times New Roman" w:hAnsi="Times New Roman" w:cs="Times New Roman"/>
+        </w:rPr>
+        <w:t xml:space="preserve">Permite ver los posts de los spaces que sigues los posts </w:t>
+      </w:r>
+      <w:r>
+        <w:rPr>
+          <w:rFonts w:ascii="Times New Roman" w:eastAsia="Times New Roman" w:hAnsi="Times New Roman" w:cs="Times New Roman"/>
+        </w:rPr>
+        <w:t>pueden ser tipo text</w:t>
+      </w:r>
+      <w:r>
+        <w:rPr>
+          <w:rFonts w:ascii="Times New Roman" w:eastAsia="Times New Roman" w:hAnsi="Times New Roman" w:cs="Times New Roman"/>
+        </w:rPr>
+        <w:t xml:space="preserve"> con animación carácter </w:t>
+      </w:r>
+      <w:r>
+        <w:rPr>
+          <w:rFonts w:ascii="Times New Roman" w:hAnsi="Times New Roman" w:cs="Times New Roman"/>
+        </w:rPr>
+        <w:t>por</w:t>
+      </w:r>
+      <w:r>
+        <w:rPr>
+          <w:rFonts w:ascii="Times New Roman" w:eastAsia="Times New Roman" w:hAnsi="Times New Roman" w:cs="Times New Roman"/>
+        </w:rPr>
+        <w:t xml:space="preserve"> carácter</w:t>
+      </w:r>
+      <w:r>
+        <w:rPr>
+          <w:rFonts w:ascii="Times New Roman" w:eastAsia="Times New Roman" w:hAnsi="Times New Roman" w:cs="Times New Roman"/>
+        </w:rPr>
+        <w:t xml:space="preserve"> o tipo</w:t>
+      </w:r>
+      <w:r>
+        <w:rPr>
+          <w:rFonts w:ascii="Times New Roman" w:eastAsia="Times New Roman" w:hAnsi="Times New Roman" w:cs="Times New Roman"/>
+          <w:color w:val="000000" w:themeColor="text1"/>
+        </w:rPr>
+        <w:t xml:space="preserve"> snippets de código con resaltado de palabras clave Python en color.</w:t>
+      </w:r>
+      <w:r>
+        <w:rPr>
+          <w:rFonts w:ascii="Times New Roman" w:hAnsi="Times New Roman" w:cs="Times New Roman"/>
+        </w:rPr>
+        <w:t xml:space="preserve"> Ademas de n</w:t>
+      </w:r>
+      <w:r>
+        <w:rPr>
+          <w:rFonts w:ascii="Times New Roman" w:hAnsi="Times New Roman" w:cs="Times New Roman"/>
+        </w:rPr>
+        <w:t>avegación</w:t>
+      </w:r>
+      <w:r>
+        <w:rPr>
+          <w:rFonts w:ascii="Times New Roman" w:eastAsia="Times New Roman" w:hAnsi="Times New Roman" w:cs="Times New Roman"/>
+          <w:color w:val="000000" w:themeColor="text1"/>
+        </w:rPr>
+        <w:t xml:space="preserve"> entre </w:t>
+      </w:r>
+      <w:r>
+        <w:rPr>
+          <w:rFonts w:ascii="Times New Roman" w:eastAsia="Times New Roman" w:hAnsi="Times New Roman" w:cs="Times New Roman"/>
+          <w:color w:val="000000" w:themeColor="text1"/>
+        </w:rPr>
+        <w:t>posts</w:t>
+      </w:r>
+      <w:r>
+        <w:rPr>
+          <w:rFonts w:ascii="Times New Roman" w:eastAsia="Times New Roman" w:hAnsi="Times New Roman" w:cs="Times New Roman"/>
+          <w:color w:val="000000" w:themeColor="text1"/>
+        </w:rPr>
+        <w:t xml:space="preserve"> dentro de un space.</w:t>
+      </w:r>
+    </w:p>
+    <w:p>
+      <w:pPr>
+        <w:pStyle w:val="Heading2"/>
+        <w:spacing w:before="0" w:after="0" w:line="480" w:lineRule="auto"/>
+        <w:rPr>
+          <w:rFonts w:ascii="Times New Roman" w:eastAsia="Times New Roman" w:hAnsi="Times New Roman" w:cs="Times New Roman"/>
+          <w:b/>
+          <w:bCs/>
+          <w:color w:val="000000" w:themeColor="text1"/>
+          <w:sz w:val="24"/>
+          <w:szCs w:val="24"/>
+        </w:rPr>
+      </w:pPr>
+      <w:bookmarkStart w:id="3" w:name="_Toc227886403"/>
+      <w:r>
+        <w:rPr>
+          <w:rFonts w:ascii="Times New Roman" w:eastAsia="Times New Roman" w:hAnsi="Times New Roman" w:cs="Times New Roman"/>
+          <w:b/>
+          <w:bCs/>
+          <w:color w:val="000000" w:themeColor="text1"/>
+          <w:sz w:val="24"/>
+          <w:szCs w:val="24"/>
+        </w:rPr>
+        <w:t>Requerimientos No Funcionales</w:t>
+      </w:r>
+      <w:bookmarkEnd w:id="3"/>
+    </w:p>
+    <w:p>
+      <w:pPr>
+        <w:spacing w:after="0" w:line="480" w:lineRule="auto"/>
+        <w:ind w:firstLine="720"/>
+        <w:jc w:val="both"/>
+        <w:rPr>
+          <w:rFonts w:ascii="Times New Roman" w:hAnsi="Times New Roman" w:cs="Times New Roman"/>
+        </w:rPr>
+      </w:pPr>
+      <w:r>
+        <w:rPr>
+          <w:rFonts w:ascii="Times New Roman" w:hAnsi="Times New Roman" w:cs="Times New Roman"/>
+        </w:rPr>
+        <w:t>Los requeremientos no funciones del sistema Devspaces son:</w:t>
+      </w:r>
+    </w:p>
+    <w:p>
+      <w:pPr>
+        <w:pStyle w:val="Subtitle"/>
+        <w:spacing w:after="0" w:line="480" w:lineRule="auto"/>
+        <w:rPr>
+          <w:rFonts w:ascii="Times New Roman" w:eastAsia="Times New Roman" w:hAnsi="Times New Roman" w:cs="Times New Roman"/>
+          <w:color w:val="000000" w:themeColor="text1"/>
+          <w:sz w:val="24"/>
+          <w:szCs w:val="24"/>
+        </w:rPr>
+      </w:pPr>
+      <w:r>
+        <w:rPr>
+          <w:rFonts w:ascii="Times New Roman" w:eastAsia="Times New Roman" w:hAnsi="Times New Roman" w:cs="Times New Roman"/>
+          <w:b/>
+          <w:bCs/>
+          <w:i/>
+          <w:iCs/>
+          <w:color w:val="000000" w:themeColor="text1"/>
+          <w:sz w:val="24"/>
+          <w:szCs w:val="24"/>
+        </w:rPr>
+        <w:lastRenderedPageBreak/>
+        <w:t>Estructura</w:t>
+      </w:r>
+    </w:p>
+    <w:p>
+      <w:pPr>
+        <w:spacing w:after="0" w:line="480" w:lineRule="auto"/>
+        <w:ind w:firstLine="720"/>
+        <w:jc w:val="both"/>
+        <w:rPr>
+          <w:rFonts w:ascii="Times New Roman" w:hAnsi="Times New Roman" w:cs="Times New Roman"/>
+        </w:rPr>
+      </w:pPr>
+      <w:r>
+        <w:rPr>
+          <w:rFonts w:ascii="Times New Roman" w:hAnsi="Times New Roman" w:cs="Times New Roman"/>
+        </w:rPr>
+        <w:t xml:space="preserve">Código </w:t>
+      </w:r>
+      <w:r>
+        <w:rPr>
+          <w:rFonts w:ascii="Times New Roman" w:hAnsi="Times New Roman" w:cs="Times New Roman"/>
+        </w:rPr>
+        <w:t>estára</w:t>
+      </w:r>
+      <w:r>
+        <w:rPr>
+          <w:rFonts w:ascii="Times New Roman" w:hAnsi="Times New Roman" w:cs="Times New Roman"/>
+        </w:rPr>
+        <w:t xml:space="preserve"> organizado en archivos:</w:t>
+      </w:r>
+    </w:p>
+    <w:p>
+      <w:pPr>
+        <w:pStyle w:val="ListParagraph"/>
+        <w:numPr>
+          <w:ilvl w:val="0"/>
+          <w:numId w:val="9"/>
+        </w:numPr>
+        <w:spacing w:after="0" w:line="480" w:lineRule="auto"/>
+        <w:jc w:val="both"/>
+        <w:rPr>
+          <w:rFonts w:ascii="Times New Roman" w:hAnsi="Times New Roman" w:cs="Times New Roman"/>
+        </w:rPr>
+      </w:pPr>
+      <w:r>
+        <w:rPr>
+          <w:rFonts w:ascii="Times New Roman" w:hAnsi="Times New Roman" w:cs="Times New Roman"/>
+        </w:rPr>
+        <w:t>main.py</w:t>
+      </w:r>
+    </w:p>
+    <w:p>
+      <w:pPr>
+        <w:pStyle w:val="ListParagraph"/>
+        <w:numPr>
+          <w:ilvl w:val="0"/>
+          <w:numId w:val="9"/>
+        </w:numPr>
+        <w:spacing w:after="0" w:line="480" w:lineRule="auto"/>
+        <w:jc w:val="both"/>
+        <w:rPr>
+          <w:rFonts w:ascii="Times New Roman" w:hAnsi="Times New Roman" w:cs="Times New Roman"/>
+        </w:rPr>
+      </w:pPr>
+      <w:r>
+        <w:rPr>
+          <w:rFonts w:ascii="Times New Roman" w:hAnsi="Times New Roman" w:cs="Times New Roman"/>
+        </w:rPr>
+        <w:t>ui.py</w:t>
+      </w:r>
+    </w:p>
+    <w:p>
+      <w:pPr>
+        <w:pStyle w:val="ListParagraph"/>
+        <w:numPr>
+          <w:ilvl w:val="0"/>
+          <w:numId w:val="9"/>
+        </w:numPr>
+        <w:spacing w:after="0" w:line="480" w:lineRule="auto"/>
+        <w:jc w:val="both"/>
+        <w:rPr>
+          <w:rFonts w:ascii="Times New Roman" w:hAnsi="Times New Roman" w:cs="Times New Roman"/>
+        </w:rPr>
+      </w:pPr>
+      <w:r>
+        <w:rPr>
+          <w:rFonts w:ascii="Times New Roman" w:hAnsi="Times New Roman" w:cs="Times New Roman"/>
+        </w:rPr>
+        <w:t>controller.py</w:t>
+      </w:r>
+    </w:p>
+    <w:p>
+      <w:pPr>
+        <w:pStyle w:val="ListParagraph"/>
+        <w:numPr>
+          <w:ilvl w:val="0"/>
+          <w:numId w:val="9"/>
+        </w:numPr>
+        <w:spacing w:after="0" w:line="480" w:lineRule="auto"/>
+        <w:jc w:val="both"/>
+        <w:rPr>
+          <w:rFonts w:ascii="Times New Roman" w:hAnsi="Times New Roman" w:cs="Times New Roman"/>
+        </w:rPr>
+      </w:pPr>
+      <w:r>
+        <w:rPr>
+          <w:rFonts w:ascii="Times New Roman" w:hAnsi="Times New Roman" w:cs="Times New Roman"/>
+        </w:rPr>
+        <w:t>utils.py.</w:t>
+      </w:r>
+    </w:p>
+    <w:p>
+      <w:pPr>
+        <w:pStyle w:val="ListParagraph"/>
+        <w:numPr>
+          <w:ilvl w:val="0"/>
+          <w:numId w:val="9"/>
+        </w:numPr>
+        <w:spacing w:after="0" w:line="480" w:lineRule="auto"/>
+        <w:jc w:val="both"/>
+        <w:rPr>
+          <w:rFonts w:ascii="Times New Roman" w:hAnsi="Times New Roman" w:cs="Times New Roman"/>
+        </w:rPr>
+      </w:pPr>
+      <w:r>
+        <w:rPr>
+          <w:rFonts w:ascii="Times New Roman" w:hAnsi="Times New Roman" w:cs="Times New Roman"/>
+        </w:rPr>
+        <w:t>/API/devspaces.py</w:t>
+      </w:r>
+    </w:p>
+    <w:p>
+      <w:pPr>
+        <w:pStyle w:val="Subtitle"/>
+        <w:spacing w:after="0" w:line="480" w:lineRule="auto"/>
+        <w:rPr>
+          <w:rFonts w:ascii="Times New Roman" w:eastAsia="Times New Roman" w:hAnsi="Times New Roman" w:cs="Times New Roman"/>
+          <w:b/>
+          <w:bCs/>
+          <w:i/>
+          <w:iCs/>
+          <w:color w:val="000000" w:themeColor="text1"/>
+          <w:sz w:val="24"/>
+          <w:szCs w:val="24"/>
+        </w:rPr>
+      </w:pPr>
+      <w:r>
+        <w:rPr>
+          <w:rFonts w:ascii="Times New Roman" w:eastAsia="Times New Roman" w:hAnsi="Times New Roman" w:cs="Times New Roman"/>
+          <w:b/>
+          <w:bCs/>
+          <w:i/>
+          <w:iCs/>
+          <w:color w:val="000000" w:themeColor="text1"/>
+          <w:sz w:val="24"/>
+          <w:szCs w:val="24"/>
+        </w:rPr>
+        <w:t>Codigo</w:t>
+      </w:r>
+    </w:p>
+    <w:p>
+      <w:pPr>
+        <w:spacing w:after="0" w:line="480" w:lineRule="auto"/>
+        <w:ind w:firstLine="720"/>
+        <w:jc w:val="both"/>
+        <w:rPr>
+          <w:rFonts w:ascii="Times New Roman" w:hAnsi="Times New Roman" w:cs="Times New Roman"/>
+        </w:rPr>
+      </w:pPr>
+      <w:r>
+        <w:rPr>
+          <w:rFonts w:ascii="Times New Roman" w:hAnsi="Times New Roman" w:cs="Times New Roman"/>
+        </w:rPr>
+        <w:t>Debe ser legible y modular, ademas para cada funcion principal definir una funcion, control de errores, y permita una experiencia fluia.</w:t>
+      </w:r>
+    </w:p>
+    <w:p>
+      <w:pPr>
+        <w:pStyle w:val="Subtitle"/>
+        <w:spacing w:after="0" w:line="480" w:lineRule="auto"/>
+        <w:rPr>
+          <w:rFonts w:ascii="Times New Roman" w:eastAsia="Times New Roman" w:hAnsi="Times New Roman" w:cs="Times New Roman"/>
+          <w:b/>
+          <w:bCs/>
+          <w:i/>
+          <w:iCs/>
+          <w:color w:val="000000" w:themeColor="text1"/>
+          <w:sz w:val="24"/>
+          <w:szCs w:val="24"/>
+        </w:rPr>
+      </w:pPr>
+      <w:r>
+        <w:rPr>
+          <w:rFonts w:ascii="Times New Roman" w:eastAsia="Times New Roman" w:hAnsi="Times New Roman" w:cs="Times New Roman"/>
+          <w:b/>
+          <w:bCs/>
+          <w:i/>
+          <w:iCs/>
+          <w:color w:val="000000" w:themeColor="text1"/>
+          <w:sz w:val="24"/>
+          <w:szCs w:val="24"/>
+        </w:rPr>
+        <w:t xml:space="preserve">Documentación interna </w:t>
+      </w:r>
+    </w:p>
+    <w:p>
+      <w:pPr>
+        <w:spacing w:after="0" w:line="480" w:lineRule="auto"/>
+        <w:ind w:firstLine="720"/>
+        <w:jc w:val="both"/>
+        <w:rPr>
+          <w:rFonts w:ascii="Times New Roman" w:eastAsia="Times New Roman" w:hAnsi="Times New Roman" w:cs="Times New Roman"/>
+          <w:color w:val="000000" w:themeColor="text1"/>
+        </w:rPr>
+      </w:pPr>
+      <w:r>
+        <w:rPr>
+          <w:rFonts w:ascii="Times New Roman" w:eastAsia="Times New Roman" w:hAnsi="Times New Roman" w:cs="Times New Roman"/>
+          <w:color w:val="000000" w:themeColor="text1"/>
+        </w:rPr>
+        <w:t xml:space="preserve">Todas las funciones implementadas deben estar </w:t>
+      </w:r>
+      <w:r>
+        <w:rPr>
+          <w:rFonts w:ascii="Times New Roman" w:eastAsia="Times New Roman" w:hAnsi="Times New Roman" w:cs="Times New Roman"/>
+          <w:color w:val="000000" w:themeColor="text1"/>
+        </w:rPr>
+        <w:t>obligatoria</w:t>
+      </w:r>
+      <w:r>
+        <w:rPr>
+          <w:rFonts w:ascii="Times New Roman" w:eastAsia="Times New Roman" w:hAnsi="Times New Roman" w:cs="Times New Roman"/>
+          <w:color w:val="000000" w:themeColor="text1"/>
+        </w:rPr>
+        <w:t>mente documentadas</w:t>
+      </w:r>
+      <w:r>
+        <w:rPr>
+          <w:rFonts w:ascii="Times New Roman" w:eastAsia="Times New Roman" w:hAnsi="Times New Roman" w:cs="Times New Roman"/>
+          <w:color w:val="000000" w:themeColor="text1"/>
+        </w:rPr>
+        <w:t xml:space="preserve"> mediante </w:t>
+      </w:r>
+      <w:r>
+        <w:rPr>
+          <w:rFonts w:ascii="Times New Roman" w:eastAsia="Times New Roman" w:hAnsi="Times New Roman" w:cs="Times New Roman"/>
+          <w:color w:val="000000" w:themeColor="text1"/>
+        </w:rPr>
+        <w:t xml:space="preserve">el formato </w:t>
+      </w:r>
+      <w:r>
+        <w:rPr>
+          <w:rFonts w:ascii="Times New Roman" w:eastAsia="Times New Roman" w:hAnsi="Times New Roman" w:cs="Times New Roman"/>
+          <w:color w:val="000000" w:themeColor="text1"/>
+        </w:rPr>
+        <w:t>docstrings</w:t>
+      </w:r>
+      <w:r>
+        <w:rPr>
+          <w:rFonts w:ascii="Times New Roman" w:eastAsia="Times New Roman" w:hAnsi="Times New Roman" w:cs="Times New Roman"/>
+          <w:color w:val="000000" w:themeColor="text1"/>
+        </w:rPr>
+        <w:t xml:space="preserve"> de Python</w:t>
+      </w:r>
+      <w:r>
+        <w:rPr>
+          <w:rFonts w:ascii="Times New Roman" w:eastAsia="Times New Roman" w:hAnsi="Times New Roman" w:cs="Times New Roman"/>
+          <w:color w:val="000000" w:themeColor="text1"/>
+        </w:rPr>
+        <w:t xml:space="preserve"> en todas las funciones</w:t>
+      </w:r>
+      <w:r>
+        <w:rPr>
+          <w:rFonts w:ascii="Times New Roman" w:eastAsia="Times New Roman" w:hAnsi="Times New Roman" w:cs="Times New Roman"/>
+          <w:color w:val="000000" w:themeColor="text1"/>
+        </w:rPr>
+        <w:t xml:space="preserve">, describiendo de manera clara </w:t>
+      </w:r>
+      <w:r>
+        <w:rPr>
+          <w:rFonts w:ascii="Times New Roman" w:eastAsia="Times New Roman" w:hAnsi="Times New Roman" w:cs="Times New Roman"/>
+          <w:color w:val="000000" w:themeColor="text1"/>
+        </w:rPr>
+        <w:t>propósito, parámetros de entrada, valores de retorno y cualquier comportamiento relevante;</w:t>
+      </w:r>
+    </w:p>
+    <w:p>
+      <w:pPr>
+        <w:spacing w:after="0" w:line="480" w:lineRule="auto"/>
+        <w:rPr>
+          <w:rFonts w:ascii="Times New Roman" w:eastAsia="Times New Roman" w:hAnsi="Times New Roman" w:cs="Times New Roman"/>
+          <w:color w:val="000000" w:themeColor="text1"/>
+        </w:rPr>
+      </w:pPr>
+      <w:r>
+        <w:rPr>
+          <w:rFonts w:ascii="Times New Roman" w:eastAsia="Times New Roman" w:hAnsi="Times New Roman" w:cs="Times New Roman"/>
+          <w:color w:val="000000" w:themeColor="text1"/>
+        </w:rPr>
+        <w:t>esta documentación es obligatoria y forma parte de la evaluación.</w:t>
+      </w:r>
+    </w:p>
+    <w:p>
+      <w:pPr>
+        <w:pStyle w:val="Subtitle"/>
+        <w:spacing w:after="0" w:line="480" w:lineRule="auto"/>
+        <w:rPr>
+          <w:rFonts w:ascii="Times New Roman" w:eastAsia="Times New Roman" w:hAnsi="Times New Roman" w:cs="Times New Roman"/>
+          <w:color w:val="000000" w:themeColor="text1"/>
+          <w:sz w:val="24"/>
+          <w:szCs w:val="24"/>
+        </w:rPr>
+      </w:pPr>
+      <w:r>
+        <w:rPr>
+          <w:rFonts w:ascii="Times New Roman" w:eastAsia="Times New Roman" w:hAnsi="Times New Roman" w:cs="Times New Roman"/>
+          <w:b/>
+          <w:bCs/>
+          <w:i/>
+          <w:iCs/>
+          <w:color w:val="000000" w:themeColor="text1"/>
+          <w:sz w:val="24"/>
+          <w:szCs w:val="24"/>
+        </w:rPr>
+        <w:t>Notación</w:t>
+      </w:r>
+    </w:p>
+    <w:p>
+      <w:pPr>
+        <w:spacing w:after="0" w:line="480" w:lineRule="auto"/>
+        <w:ind w:firstLine="720"/>
+        <w:jc w:val="both"/>
+        <w:rPr>
+          <w:rFonts w:ascii="Times New Roman" w:hAnsi="Times New Roman" w:cs="Times New Roman"/>
+          <w:color w:val="000000" w:themeColor="text1"/>
+        </w:rPr>
+      </w:pPr>
+      <w:r>
+        <w:rPr>
+          <w:rFonts w:ascii="Times New Roman" w:eastAsia="Times New Roman" w:hAnsi="Times New Roman" w:cs="Times New Roman"/>
+          <w:color w:val="000000" w:themeColor="text1"/>
+        </w:rPr>
+        <w:t>Uso de notación snake_case para variables y funciones.</w:t>
+      </w:r>
+    </w:p>
+    <w:p>
+      <w:pPr>
+        <w:pStyle w:val="Subtitle"/>
+        <w:spacing w:after="0" w:line="480" w:lineRule="auto"/>
+        <w:rPr>
+          <w:rFonts w:ascii="Times New Roman" w:eastAsia="Times New Roman" w:hAnsi="Times New Roman" w:cs="Times New Roman"/>
+          <w:b/>
+          <w:bCs/>
+          <w:i/>
+          <w:iCs/>
+          <w:color w:val="000000" w:themeColor="text1"/>
+          <w:sz w:val="24"/>
+          <w:szCs w:val="24"/>
+        </w:rPr>
+      </w:pPr>
+      <w:r>
+        <w:rPr>
+          <w:rFonts w:ascii="Times New Roman" w:eastAsia="Times New Roman" w:hAnsi="Times New Roman" w:cs="Times New Roman"/>
+          <w:b/>
+          <w:bCs/>
+          <w:i/>
+          <w:iCs/>
+          <w:color w:val="000000" w:themeColor="text1"/>
+          <w:sz w:val="24"/>
+          <w:szCs w:val="24"/>
+        </w:rPr>
+        <w:t>Control de versiones</w:t>
+      </w:r>
+    </w:p>
+    <w:p>
+      <w:pPr>
+        <w:spacing w:after="0" w:line="480" w:lineRule="auto"/>
+        <w:ind w:firstLine="720"/>
+        <w:jc w:val="both"/>
+        <w:rPr>
+          <w:rFonts w:ascii="Times New Roman" w:hAnsi="Times New Roman" w:cs="Times New Roman"/>
+          <w:color w:val="000000" w:themeColor="text1"/>
+        </w:rPr>
+      </w:pPr>
+      <w:r>
+        <w:rPr>
+          <w:rFonts w:ascii="Times New Roman" w:eastAsia="Times New Roman" w:hAnsi="Times New Roman" w:cs="Times New Roman"/>
+          <w:color w:val="000000" w:themeColor="text1"/>
+        </w:rPr>
+        <w:t xml:space="preserve"> </w:t>
+      </w:r>
+      <w:r>
+        <w:rPr>
+          <w:rFonts w:ascii="Times New Roman" w:eastAsia="Times New Roman" w:hAnsi="Times New Roman" w:cs="Times New Roman"/>
+          <w:color w:val="000000" w:themeColor="text1"/>
+        </w:rPr>
+        <w:t xml:space="preserve">Uso de </w:t>
+      </w:r>
+      <w:r>
+        <w:rPr>
+          <w:rFonts w:ascii="Times New Roman" w:eastAsia="Times New Roman" w:hAnsi="Times New Roman" w:cs="Times New Roman"/>
+          <w:color w:val="000000" w:themeColor="text1"/>
+        </w:rPr>
+        <w:t xml:space="preserve"> Git y commits descriptivos frecuentes.</w:t>
+      </w:r>
+    </w:p>
+    <w:p>
+      <w:pPr>
+        <w:pStyle w:val="Heading2"/>
+        <w:spacing w:before="0" w:after="0" w:line="480" w:lineRule="auto"/>
+        <w:rPr>
+          <w:rFonts w:ascii="Times New Roman" w:eastAsia="Times New Roman" w:hAnsi="Times New Roman" w:cs="Times New Roman"/>
+          <w:b/>
+          <w:bCs/>
+          <w:color w:val="000000" w:themeColor="text1"/>
+          <w:sz w:val="24"/>
+          <w:szCs w:val="24"/>
+        </w:rPr>
+      </w:pPr>
+      <w:bookmarkStart w:id="4" w:name="_Toc227886404"/>
+      <w:r>
+        <w:rPr>
+          <w:rFonts w:ascii="Times New Roman" w:eastAsia="Times New Roman" w:hAnsi="Times New Roman" w:cs="Times New Roman"/>
+          <w:b/>
+          <w:bCs/>
+          <w:color w:val="000000" w:themeColor="text1"/>
+          <w:sz w:val="24"/>
+          <w:szCs w:val="24"/>
+        </w:rPr>
+        <w:t>Restricciones</w:t>
+      </w:r>
+      <w:bookmarkEnd w:id="4"/>
+    </w:p>
+    <w:p>
+      <w:pPr>
+        <w:spacing w:after="0" w:line="480" w:lineRule="auto"/>
+        <w:ind w:firstLine="720"/>
+        <w:jc w:val="both"/>
+        <w:rPr>
+          <w:rFonts w:ascii="Times New Roman" w:eastAsia="Times New Roman" w:hAnsi="Times New Roman" w:cs="Times New Roman"/>
+          <w:color w:val="000000" w:themeColor="text1"/>
+        </w:rPr>
+      </w:pPr>
+      <w:r>
+        <w:rPr>
+          <w:rFonts w:ascii="Times New Roman" w:eastAsia="Times New Roman" w:hAnsi="Times New Roman" w:cs="Times New Roman"/>
+          <w:color w:val="000000" w:themeColor="text1"/>
+        </w:rPr>
+        <w:t>Las restricciones para la aplicación Devspaces, son</w:t>
+      </w:r>
+      <w:r>
+        <w:rPr>
+          <w:rFonts w:ascii="Times New Roman" w:eastAsia="Times New Roman" w:hAnsi="Times New Roman" w:cs="Times New Roman"/>
+          <w:color w:val="000000" w:themeColor="text1"/>
+        </w:rPr>
+        <w:t xml:space="preserve"> e</w:t>
+      </w:r>
+      <w:r>
+        <w:rPr>
+          <w:rFonts w:ascii="Times New Roman" w:eastAsia="Times New Roman" w:hAnsi="Times New Roman" w:cs="Times New Roman"/>
+          <w:color w:val="000000" w:themeColor="text1"/>
+        </w:rPr>
+        <w:t xml:space="preserve">l sistema no puede modificar el módulo devspace.py </w:t>
+      </w:r>
+      <w:r>
+        <w:rPr>
+          <w:rFonts w:ascii="Times New Roman" w:eastAsia="Times New Roman" w:hAnsi="Times New Roman" w:cs="Times New Roman"/>
+          <w:color w:val="000000" w:themeColor="text1"/>
+        </w:rPr>
+        <w:t xml:space="preserve"> ni</w:t>
+      </w:r>
+      <w:r>
+        <w:rPr>
+          <w:rFonts w:ascii="Times New Roman" w:eastAsia="Times New Roman" w:hAnsi="Times New Roman" w:cs="Times New Roman"/>
+          <w:color w:val="000000" w:themeColor="text1"/>
+        </w:rPr>
+        <w:t xml:space="preserve"> realizar llamadas directas a endpoints externos. Toda comunicación con </w:t>
+      </w:r>
+      <w:r>
+        <w:rPr>
+          <w:rFonts w:ascii="Times New Roman" w:eastAsia="Times New Roman" w:hAnsi="Times New Roman" w:cs="Times New Roman"/>
+          <w:color w:val="000000" w:themeColor="text1"/>
+        </w:rPr>
+        <w:lastRenderedPageBreak/>
+        <w:t>el backend debe hacerse exclusivamente a través de las funciones definidas en dicho módulo. La aplicación opera exclusivamente en terminal, sin interfaz gráfica.</w:t>
+      </w:r>
+    </w:p>
+    <w:p>
+      <w:pPr>
+        <w:pStyle w:val="Heading1"/>
+        <w:spacing w:before="0" w:after="0" w:line="480" w:lineRule="auto"/>
         <w:jc w:val="center"/>
         <w:rPr>
           <w:rFonts w:ascii="Times New Roman" w:hAnsi="Times New Roman" w:cs="Times New Roman"/>
-          <w:lang w:val="es-ES"/>
-        </w:rPr>
-      </w:pPr>
-    </w:p>
-    <w:p>
-      <w:pPr>
-        <w:spacing w:after="0" w:line="480" w:lineRule="auto"/>
+          <w:color w:val="000000" w:themeColor="text1"/>
+          <w:sz w:val="24"/>
+          <w:szCs w:val="24"/>
+          <w:lang w:val="es-ES"/>
+        </w:rPr>
+      </w:pPr>
+      <w:bookmarkStart w:id="5" w:name="_Toc227886405"/>
+      <w:r>
+        <w:rPr>
+          <w:rFonts w:ascii="Times New Roman" w:hAnsi="Times New Roman" w:cs="Times New Roman"/>
+          <w:color w:val="000000" w:themeColor="text1"/>
+          <w:sz w:val="24"/>
+          <w:szCs w:val="24"/>
+          <w:lang w:val="es-ES"/>
+        </w:rPr>
+        <w:t>Solución del Problema</w:t>
+      </w:r>
+      <w:bookmarkEnd w:id="5"/>
+    </w:p>
+    <w:p>
+      <w:pPr>
+        <w:spacing w:after="0" w:line="480" w:lineRule="auto"/>
+        <w:ind w:firstLine="720"/>
+        <w:jc w:val="both"/>
+        <w:rPr>
+          <w:rFonts w:ascii="Times New Roman" w:eastAsia="Times New Roman" w:hAnsi="Times New Roman" w:cs="Times New Roman"/>
+          <w:color w:val="000000" w:themeColor="text1"/>
+        </w:rPr>
+      </w:pPr>
+      <w:r>
+        <w:rPr>
+          <w:rFonts w:ascii="Times New Roman" w:eastAsia="Times New Roman" w:hAnsi="Times New Roman" w:cs="Times New Roman"/>
+          <w:color w:val="000000" w:themeColor="text1"/>
+        </w:rPr>
+        <w:t>Para llevar a cabo la solución del proyecto, primero se elaboro todo el codigo de manera funcional en el archivo main.py</w:t>
+      </w:r>
+      <w:r>
+        <w:rPr>
+          <w:rFonts w:ascii="Times New Roman" w:eastAsia="Times New Roman" w:hAnsi="Times New Roman" w:cs="Times New Roman"/>
+          <w:color w:val="000000" w:themeColor="text1"/>
+        </w:rPr>
+        <w:t xml:space="preserve">. </w:t>
+      </w:r>
+      <w:r>
+        <w:rPr>
+          <w:rFonts w:ascii="Times New Roman" w:eastAsia="Times New Roman" w:hAnsi="Times New Roman" w:cs="Times New Roman"/>
+          <w:color w:val="000000" w:themeColor="text1"/>
+        </w:rPr>
+        <w:t>Al iniciar el programa, se presenta el menú principal donde el usuario puede ingresar al sistema o salir. Una vez autenticado mediante la función de login del módulo devspace.py, el usuario accede al menú interno con ocho opciones funcionales. Cada opción invoca funciones</w:t>
+      </w:r>
+      <w:r>
+        <w:rPr>
+          <w:rFonts w:ascii="Times New Roman" w:eastAsia="Times New Roman" w:hAnsi="Times New Roman" w:cs="Times New Roman"/>
+          <w:color w:val="000000" w:themeColor="text1"/>
+        </w:rPr>
+        <w:t>. D</w:t>
+      </w:r>
+      <w:r>
+        <w:rPr>
+          <w:rFonts w:ascii="Times New Roman" w:eastAsia="Times New Roman" w:hAnsi="Times New Roman" w:cs="Times New Roman"/>
+          <w:color w:val="000000" w:themeColor="text1"/>
+        </w:rPr>
+        <w:t>espues</w:t>
+      </w:r>
+      <w:r>
+        <w:rPr>
+          <w:rFonts w:ascii="Times New Roman" w:eastAsia="Times New Roman" w:hAnsi="Times New Roman" w:cs="Times New Roman"/>
+          <w:color w:val="000000" w:themeColor="text1"/>
+        </w:rPr>
+        <w:t xml:space="preserve"> que todas las funcionalidades funcionaran se</w:t>
+      </w:r>
+      <w:r>
+        <w:rPr>
+          <w:rFonts w:ascii="Times New Roman" w:eastAsia="Times New Roman" w:hAnsi="Times New Roman" w:cs="Times New Roman"/>
+          <w:color w:val="000000" w:themeColor="text1"/>
+        </w:rPr>
+        <w:t xml:space="preserve"> reorganiz</w:t>
+      </w:r>
+      <w:r>
+        <w:rPr>
+          <w:rFonts w:ascii="Times New Roman" w:eastAsia="Times New Roman" w:hAnsi="Times New Roman" w:cs="Times New Roman"/>
+          <w:color w:val="000000" w:themeColor="text1"/>
+        </w:rPr>
+        <w:t>o</w:t>
+      </w:r>
+      <w:r>
+        <w:rPr>
+          <w:rFonts w:ascii="Times New Roman" w:eastAsia="Times New Roman" w:hAnsi="Times New Roman" w:cs="Times New Roman"/>
+          <w:color w:val="000000" w:themeColor="text1"/>
+        </w:rPr>
+        <w:t xml:space="preserve"> el codigo en utils.py, ui.py y controller.py dejando el proyecto con la siguiente estructura:</w:t>
+      </w:r>
+    </w:p>
+    <w:p>
+      <w:pPr>
+        <w:pStyle w:val="ListParagraph"/>
+        <w:numPr>
+          <w:ilvl w:val="0"/>
+          <w:numId w:val="8"/>
+        </w:numPr>
+        <w:spacing w:after="0" w:line="480" w:lineRule="auto"/>
+        <w:jc w:val="both"/>
+        <w:rPr>
+          <w:rFonts w:ascii="Times New Roman" w:eastAsia="Times New Roman" w:hAnsi="Times New Roman" w:cs="Times New Roman"/>
+          <w:color w:val="000000" w:themeColor="text1"/>
+        </w:rPr>
+      </w:pPr>
+      <w:r>
+        <w:rPr>
+          <w:rFonts w:ascii="Times New Roman" w:eastAsia="Times New Roman" w:hAnsi="Times New Roman" w:cs="Times New Roman"/>
+          <w:color w:val="000000" w:themeColor="text1"/>
+        </w:rPr>
+        <w:t xml:space="preserve">main.py: </w:t>
+      </w:r>
+      <w:r>
+        <w:rPr>
+          <w:rFonts w:ascii="Times New Roman" w:eastAsia="Times New Roman" w:hAnsi="Times New Roman" w:cs="Times New Roman"/>
+          <w:color w:val="000000" w:themeColor="text1"/>
+        </w:rPr>
+        <w:t>Punto de entrada. Contiene los menús principal e interno y coordina el flujo del programa.</w:t>
+      </w:r>
+    </w:p>
+    <w:p>
+      <w:pPr>
+        <w:pStyle w:val="ListParagraph"/>
+        <w:numPr>
+          <w:ilvl w:val="0"/>
+          <w:numId w:val="8"/>
+        </w:numPr>
+        <w:spacing w:after="0" w:line="480" w:lineRule="auto"/>
+        <w:jc w:val="both"/>
+        <w:rPr>
+          <w:rFonts w:ascii="Times New Roman" w:eastAsia="Times New Roman" w:hAnsi="Times New Roman" w:cs="Times New Roman"/>
+          <w:color w:val="000000" w:themeColor="text1"/>
+        </w:rPr>
+      </w:pPr>
+      <w:r>
+        <w:rPr>
+          <w:rFonts w:ascii="Times New Roman" w:eastAsia="Times New Roman" w:hAnsi="Times New Roman" w:cs="Times New Roman"/>
+          <w:color w:val="000000" w:themeColor="text1"/>
+        </w:rPr>
+        <w:t xml:space="preserve">ui.py: </w:t>
+      </w:r>
+      <w:r>
+        <w:rPr>
+          <w:rFonts w:ascii="Times New Roman" w:eastAsia="Times New Roman" w:hAnsi="Times New Roman" w:cs="Times New Roman"/>
+          <w:color w:val="000000" w:themeColor="text1"/>
+        </w:rPr>
+        <w:t>Gestiona toda la impresión en pantalla, menús y entrada del usuario.</w:t>
+      </w:r>
+    </w:p>
+    <w:p>
+      <w:pPr>
+        <w:pStyle w:val="ListParagraph"/>
+        <w:numPr>
+          <w:ilvl w:val="0"/>
+          <w:numId w:val="8"/>
+        </w:numPr>
+        <w:spacing w:after="0" w:line="480" w:lineRule="auto"/>
+        <w:jc w:val="both"/>
+        <w:rPr>
+          <w:rFonts w:ascii="Times New Roman" w:eastAsia="Times New Roman" w:hAnsi="Times New Roman" w:cs="Times New Roman"/>
+          <w:color w:val="000000" w:themeColor="text1"/>
+        </w:rPr>
+      </w:pPr>
+      <w:r>
+        <w:rPr>
+          <w:rFonts w:ascii="Times New Roman" w:eastAsia="Times New Roman" w:hAnsi="Times New Roman" w:cs="Times New Roman"/>
+          <w:color w:val="000000" w:themeColor="text1"/>
+        </w:rPr>
+        <w:t xml:space="preserve">controller.py: </w:t>
+      </w:r>
+      <w:r>
+        <w:rPr>
+          <w:rFonts w:ascii="Times New Roman" w:eastAsia="Times New Roman" w:hAnsi="Times New Roman" w:cs="Times New Roman"/>
+          <w:color w:val="000000" w:themeColor="text1"/>
+        </w:rPr>
+        <w:t>Realiza todas las llamadas al módulo devspace.py e interpreta las respuestas.</w:t>
+      </w:r>
+    </w:p>
+    <w:p>
+      <w:pPr>
+        <w:pStyle w:val="ListParagraph"/>
+        <w:numPr>
+          <w:ilvl w:val="0"/>
+          <w:numId w:val="8"/>
+        </w:numPr>
+        <w:spacing w:after="0" w:line="480" w:lineRule="auto"/>
+        <w:jc w:val="both"/>
+        <w:rPr>
+          <w:rFonts w:ascii="Times New Roman" w:eastAsia="Times New Roman" w:hAnsi="Times New Roman" w:cs="Times New Roman"/>
+          <w:color w:val="000000" w:themeColor="text1"/>
+        </w:rPr>
+      </w:pPr>
+      <w:r>
+        <w:rPr>
+          <w:rFonts w:ascii="Times New Roman" w:eastAsia="Times New Roman" w:hAnsi="Times New Roman" w:cs="Times New Roman"/>
+          <w:color w:val="000000" w:themeColor="text1"/>
+        </w:rPr>
+        <w:t xml:space="preserve">Utilis.py: </w:t>
+      </w:r>
+      <w:r>
+        <w:rPr>
+          <w:rFonts w:ascii="Times New Roman" w:eastAsia="Times New Roman" w:hAnsi="Times New Roman" w:cs="Times New Roman"/>
+          <w:color w:val="000000" w:themeColor="text1"/>
+        </w:rPr>
+        <w:t>Contiene animaciones, resaltado de código, limpieza de terminal y pausas.</w:t>
+      </w:r>
+    </w:p>
+    <w:p>
+      <w:pPr>
+        <w:spacing w:after="0" w:line="480" w:lineRule="auto"/>
+        <w:ind w:firstLine="720"/>
+        <w:jc w:val="both"/>
+        <w:rPr>
+          <w:rFonts w:ascii="Times New Roman" w:eastAsia="Times New Roman" w:hAnsi="Times New Roman" w:cs="Times New Roman"/>
+          <w:color w:val="000000" w:themeColor="text1"/>
+        </w:rPr>
+      </w:pPr>
+      <w:r>
+        <w:rPr>
+          <w:rFonts w:ascii="Times New Roman" w:eastAsia="Times New Roman" w:hAnsi="Times New Roman" w:cs="Times New Roman"/>
+          <w:color w:val="000000" w:themeColor="text1"/>
+        </w:rPr>
+        <w:t>Despues de reorganizar el codigo volvio a surgir varios errores en el codigo que se abordaron uno por uno hasta que el codigo reorganizado en los 4 archivos fuera funcional</w:t>
+      </w:r>
+      <w:r>
+        <w:rPr>
+          <w:rFonts w:ascii="Times New Roman" w:eastAsia="Times New Roman" w:hAnsi="Times New Roman" w:cs="Times New Roman"/>
+          <w:color w:val="000000" w:themeColor="text1"/>
+        </w:rPr>
+        <w:t>, en su mayoria llamadas a funciones no existentes, returnos invalidos, manejo de las respuestas de devspaces.py mal ejecutadas.</w:t>
+      </w:r>
+    </w:p>
+    <w:p>
+      <w:pPr>
+        <w:spacing w:after="0" w:line="480" w:lineRule="auto"/>
+        <w:ind w:firstLine="720"/>
+        <w:jc w:val="both"/>
+        <w:rPr>
+          <w:rFonts w:ascii="Times New Roman" w:eastAsia="Times New Roman" w:hAnsi="Times New Roman" w:cs="Times New Roman"/>
+          <w:color w:val="000000" w:themeColor="text1"/>
+        </w:rPr>
+      </w:pPr>
+      <w:r>
+        <w:rPr>
+          <w:rFonts w:ascii="Times New Roman" w:eastAsia="Times New Roman" w:hAnsi="Times New Roman" w:cs="Times New Roman"/>
+          <w:color w:val="000000" w:themeColor="text1"/>
+        </w:rPr>
+        <w:t xml:space="preserve">Se utilisiron 4 librerias para llevar a cabo de la mejor manera posible el sistema, os para limpiar la terminal, sys para tener acceso a devspaces.py, time para los tiempo de espera y re para </w:t>
+      </w:r>
+      <w:r>
+        <w:rPr>
+          <w:rFonts w:ascii="Times New Roman" w:eastAsia="Times New Roman" w:hAnsi="Times New Roman" w:cs="Times New Roman"/>
+          <w:color w:val="000000" w:themeColor="text1"/>
+        </w:rPr>
+        <w:lastRenderedPageBreak/>
+        <w:t>utilizar la funcion sub para sustituir patrones de caracteres (palabras)por las palbras pintadas en los post tipo sineppet</w:t>
+      </w:r>
+    </w:p>
+    <w:p>
+      <w:pPr>
+        <w:spacing w:after="0" w:line="480" w:lineRule="auto"/>
+        <w:ind w:firstLine="720"/>
+        <w:jc w:val="both"/>
+        <w:rPr>
+          <w:rFonts w:ascii="Times New Roman" w:eastAsia="Times New Roman" w:hAnsi="Times New Roman" w:cs="Times New Roman"/>
+          <w:color w:val="000000" w:themeColor="text1"/>
+        </w:rPr>
+      </w:pPr>
+      <w:r>
+        <w:rPr>
+          <w:rFonts w:ascii="Times New Roman" w:eastAsia="Times New Roman" w:hAnsi="Times New Roman" w:cs="Times New Roman"/>
+          <w:color w:val="000000" w:themeColor="text1"/>
+        </w:rPr>
+        <w:t xml:space="preserve">La visualización de posts implementa dos comportamientos diferenciados. Para </w:t>
+      </w:r>
+      <w:r>
+        <w:rPr>
+          <w:rFonts w:ascii="Times New Roman" w:eastAsia="Times New Roman" w:hAnsi="Times New Roman" w:cs="Times New Roman"/>
+          <w:color w:val="000000" w:themeColor="text1"/>
+        </w:rPr>
+        <w:t>post</w:t>
+      </w:r>
+      <w:r>
+        <w:rPr>
+          <w:rFonts w:ascii="Times New Roman" w:eastAsia="Times New Roman" w:hAnsi="Times New Roman" w:cs="Times New Roman"/>
+          <w:color w:val="000000" w:themeColor="text1"/>
+        </w:rPr>
+        <w:t xml:space="preserve"> de tipo </w:t>
+      </w:r>
+      <w:r>
+        <w:rPr>
+          <w:rFonts w:ascii="Times New Roman" w:eastAsia="Times New Roman" w:hAnsi="Times New Roman" w:cs="Times New Roman"/>
+          <w:color w:val="000000" w:themeColor="text1"/>
+        </w:rPr>
+        <w:t>text</w:t>
+      </w:r>
+      <w:r>
+        <w:rPr>
+          <w:rFonts w:ascii="Times New Roman" w:eastAsia="Times New Roman" w:hAnsi="Times New Roman" w:cs="Times New Roman"/>
+          <w:color w:val="000000" w:themeColor="text1"/>
+        </w:rPr>
+        <w:t xml:space="preserve">, el sistema muestra el contenido carácter por carácter con una pausa de 0.05 segundos entre cada uno, simulando una animación de escritura en tiempo real. Para </w:t>
+      </w:r>
+      <w:r>
+        <w:rPr>
+          <w:rFonts w:ascii="Times New Roman" w:eastAsia="Times New Roman" w:hAnsi="Times New Roman" w:cs="Times New Roman"/>
+          <w:color w:val="000000" w:themeColor="text1"/>
+        </w:rPr>
+        <w:t>post</w:t>
+      </w:r>
+      <w:r>
+        <w:rPr>
+          <w:rFonts w:ascii="Times New Roman" w:eastAsia="Times New Roman" w:hAnsi="Times New Roman" w:cs="Times New Roman"/>
+          <w:color w:val="000000" w:themeColor="text1"/>
+        </w:rPr>
+        <w:t xml:space="preserve"> de tipo snippet, el sistema aplica resaltado de sintaxis Python utilizando códigos ANSI de color, diferenciando palabras </w:t>
+      </w:r>
+      <w:r>
+        <w:rPr>
+          <w:rFonts w:ascii="Times New Roman" w:eastAsia="Times New Roman" w:hAnsi="Times New Roman" w:cs="Times New Roman"/>
+          <w:color w:val="000000" w:themeColor="text1"/>
+        </w:rPr>
+        <w:t>en diferentes grupos rojas, azules y amarillas.</w:t>
+      </w:r>
+    </w:p>
+    <w:p>
+      <w:pPr>
+        <w:pStyle w:val="Heading1"/>
+        <w:spacing w:before="0" w:after="0" w:line="480" w:lineRule="auto"/>
         <w:jc w:val="center"/>
         <w:rPr>
           <w:rFonts w:ascii="Times New Roman" w:hAnsi="Times New Roman" w:cs="Times New Roman"/>
-          <w:lang w:val="es-ES"/>
-        </w:rPr>
-      </w:pPr>
-      <w:r>
-        <w:rPr>
-          <w:rFonts w:ascii="Times New Roman" w:hAnsi="Times New Roman" w:cs="Times New Roman"/>
-          <w:lang w:val="es-ES"/>
-        </w:rPr>
-        <w:t>Sede San Carlos</w:t>
-      </w:r>
-    </w:p>
-    <w:p>
-      <w:pPr>
-        <w:spacing w:after="0" w:line="480" w:lineRule="auto"/>
+          <w:color w:val="000000" w:themeColor="text1"/>
+          <w:sz w:val="24"/>
+          <w:szCs w:val="24"/>
+          <w:lang w:val="es-ES"/>
+        </w:rPr>
+      </w:pPr>
+      <w:bookmarkStart w:id="6" w:name="_Toc227886406"/>
+      <w:r>
+        <w:rPr>
+          <w:rFonts w:ascii="Times New Roman" w:hAnsi="Times New Roman" w:cs="Times New Roman"/>
+          <w:color w:val="000000" w:themeColor="text1"/>
+          <w:sz w:val="24"/>
+          <w:szCs w:val="24"/>
+          <w:lang w:val="es-ES"/>
+        </w:rPr>
+        <w:t>Análisis de Resultados</w:t>
+      </w:r>
+      <w:bookmarkEnd w:id="6"/>
+    </w:p>
+    <w:p>
+      <w:pPr>
+        <w:spacing w:after="0" w:line="480" w:lineRule="auto"/>
+        <w:ind w:firstLine="720"/>
+        <w:jc w:val="both"/>
+        <w:rPr>
+          <w:rFonts w:ascii="Times New Roman" w:hAnsi="Times New Roman" w:cs="Times New Roman"/>
+          <w:color w:val="000000" w:themeColor="text1"/>
+        </w:rPr>
+      </w:pPr>
+      <w:r>
+        <w:rPr>
+          <w:rFonts w:ascii="Times New Roman" w:eastAsia="Times New Roman" w:hAnsi="Times New Roman" w:cs="Times New Roman"/>
+          <w:color w:val="000000" w:themeColor="text1"/>
+        </w:rPr>
+        <w:t>A continuación se presenta el estado final de cada requerimiento evaluado en el proyecto:</w:t>
+      </w:r>
+    </w:p>
+    <w:tbl>
+      <w:tblPr>
+        <w:tblStyle w:val="TableGrid"/>
+        <w:tblpPr w:leftFromText="180" w:rightFromText="180" w:vertAnchor="text" w:tblpY="-6"/>
+        <w:tblW w:w="9360" w:type="dxa"/>
+        <w:tblLook w:val="0000" w:firstRow="0" w:lastRow="0" w:firstColumn="0" w:lastColumn="0" w:noHBand="0" w:noVBand="0"/>
+      </w:tblPr>
+      <w:tblGrid>
+        <w:gridCol w:w="5200"/>
+        <w:gridCol w:w="1880"/>
+        <w:gridCol w:w="2280"/>
+      </w:tblGrid>
+      <w:tr>
+        <w:tc>
+          <w:tcPr>
+            <w:tcW w:w="5200" w:type="dxa"/>
+          </w:tcPr>
+          <w:p>
+            <w:pPr>
+              <w:spacing w:line="480" w:lineRule="auto"/>
+              <w:rPr>
+                <w:rFonts w:ascii="Times New Roman" w:hAnsi="Times New Roman" w:cs="Times New Roman"/>
+                <w:color w:val="000000" w:themeColor="text1"/>
+              </w:rPr>
+            </w:pPr>
+            <w:r>
+              <w:rPr>
+                <w:rFonts w:ascii="Times New Roman" w:eastAsia="Times New Roman" w:hAnsi="Times New Roman" w:cs="Times New Roman"/>
+                <w:b/>
+                <w:bCs/>
+                <w:color w:val="000000" w:themeColor="text1"/>
+              </w:rPr>
+              <w:t>Requerimiento</w:t>
+            </w:r>
+          </w:p>
+        </w:tc>
+        <w:tc>
+          <w:tcPr>
+            <w:tcW w:w="1880" w:type="dxa"/>
+          </w:tcPr>
+          <w:p>
+            <w:pPr>
+              <w:spacing w:line="480" w:lineRule="auto"/>
+              <w:rPr>
+                <w:rFonts w:ascii="Times New Roman" w:hAnsi="Times New Roman" w:cs="Times New Roman"/>
+                <w:color w:val="000000" w:themeColor="text1"/>
+              </w:rPr>
+            </w:pPr>
+            <w:r>
+              <w:rPr>
+                <w:rFonts w:ascii="Times New Roman" w:eastAsia="Times New Roman" w:hAnsi="Times New Roman" w:cs="Times New Roman"/>
+                <w:b/>
+                <w:bCs/>
+                <w:color w:val="000000" w:themeColor="text1"/>
+              </w:rPr>
+              <w:t>Estado</w:t>
+            </w:r>
+          </w:p>
+        </w:tc>
+        <w:tc>
+          <w:tcPr>
+            <w:tcW w:w="2280" w:type="dxa"/>
+          </w:tcPr>
+          <w:p>
+            <w:pPr>
+              <w:spacing w:line="480" w:lineRule="auto"/>
+              <w:rPr>
+                <w:rFonts w:ascii="Times New Roman" w:hAnsi="Times New Roman" w:cs="Times New Roman"/>
+                <w:color w:val="000000" w:themeColor="text1"/>
+              </w:rPr>
+            </w:pPr>
+            <w:r>
+              <w:rPr>
+                <w:rFonts w:ascii="Times New Roman" w:eastAsia="Times New Roman" w:hAnsi="Times New Roman" w:cs="Times New Roman"/>
+                <w:b/>
+                <w:bCs/>
+                <w:color w:val="000000" w:themeColor="text1"/>
+              </w:rPr>
+              <w:t>Observaciones</w:t>
+            </w:r>
+          </w:p>
+        </w:tc>
+      </w:tr>
+      <w:tr>
+        <w:tc>
+          <w:tcPr>
+            <w:tcW w:w="5200" w:type="dxa"/>
+          </w:tcPr>
+          <w:p>
+            <w:pPr>
+              <w:spacing w:line="480" w:lineRule="auto"/>
+              <w:rPr>
+                <w:rFonts w:ascii="Times New Roman" w:hAnsi="Times New Roman" w:cs="Times New Roman"/>
+                <w:color w:val="000000" w:themeColor="text1"/>
+              </w:rPr>
+            </w:pPr>
+            <w:r>
+              <w:rPr>
+                <w:rFonts w:ascii="Times New Roman" w:eastAsia="Times New Roman" w:hAnsi="Times New Roman" w:cs="Times New Roman"/>
+                <w:color w:val="000000" w:themeColor="text1"/>
+              </w:rPr>
+              <w:t>Autenticación y manejo de sesión</w:t>
+            </w:r>
+          </w:p>
+        </w:tc>
+        <w:tc>
+          <w:tcPr>
+            <w:tcW w:w="1880" w:type="dxa"/>
+          </w:tcPr>
+          <w:p>
+            <w:pPr>
+              <w:spacing w:line="480" w:lineRule="auto"/>
+              <w:rPr>
+                <w:rFonts w:ascii="Times New Roman" w:hAnsi="Times New Roman" w:cs="Times New Roman"/>
+                <w:color w:val="000000" w:themeColor="text1"/>
+              </w:rPr>
+            </w:pPr>
+            <w:r>
+              <w:rPr>
+                <w:rFonts w:ascii="Times New Roman" w:eastAsia="Times New Roman" w:hAnsi="Times New Roman" w:cs="Times New Roman"/>
+                <w:color w:val="000000" w:themeColor="text1"/>
+              </w:rPr>
+              <w:t>Completo</w:t>
+            </w:r>
+          </w:p>
+        </w:tc>
+        <w:tc>
+          <w:tcPr>
+            <w:tcW w:w="2280" w:type="dxa"/>
+          </w:tcPr>
+          <w:p>
+            <w:pPr>
+              <w:spacing w:line="480" w:lineRule="auto"/>
+              <w:rPr>
+                <w:rFonts w:ascii="Times New Roman" w:hAnsi="Times New Roman" w:cs="Times New Roman"/>
+                <w:color w:val="000000" w:themeColor="text1"/>
+              </w:rPr>
+            </w:pPr>
+          </w:p>
+        </w:tc>
+      </w:tr>
+      <w:tr>
+        <w:tc>
+          <w:tcPr>
+            <w:tcW w:w="5200" w:type="dxa"/>
+          </w:tcPr>
+          <w:p>
+            <w:pPr>
+              <w:spacing w:line="480" w:lineRule="auto"/>
+              <w:rPr>
+                <w:rFonts w:ascii="Times New Roman" w:hAnsi="Times New Roman" w:cs="Times New Roman"/>
+                <w:color w:val="000000" w:themeColor="text1"/>
+              </w:rPr>
+            </w:pPr>
+            <w:r>
+              <w:rPr>
+                <w:rFonts w:ascii="Times New Roman" w:eastAsia="Times New Roman" w:hAnsi="Times New Roman" w:cs="Times New Roman"/>
+                <w:color w:val="000000" w:themeColor="text1"/>
+              </w:rPr>
+              <w:t>Consulta de usuarios</w:t>
+            </w:r>
+          </w:p>
+        </w:tc>
+        <w:tc>
+          <w:tcPr>
+            <w:tcW w:w="1880" w:type="dxa"/>
+          </w:tcPr>
+          <w:p>
+            <w:pPr>
+              <w:spacing w:line="480" w:lineRule="auto"/>
+              <w:rPr>
+                <w:rFonts w:ascii="Times New Roman" w:hAnsi="Times New Roman" w:cs="Times New Roman"/>
+                <w:color w:val="000000" w:themeColor="text1"/>
+              </w:rPr>
+            </w:pPr>
+            <w:r>
+              <w:rPr>
+                <w:rFonts w:ascii="Times New Roman" w:eastAsia="Times New Roman" w:hAnsi="Times New Roman" w:cs="Times New Roman"/>
+                <w:color w:val="000000" w:themeColor="text1"/>
+              </w:rPr>
+              <w:t>Completo</w:t>
+            </w:r>
+          </w:p>
+        </w:tc>
+        <w:tc>
+          <w:tcPr>
+            <w:tcW w:w="2280" w:type="dxa"/>
+          </w:tcPr>
+          <w:p>
+            <w:pPr>
+              <w:spacing w:line="480" w:lineRule="auto"/>
+              <w:rPr>
+                <w:rFonts w:ascii="Times New Roman" w:hAnsi="Times New Roman" w:cs="Times New Roman"/>
+                <w:color w:val="000000" w:themeColor="text1"/>
+              </w:rPr>
+            </w:pPr>
+          </w:p>
+        </w:tc>
+      </w:tr>
+      <w:tr>
+        <w:tc>
+          <w:tcPr>
+            <w:tcW w:w="5200" w:type="dxa"/>
+          </w:tcPr>
+          <w:p>
+            <w:pPr>
+              <w:spacing w:line="480" w:lineRule="auto"/>
+              <w:rPr>
+                <w:rFonts w:ascii="Times New Roman" w:hAnsi="Times New Roman" w:cs="Times New Roman"/>
+                <w:color w:val="000000" w:themeColor="text1"/>
+              </w:rPr>
+            </w:pPr>
+            <w:r>
+              <w:rPr>
+                <w:rFonts w:ascii="Times New Roman" w:eastAsia="Times New Roman" w:hAnsi="Times New Roman" w:cs="Times New Roman"/>
+                <w:color w:val="000000" w:themeColor="text1"/>
+              </w:rPr>
+              <w:t>Consulta de spaces</w:t>
+            </w:r>
+          </w:p>
+        </w:tc>
+        <w:tc>
+          <w:tcPr>
+            <w:tcW w:w="1880" w:type="dxa"/>
+          </w:tcPr>
+          <w:p>
+            <w:pPr>
+              <w:spacing w:line="480" w:lineRule="auto"/>
+              <w:rPr>
+                <w:rFonts w:ascii="Times New Roman" w:hAnsi="Times New Roman" w:cs="Times New Roman"/>
+                <w:color w:val="000000" w:themeColor="text1"/>
+              </w:rPr>
+            </w:pPr>
+            <w:r>
+              <w:rPr>
+                <w:rFonts w:ascii="Times New Roman" w:eastAsia="Times New Roman" w:hAnsi="Times New Roman" w:cs="Times New Roman"/>
+                <w:color w:val="000000" w:themeColor="text1"/>
+              </w:rPr>
+              <w:t>Completo</w:t>
+            </w:r>
+          </w:p>
+        </w:tc>
+        <w:tc>
+          <w:tcPr>
+            <w:tcW w:w="2280" w:type="dxa"/>
+          </w:tcPr>
+          <w:p>
+            <w:pPr>
+              <w:spacing w:line="480" w:lineRule="auto"/>
+              <w:rPr>
+                <w:rFonts w:ascii="Times New Roman" w:hAnsi="Times New Roman" w:cs="Times New Roman"/>
+                <w:color w:val="000000" w:themeColor="text1"/>
+              </w:rPr>
+            </w:pPr>
+          </w:p>
+        </w:tc>
+      </w:tr>
+      <w:tr>
+        <w:tc>
+          <w:tcPr>
+            <w:tcW w:w="5200" w:type="dxa"/>
+          </w:tcPr>
+          <w:p>
+            <w:pPr>
+              <w:spacing w:line="480" w:lineRule="auto"/>
+              <w:rPr>
+                <w:rFonts w:ascii="Times New Roman" w:hAnsi="Times New Roman" w:cs="Times New Roman"/>
+                <w:color w:val="000000" w:themeColor="text1"/>
+              </w:rPr>
+            </w:pPr>
+            <w:r>
+              <w:rPr>
+                <w:rFonts w:ascii="Times New Roman" w:eastAsia="Times New Roman" w:hAnsi="Times New Roman" w:cs="Times New Roman"/>
+                <w:color w:val="000000" w:themeColor="text1"/>
+              </w:rPr>
+              <w:t>Seguir un space</w:t>
+            </w:r>
+          </w:p>
+        </w:tc>
+        <w:tc>
+          <w:tcPr>
+            <w:tcW w:w="1880" w:type="dxa"/>
+          </w:tcPr>
+          <w:p>
+            <w:pPr>
+              <w:spacing w:line="480" w:lineRule="auto"/>
+              <w:rPr>
+                <w:rFonts w:ascii="Times New Roman" w:hAnsi="Times New Roman" w:cs="Times New Roman"/>
+                <w:color w:val="000000" w:themeColor="text1"/>
+              </w:rPr>
+            </w:pPr>
+            <w:r>
+              <w:rPr>
+                <w:rFonts w:ascii="Times New Roman" w:eastAsia="Times New Roman" w:hAnsi="Times New Roman" w:cs="Times New Roman"/>
+                <w:color w:val="000000" w:themeColor="text1"/>
+              </w:rPr>
+              <w:t>Completo</w:t>
+            </w:r>
+          </w:p>
+        </w:tc>
+        <w:tc>
+          <w:tcPr>
+            <w:tcW w:w="2280" w:type="dxa"/>
+          </w:tcPr>
+          <w:p>
+            <w:pPr>
+              <w:spacing w:line="480" w:lineRule="auto"/>
+              <w:rPr>
+                <w:rFonts w:ascii="Times New Roman" w:hAnsi="Times New Roman" w:cs="Times New Roman"/>
+                <w:color w:val="000000" w:themeColor="text1"/>
+              </w:rPr>
+            </w:pPr>
+          </w:p>
+        </w:tc>
+      </w:tr>
+      <w:tr>
+        <w:tc>
+          <w:tcPr>
+            <w:tcW w:w="5200" w:type="dxa"/>
+          </w:tcPr>
+          <w:p>
+            <w:pPr>
+              <w:spacing w:line="480" w:lineRule="auto"/>
+              <w:rPr>
+                <w:rFonts w:ascii="Times New Roman" w:hAnsi="Times New Roman" w:cs="Times New Roman"/>
+                <w:color w:val="000000" w:themeColor="text1"/>
+              </w:rPr>
+            </w:pPr>
+            <w:r>
+              <w:rPr>
+                <w:rFonts w:ascii="Times New Roman" w:eastAsia="Times New Roman" w:hAnsi="Times New Roman" w:cs="Times New Roman"/>
+                <w:color w:val="000000" w:themeColor="text1"/>
+              </w:rPr>
+              <w:t>Consulta de spaces seguidos</w:t>
+            </w:r>
+          </w:p>
+        </w:tc>
+        <w:tc>
+          <w:tcPr>
+            <w:tcW w:w="1880" w:type="dxa"/>
+          </w:tcPr>
+          <w:p>
+            <w:pPr>
+              <w:spacing w:line="480" w:lineRule="auto"/>
+              <w:rPr>
+                <w:rFonts w:ascii="Times New Roman" w:hAnsi="Times New Roman" w:cs="Times New Roman"/>
+                <w:color w:val="000000" w:themeColor="text1"/>
+              </w:rPr>
+            </w:pPr>
+            <w:r>
+              <w:rPr>
+                <w:rFonts w:ascii="Times New Roman" w:eastAsia="Times New Roman" w:hAnsi="Times New Roman" w:cs="Times New Roman"/>
+                <w:color w:val="000000" w:themeColor="text1"/>
+              </w:rPr>
+              <w:t>Completo</w:t>
+            </w:r>
+          </w:p>
+        </w:tc>
+        <w:tc>
+          <w:tcPr>
+            <w:tcW w:w="2280" w:type="dxa"/>
+          </w:tcPr>
+          <w:p>
+            <w:pPr>
+              <w:spacing w:line="480" w:lineRule="auto"/>
+              <w:rPr>
+                <w:rFonts w:ascii="Times New Roman" w:hAnsi="Times New Roman" w:cs="Times New Roman"/>
+                <w:color w:val="000000" w:themeColor="text1"/>
+              </w:rPr>
+            </w:pPr>
+          </w:p>
+        </w:tc>
+      </w:tr>
+      <w:tr>
+        <w:tc>
+          <w:tcPr>
+            <w:tcW w:w="5200" w:type="dxa"/>
+          </w:tcPr>
+          <w:p>
+            <w:pPr>
+              <w:spacing w:line="480" w:lineRule="auto"/>
+              <w:rPr>
+                <w:rFonts w:ascii="Times New Roman" w:hAnsi="Times New Roman" w:cs="Times New Roman"/>
+                <w:color w:val="000000" w:themeColor="text1"/>
+              </w:rPr>
+            </w:pPr>
+            <w:r>
+              <w:rPr>
+                <w:rFonts w:ascii="Times New Roman" w:eastAsia="Times New Roman" w:hAnsi="Times New Roman" w:cs="Times New Roman"/>
+                <w:color w:val="000000" w:themeColor="text1"/>
+              </w:rPr>
+              <w:t>Consulta de seguidores</w:t>
+            </w:r>
+          </w:p>
+        </w:tc>
+        <w:tc>
+          <w:tcPr>
+            <w:tcW w:w="1880" w:type="dxa"/>
+          </w:tcPr>
+          <w:p>
+            <w:pPr>
+              <w:spacing w:line="480" w:lineRule="auto"/>
+              <w:rPr>
+                <w:rFonts w:ascii="Times New Roman" w:hAnsi="Times New Roman" w:cs="Times New Roman"/>
+                <w:color w:val="000000" w:themeColor="text1"/>
+              </w:rPr>
+            </w:pPr>
+            <w:r>
+              <w:rPr>
+                <w:rFonts w:ascii="Times New Roman" w:eastAsia="Times New Roman" w:hAnsi="Times New Roman" w:cs="Times New Roman"/>
+                <w:color w:val="000000" w:themeColor="text1"/>
+              </w:rPr>
+              <w:t>Completo</w:t>
+            </w:r>
+          </w:p>
+        </w:tc>
+        <w:tc>
+          <w:tcPr>
+            <w:tcW w:w="2280" w:type="dxa"/>
+          </w:tcPr>
+          <w:p>
+            <w:pPr>
+              <w:spacing w:line="480" w:lineRule="auto"/>
+              <w:rPr>
+                <w:rFonts w:ascii="Times New Roman" w:hAnsi="Times New Roman" w:cs="Times New Roman"/>
+                <w:color w:val="000000" w:themeColor="text1"/>
+              </w:rPr>
+            </w:pPr>
+          </w:p>
+        </w:tc>
+      </w:tr>
+      <w:tr>
+        <w:tc>
+          <w:tcPr>
+            <w:tcW w:w="5200" w:type="dxa"/>
+          </w:tcPr>
+          <w:p>
+            <w:pPr>
+              <w:spacing w:line="480" w:lineRule="auto"/>
+              <w:rPr>
+                <w:rFonts w:ascii="Times New Roman" w:hAnsi="Times New Roman" w:cs="Times New Roman"/>
+                <w:color w:val="000000" w:themeColor="text1"/>
+              </w:rPr>
+            </w:pPr>
+            <w:r>
+              <w:rPr>
+                <w:rFonts w:ascii="Times New Roman" w:eastAsia="Times New Roman" w:hAnsi="Times New Roman" w:cs="Times New Roman"/>
+                <w:color w:val="000000" w:themeColor="text1"/>
+              </w:rPr>
+              <w:t>Gestión de seguidores</w:t>
+            </w:r>
+          </w:p>
+        </w:tc>
+        <w:tc>
+          <w:tcPr>
+            <w:tcW w:w="1880" w:type="dxa"/>
+          </w:tcPr>
+          <w:p>
+            <w:pPr>
+              <w:spacing w:line="480" w:lineRule="auto"/>
+              <w:rPr>
+                <w:rFonts w:ascii="Times New Roman" w:hAnsi="Times New Roman" w:cs="Times New Roman"/>
+                <w:color w:val="000000" w:themeColor="text1"/>
+              </w:rPr>
+            </w:pPr>
+            <w:r>
+              <w:rPr>
+                <w:rFonts w:ascii="Times New Roman" w:eastAsia="Times New Roman" w:hAnsi="Times New Roman" w:cs="Times New Roman"/>
+                <w:color w:val="000000" w:themeColor="text1"/>
+              </w:rPr>
+              <w:t>Completo</w:t>
+            </w:r>
+          </w:p>
+        </w:tc>
+        <w:tc>
+          <w:tcPr>
+            <w:tcW w:w="2280" w:type="dxa"/>
+          </w:tcPr>
+          <w:p>
+            <w:pPr>
+              <w:spacing w:line="480" w:lineRule="auto"/>
+              <w:rPr>
+                <w:rFonts w:ascii="Times New Roman" w:hAnsi="Times New Roman" w:cs="Times New Roman"/>
+                <w:color w:val="000000" w:themeColor="text1"/>
+              </w:rPr>
+            </w:pPr>
+          </w:p>
+        </w:tc>
+      </w:tr>
+      <w:tr>
+        <w:tc>
+          <w:tcPr>
+            <w:tcW w:w="5200" w:type="dxa"/>
+          </w:tcPr>
+          <w:p>
+            <w:pPr>
+              <w:spacing w:line="480" w:lineRule="auto"/>
+              <w:rPr>
+                <w:rFonts w:ascii="Times New Roman" w:hAnsi="Times New Roman" w:cs="Times New Roman"/>
+                <w:color w:val="000000" w:themeColor="text1"/>
+              </w:rPr>
+            </w:pPr>
+            <w:r>
+              <w:rPr>
+                <w:rFonts w:ascii="Times New Roman" w:eastAsia="Times New Roman" w:hAnsi="Times New Roman" w:cs="Times New Roman"/>
+                <w:color w:val="000000" w:themeColor="text1"/>
+              </w:rPr>
+              <w:t>Visualización de posts</w:t>
+            </w:r>
+          </w:p>
+        </w:tc>
+        <w:tc>
+          <w:tcPr>
+            <w:tcW w:w="1880" w:type="dxa"/>
+          </w:tcPr>
+          <w:p>
+            <w:pPr>
+              <w:spacing w:line="480" w:lineRule="auto"/>
+              <w:rPr>
+                <w:rFonts w:ascii="Times New Roman" w:hAnsi="Times New Roman" w:cs="Times New Roman"/>
+                <w:color w:val="000000" w:themeColor="text1"/>
+              </w:rPr>
+            </w:pPr>
+            <w:r>
+              <w:rPr>
+                <w:rFonts w:ascii="Times New Roman" w:eastAsia="Times New Roman" w:hAnsi="Times New Roman" w:cs="Times New Roman"/>
+                <w:color w:val="000000" w:themeColor="text1"/>
+              </w:rPr>
+              <w:t>Completo</w:t>
+            </w:r>
+          </w:p>
+        </w:tc>
+        <w:tc>
+          <w:tcPr>
+            <w:tcW w:w="2280" w:type="dxa"/>
+          </w:tcPr>
+          <w:p>
+            <w:pPr>
+              <w:spacing w:line="480" w:lineRule="auto"/>
+              <w:rPr>
+                <w:rFonts w:ascii="Times New Roman" w:hAnsi="Times New Roman" w:cs="Times New Roman"/>
+                <w:color w:val="000000" w:themeColor="text1"/>
+              </w:rPr>
+            </w:pPr>
+          </w:p>
+        </w:tc>
+      </w:tr>
+      <w:tr>
+        <w:tc>
+          <w:tcPr>
+            <w:tcW w:w="5200" w:type="dxa"/>
+          </w:tcPr>
+          <w:p>
+            <w:pPr>
+              <w:spacing w:line="480" w:lineRule="auto"/>
+              <w:rPr>
+                <w:rFonts w:ascii="Times New Roman" w:hAnsi="Times New Roman" w:cs="Times New Roman"/>
+                <w:color w:val="000000" w:themeColor="text1"/>
+              </w:rPr>
+            </w:pPr>
+            <w:r>
+              <w:rPr>
+                <w:rFonts w:ascii="Times New Roman" w:eastAsia="Times New Roman" w:hAnsi="Times New Roman" w:cs="Times New Roman"/>
+                <w:color w:val="000000" w:themeColor="text1"/>
+              </w:rPr>
+              <w:t>Navegación entre posts</w:t>
+            </w:r>
+          </w:p>
+        </w:tc>
+        <w:tc>
+          <w:tcPr>
+            <w:tcW w:w="1880" w:type="dxa"/>
+          </w:tcPr>
+          <w:p>
+            <w:pPr>
+              <w:spacing w:line="480" w:lineRule="auto"/>
+              <w:rPr>
+                <w:rFonts w:ascii="Times New Roman" w:hAnsi="Times New Roman" w:cs="Times New Roman"/>
+                <w:color w:val="000000" w:themeColor="text1"/>
+              </w:rPr>
+            </w:pPr>
+            <w:r>
+              <w:rPr>
+                <w:rFonts w:ascii="Times New Roman" w:eastAsia="Times New Roman" w:hAnsi="Times New Roman" w:cs="Times New Roman"/>
+                <w:color w:val="000000" w:themeColor="text1"/>
+              </w:rPr>
+              <w:t>Completo</w:t>
+            </w:r>
+          </w:p>
+        </w:tc>
+        <w:tc>
+          <w:tcPr>
+            <w:tcW w:w="2280" w:type="dxa"/>
+          </w:tcPr>
+          <w:p>
+            <w:pPr>
+              <w:spacing w:line="480" w:lineRule="auto"/>
+              <w:rPr>
+                <w:rFonts w:ascii="Times New Roman" w:hAnsi="Times New Roman" w:cs="Times New Roman"/>
+                <w:color w:val="000000" w:themeColor="text1"/>
+              </w:rPr>
+            </w:pPr>
+          </w:p>
+        </w:tc>
+      </w:tr>
+      <w:tr>
+        <w:tc>
+          <w:tcPr>
+            <w:tcW w:w="5200" w:type="dxa"/>
+          </w:tcPr>
+          <w:p>
+            <w:pPr>
+              <w:spacing w:line="480" w:lineRule="auto"/>
+              <w:rPr>
+                <w:rFonts w:ascii="Times New Roman" w:hAnsi="Times New Roman" w:cs="Times New Roman"/>
+                <w:color w:val="000000" w:themeColor="text1"/>
+              </w:rPr>
+            </w:pPr>
+            <w:r>
+              <w:rPr>
+                <w:rFonts w:ascii="Times New Roman" w:eastAsia="Times New Roman" w:hAnsi="Times New Roman" w:cs="Times New Roman"/>
+                <w:color w:val="000000" w:themeColor="text1"/>
+              </w:rPr>
+              <w:t>Documentación interna</w:t>
+            </w:r>
+          </w:p>
+        </w:tc>
+        <w:tc>
+          <w:tcPr>
+            <w:tcW w:w="1880" w:type="dxa"/>
+          </w:tcPr>
+          <w:p>
+            <w:pPr>
+              <w:spacing w:line="480" w:lineRule="auto"/>
+              <w:rPr>
+                <w:rFonts w:ascii="Times New Roman" w:hAnsi="Times New Roman" w:cs="Times New Roman"/>
+                <w:color w:val="000000" w:themeColor="text1"/>
+              </w:rPr>
+            </w:pPr>
+            <w:r>
+              <w:rPr>
+                <w:rFonts w:ascii="Times New Roman" w:eastAsia="Times New Roman" w:hAnsi="Times New Roman" w:cs="Times New Roman"/>
+                <w:color w:val="000000" w:themeColor="text1"/>
+              </w:rPr>
+              <w:t>Completo</w:t>
+            </w:r>
+          </w:p>
+        </w:tc>
+        <w:tc>
+          <w:tcPr>
+            <w:tcW w:w="2280" w:type="dxa"/>
+          </w:tcPr>
+          <w:p>
+            <w:pPr>
+              <w:spacing w:line="480" w:lineRule="auto"/>
+              <w:rPr>
+                <w:rFonts w:ascii="Times New Roman" w:hAnsi="Times New Roman" w:cs="Times New Roman"/>
+                <w:color w:val="000000" w:themeColor="text1"/>
+              </w:rPr>
+            </w:pPr>
+          </w:p>
+        </w:tc>
+      </w:tr>
+    </w:tbl>
+    <w:p>
+      <w:pPr>
+        <w:spacing w:after="0" w:line="480" w:lineRule="auto"/>
+        <w:rPr>
+          <w:rFonts w:ascii="Times New Roman" w:hAnsi="Times New Roman" w:cs="Times New Roman"/>
+          <w:color w:val="000000" w:themeColor="text1"/>
+        </w:rPr>
+      </w:pPr>
+    </w:p>
+    <w:p>
+      <w:pPr>
+        <w:spacing w:after="0" w:line="480" w:lineRule="auto"/>
+        <w:rPr>
+          <w:rFonts w:ascii="Times New Roman" w:hAnsi="Times New Roman" w:cs="Times New Roman"/>
+          <w:color w:val="000000" w:themeColor="text1"/>
+        </w:rPr>
+      </w:pPr>
+      <w:r>
+        <w:rPr>
+          <w:rFonts w:ascii="Times New Roman" w:hAnsi="Times New Roman" w:cs="Times New Roman"/>
+          <w:color w:val="000000" w:themeColor="text1"/>
+        </w:rPr>
+        <w:br w:type="page"/>
+      </w:r>
+    </w:p>
+    <w:p>
+      <w:pPr>
+        <w:pStyle w:val="Heading1"/>
+        <w:spacing w:before="0" w:after="0" w:line="480" w:lineRule="auto"/>
         <w:jc w:val="center"/>
         <w:rPr>
           <w:rFonts w:ascii="Times New Roman" w:hAnsi="Times New Roman" w:cs="Times New Roman"/>
-          <w:lang w:val="es-ES"/>
-        </w:rPr>
-      </w:pPr>
-    </w:p>
-    <w:p>
-      <w:pPr>
-        <w:spacing w:after="0" w:line="480" w:lineRule="auto"/>
+          <w:color w:val="000000" w:themeColor="text1"/>
+          <w:sz w:val="24"/>
+          <w:szCs w:val="24"/>
+          <w:lang w:val="es-ES"/>
+        </w:rPr>
+      </w:pPr>
+      <w:bookmarkStart w:id="7" w:name="_Toc227886407"/>
+      <w:r>
+        <w:rPr>
+          <w:rFonts w:ascii="Times New Roman" w:hAnsi="Times New Roman" w:cs="Times New Roman"/>
+          <w:color w:val="000000" w:themeColor="text1"/>
+          <w:sz w:val="24"/>
+          <w:szCs w:val="24"/>
+          <w:lang w:val="es-ES"/>
+        </w:rPr>
+        <w:lastRenderedPageBreak/>
+        <w:t>Conclusiones</w:t>
+      </w:r>
+      <w:bookmarkEnd w:id="7"/>
+    </w:p>
+    <w:p>
+      <w:pPr>
+        <w:spacing w:after="0" w:line="480" w:lineRule="auto"/>
+        <w:ind w:firstLine="720"/>
+        <w:rPr>
+          <w:rFonts w:ascii="Times New Roman" w:hAnsi="Times New Roman" w:cs="Times New Roman"/>
+        </w:rPr>
+      </w:pPr>
+      <w:r>
+        <w:rPr>
+          <w:rFonts w:ascii="Times New Roman" w:hAnsi="Times New Roman" w:cs="Times New Roman"/>
+        </w:rPr>
+        <w:t>La arquitectura modular implementada en cuatro capas (main, ui, controller, utils) demostró ser efectiva para separar responsabilidades y facilitar el mantenimiento del código, permitiendo modificar</w:t>
+      </w:r>
+      <w:r>
+        <w:rPr>
+          <w:rFonts w:ascii="Times New Roman" w:hAnsi="Times New Roman" w:cs="Times New Roman"/>
+        </w:rPr>
+        <w:t>, permitiendo alterar impresiones sin afectas la logica y viceversa.</w:t>
+      </w:r>
+    </w:p>
+    <w:p>
+      <w:pPr>
+        <w:spacing w:after="0" w:line="480" w:lineRule="auto"/>
+        <w:ind w:firstLine="720"/>
+        <w:rPr>
+          <w:rFonts w:ascii="Times New Roman" w:hAnsi="Times New Roman" w:cs="Times New Roman"/>
+        </w:rPr>
+      </w:pPr>
+      <w:r>
+        <w:rPr>
+          <w:rFonts w:ascii="Times New Roman" w:hAnsi="Times New Roman" w:cs="Times New Roman"/>
+        </w:rPr>
+        <w:t>El uso exclusivo del módulo devspace.py como capa de acceso a datos obligó a interpretar correctamente las estructuras de listas retornadas, lo que reforzó la comprensión de cómo funcionan los contratos de API en sistemas reales de software.</w:t>
+      </w:r>
+    </w:p>
+    <w:p>
+      <w:pPr>
+        <w:spacing w:after="0" w:line="480" w:lineRule="auto"/>
+        <w:ind w:firstLine="720"/>
+        <w:rPr>
+          <w:rFonts w:ascii="Times New Roman" w:hAnsi="Times New Roman" w:cs="Times New Roman"/>
+        </w:rPr>
+      </w:pPr>
+      <w:r>
+        <w:rPr>
+          <w:rFonts w:ascii="Times New Roman" w:hAnsi="Times New Roman" w:cs="Times New Roman"/>
+        </w:rPr>
+        <w:t>La implementación de animaciones carácter por carácter y resaltado de sintaxis mediante códigos ANSI demostró que es posible crear experiencias de usuario enriquecidas en entornos de terminal</w:t>
+      </w:r>
+      <w:r>
+        <w:rPr>
+          <w:rFonts w:ascii="Times New Roman" w:hAnsi="Times New Roman" w:cs="Times New Roman"/>
+        </w:rPr>
+        <w:t>.</w:t>
+      </w:r>
+    </w:p>
+    <w:p>
+      <w:pPr>
+        <w:pStyle w:val="Heading1"/>
+        <w:spacing w:before="0" w:after="0" w:line="480" w:lineRule="auto"/>
         <w:jc w:val="center"/>
         <w:rPr>
           <w:rFonts w:ascii="Times New Roman" w:hAnsi="Times New Roman" w:cs="Times New Roman"/>
-          <w:lang w:val="es-ES"/>
-        </w:rPr>
-      </w:pPr>
-      <w:r>
-        <w:rPr>
-          <w:rFonts w:ascii="Times New Roman" w:hAnsi="Times New Roman" w:cs="Times New Roman"/>
-          <w:lang w:val="es-ES"/>
-        </w:rPr>
-        <w:t>24 de abril de 2026</w:t>
+          <w:color w:val="000000" w:themeColor="text1"/>
+          <w:sz w:val="24"/>
+          <w:szCs w:val="24"/>
+          <w:lang w:val="es-ES"/>
+        </w:rPr>
+      </w:pPr>
+      <w:bookmarkStart w:id="8" w:name="_Toc227886408"/>
+      <w:r>
+        <w:rPr>
+          <w:rFonts w:ascii="Times New Roman" w:hAnsi="Times New Roman" w:cs="Times New Roman"/>
+          <w:color w:val="000000" w:themeColor="text1"/>
+          <w:sz w:val="24"/>
+          <w:szCs w:val="24"/>
+          <w:lang w:val="es-ES"/>
+        </w:rPr>
+        <w:t>Recomendaciones</w:t>
+      </w:r>
+      <w:bookmarkEnd w:id="8"/>
+    </w:p>
+    <w:p>
+      <w:pPr>
+        <w:spacing w:after="0" w:line="480" w:lineRule="auto"/>
+        <w:ind w:firstLine="720"/>
+        <w:rPr>
+          <w:rFonts w:ascii="Times New Roman" w:hAnsi="Times New Roman" w:cs="Times New Roman"/>
+        </w:rPr>
+      </w:pPr>
+      <w:r>
+        <w:rPr>
+          <w:rFonts w:ascii="Times New Roman" w:hAnsi="Times New Roman" w:cs="Times New Roman"/>
+        </w:rPr>
+        <w:t xml:space="preserve">Se recomienda ampliar el sistema para </w:t>
+      </w:r>
+      <w:r>
+        <w:rPr>
+          <w:rFonts w:ascii="Times New Roman" w:hAnsi="Times New Roman" w:cs="Times New Roman"/>
+        </w:rPr>
+        <w:t>crear o borrar</w:t>
+      </w:r>
+      <w:r>
+        <w:rPr>
+          <w:rFonts w:ascii="Times New Roman" w:hAnsi="Times New Roman" w:cs="Times New Roman"/>
+        </w:rPr>
+        <w:t xml:space="preserve"> spaces y publicaciones directamente desde la terminal, lo que permitiría a los usuarios gestionar contenido propio sin depender de herramientas externas.</w:t>
+      </w:r>
+      <w:r>
+        <w:rPr>
+          <w:rFonts w:ascii="Times New Roman" w:hAnsi="Times New Roman" w:cs="Times New Roman"/>
+        </w:rPr>
+        <w:t xml:space="preserve"> Se podría expandir el sistema para permitirle el usuario editar sus posts. Mas funciones como poder realizar comentarios a posts desde la terminal.</w:t>
+      </w:r>
+    </w:p>
+    <w:p>
+      <w:pPr>
+        <w:spacing w:after="0" w:line="480" w:lineRule="auto"/>
+        <w:ind w:firstLine="720"/>
+        <w:rPr>
+          <w:rFonts w:ascii="Times New Roman" w:hAnsi="Times New Roman" w:cs="Times New Roman"/>
+        </w:rPr>
+      </w:pPr>
+      <w:r>
+        <w:rPr>
+          <w:rFonts w:ascii="Times New Roman" w:hAnsi="Times New Roman" w:cs="Times New Roman"/>
+        </w:rPr>
+        <w:t>Sería beneficioso implementar un sistema de caché local que almacene temporalmente la lista de usuarios y spaces, evitando múltiples llamadas al servidor para obtener la misma información en una misma sesión de uso.</w:t>
+      </w:r>
+    </w:p>
+    <w:p>
+      <w:pPr>
+        <w:spacing w:after="0" w:line="480" w:lineRule="auto"/>
+        <w:rPr>
+          <w:rFonts w:ascii="Times New Roman" w:hAnsi="Times New Roman" w:cs="Times New Roman"/>
+        </w:rPr>
+      </w:pPr>
+    </w:p>
+    <w:p>
+      <w:pPr>
+        <w:spacing w:after="0" w:line="480" w:lineRule="auto"/>
+        <w:rPr>
+          <w:rFonts w:ascii="Times New Roman" w:hAnsi="Times New Roman" w:cs="Times New Roman"/>
+        </w:rPr>
+      </w:pPr>
+    </w:p>
+    <w:p>
+      <w:pPr>
+        <w:spacing w:after="0" w:line="480" w:lineRule="auto"/>
+        <w:rPr>
+          <w:rFonts w:ascii="Times New Roman" w:hAnsi="Times New Roman" w:cs="Times New Roman"/>
+        </w:rPr>
+      </w:pPr>
+    </w:p>
+    <w:p>
+      <w:pPr>
+        <w:spacing w:after="0" w:line="480" w:lineRule="auto"/>
+        <w:rPr>
+          <w:rFonts w:ascii="Times New Roman" w:hAnsi="Times New Roman" w:cs="Times New Roman"/>
+        </w:rPr>
+      </w:pPr>
+    </w:p>
+    <w:p>
+      <w:pPr>
+        <w:spacing w:after="0" w:line="480" w:lineRule="auto"/>
+        <w:rPr>
+          <w:rFonts w:ascii="Times New Roman" w:hAnsi="Times New Roman" w:cs="Times New Roman"/>
+        </w:rPr>
+      </w:pPr>
+    </w:p>
+    <w:p>
+      <w:pPr>
+        <w:pStyle w:val="Heading1"/>
+        <w:spacing w:before="0" w:after="0" w:line="480" w:lineRule="auto"/>
+        <w:jc w:val="center"/>
+        <w:rPr>
+          <w:rFonts w:eastAsia="Times New Roman"/>
+        </w:rPr>
+      </w:pPr>
+      <w:bookmarkStart w:id="9" w:name="_Toc227886409"/>
+      <w:r>
+        <w:rPr>
+          <w:rFonts w:ascii="Times New Roman" w:hAnsi="Times New Roman" w:cs="Times New Roman"/>
+          <w:color w:val="000000" w:themeColor="text1"/>
+          <w:sz w:val="24"/>
+          <w:szCs w:val="24"/>
+          <w:lang w:val="es-ES"/>
+        </w:rPr>
+        <w:lastRenderedPageBreak/>
+        <w:t>Re</w:t>
+      </w:r>
+      <w:r>
+        <w:rPr>
+          <w:rFonts w:ascii="Times New Roman" w:hAnsi="Times New Roman" w:cs="Times New Roman"/>
+          <w:color w:val="000000" w:themeColor="text1"/>
+          <w:sz w:val="24"/>
+          <w:szCs w:val="24"/>
+          <w:lang w:val="es-ES"/>
+        </w:rPr>
+        <w:t>ferencias</w:t>
+      </w:r>
+      <w:bookmarkEnd w:id="9"/>
+    </w:p>
+    <w:p>
+      <w:pPr>
+        <w:spacing w:after="0" w:line="480" w:lineRule="auto"/>
+        <w:ind w:left="720" w:hanging="720"/>
+        <w:jc w:val="both"/>
+        <w:rPr>
+          <w:rFonts w:ascii="Times New Roman" w:hAnsi="Times New Roman" w:cs="Times New Roman"/>
+        </w:rPr>
+      </w:pPr>
+      <w:r>
+        <w:rPr>
+          <w:rFonts w:ascii="Times New Roman" w:eastAsia="Times New Roman" w:hAnsi="Times New Roman" w:cs="Times New Roman"/>
+        </w:rPr>
+        <w:t>Víquez Acuña, L. (2025). Primer Proyecto Programado: DEVSPACES. Instituto Tecnológico de Costa Rica, Campus Tecnológico San Carlos.</w:t>
       </w:r>
     </w:p>
     <w:sectPr>
@@ -290,6 +3727,999 @@
     </w:sectPr>
   </w:body>
 </w:document>
+</file>
+
+<file path=word/numbering.xml><?xml version="1.0" encoding="utf-8"?>
+<w:numbering xmlns:wpc="http://schemas.microsoft.com/office/word/2010/wordprocessingCanvas" xmlns:cx="http://schemas.microsoft.com/office/drawing/2014/chartex" xmlns:cx1="http://schemas.microsoft.com/office/drawing/2015/9/8/chartex" xmlns:cx2="http://schemas.microsoft.com/office/drawing/2015/10/21/chartex" xmlns:cx3="http://schemas.microsoft.com/office/drawing/2016/5/9/chartex" xmlns:cx4="http://schemas.microsoft.com/office/drawing/2016/5/10/chartex" xmlns:cx5="http://schemas.microsoft.com/office/drawing/2016/5/11/chartex" xmlns:cx6="http://schemas.microsoft.com/office/drawing/2016/5/12/chartex" xmlns:cx7="http://schemas.microsoft.com/office/drawing/2016/5/13/chartex" xmlns:cx8="http://schemas.microsoft.com/office/drawing/2016/5/14/chartex" xmlns:mc="http://schemas.openxmlformats.org/markup-compatibility/2006" xmlns:aink="http://schemas.microsoft.com/office/drawing/2016/ink" xmlns:am3d="http://schemas.microsoft.com/office/drawing/2017/model3d" xmlns:o="urn:schemas-microsoft-com:office:office" xmlns:oel="http://schemas.microsoft.com/office/2019/extlst" xmlns:r="http://schemas.openxmlformats.org/officeDocument/2006/relationships" xmlns:m="http://schemas.openxmlformats.org/officeDocument/2006/math" xmlns:v="urn:schemas-microsoft-com:vml" xmlns:wp14="http://schemas.microsoft.com/office/word/2010/wordprocessingDrawing" xmlns:wp="http://schemas.openxmlformats.org/drawingml/2006/wordprocessingDrawing" xmlns:w10="urn:schemas-microsoft-com:office:word" xmlns:w="http://schemas.openxmlformats.org/wordprocessingml/2006/main" xmlns:w14="http://schemas.microsoft.com/office/word/2010/wordml" xmlns:w15="http://schemas.microsoft.com/office/word/2012/wordml" xmlns:w16cex="http://schemas.microsoft.com/office/word/2018/wordml/cex" xmlns:w16cid="http://schemas.microsoft.com/office/word/2016/wordml/cid" xmlns:w16="http://schemas.microsoft.com/office/word/2018/wordml" xmlns:w16du="http://schemas.microsoft.com/office/word/2023/wordml/word16du" xmlns:w16sdtdh="http://schemas.microsoft.com/office/word/2020/wordml/sdtdatahash" xmlns:w16sdtfl="http://schemas.microsoft.com/office/word/2024/wordml/sdtformatlock" xmlns:w16se="http://schemas.microsoft.com/office/word/2015/wordml/symex" xmlns:wpg="http://schemas.microsoft.com/office/word/2010/wordprocessingGroup" xmlns:wpi="http://schemas.microsoft.com/office/word/2010/wordprocessingInk" xmlns:wne="http://schemas.microsoft.com/office/word/2006/wordml" xmlns:wps="http://schemas.microsoft.com/office/word/2010/wordprocessingShape" mc:Ignorable="w14 w15 w16se w16cid w16 w16cex w16sdtdh w16sdtfl w16du wp14">
+  <w:abstractNum w:abstractNumId="0" w15:restartNumberingAfterBreak="0">
+    <w:nsid w:val="104B3B1E"/>
+    <w:multiLevelType w:val="hybridMultilevel"/>
+    <w:tmpl w:val="38EE566E"/>
+    <w:lvl w:ilvl="0" w:tplc="04090001">
+      <w:start w:val="1"/>
+      <w:numFmt w:val="bullet"/>
+      <w:lvlText w:val=""/>
+      <w:lvlJc w:val="left"/>
+      <w:pPr>
+        <w:ind w:left="720" w:hanging="360"/>
+      </w:pPr>
+      <w:rPr>
+        <w:rFonts w:ascii="Symbol" w:hAnsi="Symbol" w:hint="default"/>
+      </w:rPr>
+    </w:lvl>
+    <w:lvl w:ilvl="1" w:tplc="04090003" w:tentative="1">
+      <w:start w:val="1"/>
+      <w:numFmt w:val="bullet"/>
+      <w:lvlText w:val="o"/>
+      <w:lvlJc w:val="left"/>
+      <w:pPr>
+        <w:ind w:left="1440" w:hanging="360"/>
+      </w:pPr>
+      <w:rPr>
+        <w:rFonts w:ascii="Courier New" w:hAnsi="Courier New" w:cs="Courier New" w:hint="default"/>
+      </w:rPr>
+    </w:lvl>
+    <w:lvl w:ilvl="2" w:tplc="04090005" w:tentative="1">
+      <w:start w:val="1"/>
+      <w:numFmt w:val="bullet"/>
+      <w:lvlText w:val=""/>
+      <w:lvlJc w:val="left"/>
+      <w:pPr>
+        <w:ind w:left="2160" w:hanging="360"/>
+      </w:pPr>
+      <w:rPr>
+        <w:rFonts w:ascii="Wingdings" w:hAnsi="Wingdings" w:hint="default"/>
+      </w:rPr>
+    </w:lvl>
+    <w:lvl w:ilvl="3" w:tplc="04090001" w:tentative="1">
+      <w:start w:val="1"/>
+      <w:numFmt w:val="bullet"/>
+      <w:lvlText w:val=""/>
+      <w:lvlJc w:val="left"/>
+      <w:pPr>
+        <w:ind w:left="2880" w:hanging="360"/>
+      </w:pPr>
+      <w:rPr>
+        <w:rFonts w:ascii="Symbol" w:hAnsi="Symbol" w:hint="default"/>
+      </w:rPr>
+    </w:lvl>
+    <w:lvl w:ilvl="4" w:tplc="04090003" w:tentative="1">
+      <w:start w:val="1"/>
+      <w:numFmt w:val="bullet"/>
+      <w:lvlText w:val="o"/>
+      <w:lvlJc w:val="left"/>
+      <w:pPr>
+        <w:ind w:left="3600" w:hanging="360"/>
+      </w:pPr>
+      <w:rPr>
+        <w:rFonts w:ascii="Courier New" w:hAnsi="Courier New" w:cs="Courier New" w:hint="default"/>
+      </w:rPr>
+    </w:lvl>
+    <w:lvl w:ilvl="5" w:tplc="04090005" w:tentative="1">
+      <w:start w:val="1"/>
+      <w:numFmt w:val="bullet"/>
+      <w:lvlText w:val=""/>
+      <w:lvlJc w:val="left"/>
+      <w:pPr>
+        <w:ind w:left="4320" w:hanging="360"/>
+      </w:pPr>
+      <w:rPr>
+        <w:rFonts w:ascii="Wingdings" w:hAnsi="Wingdings" w:hint="default"/>
+      </w:rPr>
+    </w:lvl>
+    <w:lvl w:ilvl="6" w:tplc="04090001" w:tentative="1">
+      <w:start w:val="1"/>
+      <w:numFmt w:val="bullet"/>
+      <w:lvlText w:val=""/>
+      <w:lvlJc w:val="left"/>
+      <w:pPr>
+        <w:ind w:left="5040" w:hanging="360"/>
+      </w:pPr>
+      <w:rPr>
+        <w:rFonts w:ascii="Symbol" w:hAnsi="Symbol" w:hint="default"/>
+      </w:rPr>
+    </w:lvl>
+    <w:lvl w:ilvl="7" w:tplc="04090003" w:tentative="1">
+      <w:start w:val="1"/>
+      <w:numFmt w:val="bullet"/>
+      <w:lvlText w:val="o"/>
+      <w:lvlJc w:val="left"/>
+      <w:pPr>
+        <w:ind w:left="5760" w:hanging="360"/>
+      </w:pPr>
+      <w:rPr>
+        <w:rFonts w:ascii="Courier New" w:hAnsi="Courier New" w:cs="Courier New" w:hint="default"/>
+      </w:rPr>
+    </w:lvl>
+    <w:lvl w:ilvl="8" w:tplc="04090005" w:tentative="1">
+      <w:start w:val="1"/>
+      <w:numFmt w:val="bullet"/>
+      <w:lvlText w:val=""/>
+      <w:lvlJc w:val="left"/>
+      <w:pPr>
+        <w:ind w:left="6480" w:hanging="360"/>
+      </w:pPr>
+      <w:rPr>
+        <w:rFonts w:ascii="Wingdings" w:hAnsi="Wingdings" w:hint="default"/>
+      </w:rPr>
+    </w:lvl>
+  </w:abstractNum>
+  <w:abstractNum w:abstractNumId="1" w15:restartNumberingAfterBreak="0">
+    <w:nsid w:val="18AC4108"/>
+    <w:multiLevelType w:val="hybridMultilevel"/>
+    <w:tmpl w:val="3F60D82A"/>
+    <w:lvl w:ilvl="0" w:tplc="04090001">
+      <w:start w:val="1"/>
+      <w:numFmt w:val="bullet"/>
+      <w:lvlText w:val=""/>
+      <w:lvlJc w:val="left"/>
+      <w:pPr>
+        <w:ind w:left="1501" w:hanging="360"/>
+      </w:pPr>
+      <w:rPr>
+        <w:rFonts w:ascii="Symbol" w:hAnsi="Symbol" w:hint="default"/>
+      </w:rPr>
+    </w:lvl>
+    <w:lvl w:ilvl="1" w:tplc="04090003" w:tentative="1">
+      <w:start w:val="1"/>
+      <w:numFmt w:val="bullet"/>
+      <w:lvlText w:val="o"/>
+      <w:lvlJc w:val="left"/>
+      <w:pPr>
+        <w:ind w:left="2221" w:hanging="360"/>
+      </w:pPr>
+      <w:rPr>
+        <w:rFonts w:ascii="Courier New" w:hAnsi="Courier New" w:cs="Courier New" w:hint="default"/>
+      </w:rPr>
+    </w:lvl>
+    <w:lvl w:ilvl="2" w:tplc="04090005" w:tentative="1">
+      <w:start w:val="1"/>
+      <w:numFmt w:val="bullet"/>
+      <w:lvlText w:val=""/>
+      <w:lvlJc w:val="left"/>
+      <w:pPr>
+        <w:ind w:left="2941" w:hanging="360"/>
+      </w:pPr>
+      <w:rPr>
+        <w:rFonts w:ascii="Wingdings" w:hAnsi="Wingdings" w:hint="default"/>
+      </w:rPr>
+    </w:lvl>
+    <w:lvl w:ilvl="3" w:tplc="04090001" w:tentative="1">
+      <w:start w:val="1"/>
+      <w:numFmt w:val="bullet"/>
+      <w:lvlText w:val=""/>
+      <w:lvlJc w:val="left"/>
+      <w:pPr>
+        <w:ind w:left="3661" w:hanging="360"/>
+      </w:pPr>
+      <w:rPr>
+        <w:rFonts w:ascii="Symbol" w:hAnsi="Symbol" w:hint="default"/>
+      </w:rPr>
+    </w:lvl>
+    <w:lvl w:ilvl="4" w:tplc="04090003" w:tentative="1">
+      <w:start w:val="1"/>
+      <w:numFmt w:val="bullet"/>
+      <w:lvlText w:val="o"/>
+      <w:lvlJc w:val="left"/>
+      <w:pPr>
+        <w:ind w:left="4381" w:hanging="360"/>
+      </w:pPr>
+      <w:rPr>
+        <w:rFonts w:ascii="Courier New" w:hAnsi="Courier New" w:cs="Courier New" w:hint="default"/>
+      </w:rPr>
+    </w:lvl>
+    <w:lvl w:ilvl="5" w:tplc="04090005" w:tentative="1">
+      <w:start w:val="1"/>
+      <w:numFmt w:val="bullet"/>
+      <w:lvlText w:val=""/>
+      <w:lvlJc w:val="left"/>
+      <w:pPr>
+        <w:ind w:left="5101" w:hanging="360"/>
+      </w:pPr>
+      <w:rPr>
+        <w:rFonts w:ascii="Wingdings" w:hAnsi="Wingdings" w:hint="default"/>
+      </w:rPr>
+    </w:lvl>
+    <w:lvl w:ilvl="6" w:tplc="04090001" w:tentative="1">
+      <w:start w:val="1"/>
+      <w:numFmt w:val="bullet"/>
+      <w:lvlText w:val=""/>
+      <w:lvlJc w:val="left"/>
+      <w:pPr>
+        <w:ind w:left="5821" w:hanging="360"/>
+      </w:pPr>
+      <w:rPr>
+        <w:rFonts w:ascii="Symbol" w:hAnsi="Symbol" w:hint="default"/>
+      </w:rPr>
+    </w:lvl>
+    <w:lvl w:ilvl="7" w:tplc="04090003" w:tentative="1">
+      <w:start w:val="1"/>
+      <w:numFmt w:val="bullet"/>
+      <w:lvlText w:val="o"/>
+      <w:lvlJc w:val="left"/>
+      <w:pPr>
+        <w:ind w:left="6541" w:hanging="360"/>
+      </w:pPr>
+      <w:rPr>
+        <w:rFonts w:ascii="Courier New" w:hAnsi="Courier New" w:cs="Courier New" w:hint="default"/>
+      </w:rPr>
+    </w:lvl>
+    <w:lvl w:ilvl="8" w:tplc="04090005" w:tentative="1">
+      <w:start w:val="1"/>
+      <w:numFmt w:val="bullet"/>
+      <w:lvlText w:val=""/>
+      <w:lvlJc w:val="left"/>
+      <w:pPr>
+        <w:ind w:left="7261" w:hanging="360"/>
+      </w:pPr>
+      <w:rPr>
+        <w:rFonts w:ascii="Wingdings" w:hAnsi="Wingdings" w:hint="default"/>
+      </w:rPr>
+    </w:lvl>
+  </w:abstractNum>
+  <w:abstractNum w:abstractNumId="2" w15:restartNumberingAfterBreak="0">
+    <w:nsid w:val="1B3317C3"/>
+    <w:multiLevelType w:val="hybridMultilevel"/>
+    <w:tmpl w:val="93B88CBA"/>
+    <w:lvl w:ilvl="0" w:tplc="04090001">
+      <w:start w:val="1"/>
+      <w:numFmt w:val="bullet"/>
+      <w:lvlText w:val=""/>
+      <w:lvlJc w:val="left"/>
+      <w:pPr>
+        <w:ind w:left="1440" w:hanging="360"/>
+      </w:pPr>
+      <w:rPr>
+        <w:rFonts w:ascii="Symbol" w:hAnsi="Symbol" w:hint="default"/>
+      </w:rPr>
+    </w:lvl>
+    <w:lvl w:ilvl="1" w:tplc="04090003" w:tentative="1">
+      <w:start w:val="1"/>
+      <w:numFmt w:val="bullet"/>
+      <w:lvlText w:val="o"/>
+      <w:lvlJc w:val="left"/>
+      <w:pPr>
+        <w:ind w:left="2160" w:hanging="360"/>
+      </w:pPr>
+      <w:rPr>
+        <w:rFonts w:ascii="Courier New" w:hAnsi="Courier New" w:cs="Courier New" w:hint="default"/>
+      </w:rPr>
+    </w:lvl>
+    <w:lvl w:ilvl="2" w:tplc="04090005" w:tentative="1">
+      <w:start w:val="1"/>
+      <w:numFmt w:val="bullet"/>
+      <w:lvlText w:val=""/>
+      <w:lvlJc w:val="left"/>
+      <w:pPr>
+        <w:ind w:left="2880" w:hanging="360"/>
+      </w:pPr>
+      <w:rPr>
+        <w:rFonts w:ascii="Wingdings" w:hAnsi="Wingdings" w:hint="default"/>
+      </w:rPr>
+    </w:lvl>
+    <w:lvl w:ilvl="3" w:tplc="04090001" w:tentative="1">
+      <w:start w:val="1"/>
+      <w:numFmt w:val="bullet"/>
+      <w:lvlText w:val=""/>
+      <w:lvlJc w:val="left"/>
+      <w:pPr>
+        <w:ind w:left="3600" w:hanging="360"/>
+      </w:pPr>
+      <w:rPr>
+        <w:rFonts w:ascii="Symbol" w:hAnsi="Symbol" w:hint="default"/>
+      </w:rPr>
+    </w:lvl>
+    <w:lvl w:ilvl="4" w:tplc="04090003" w:tentative="1">
+      <w:start w:val="1"/>
+      <w:numFmt w:val="bullet"/>
+      <w:lvlText w:val="o"/>
+      <w:lvlJc w:val="left"/>
+      <w:pPr>
+        <w:ind w:left="4320" w:hanging="360"/>
+      </w:pPr>
+      <w:rPr>
+        <w:rFonts w:ascii="Courier New" w:hAnsi="Courier New" w:cs="Courier New" w:hint="default"/>
+      </w:rPr>
+    </w:lvl>
+    <w:lvl w:ilvl="5" w:tplc="04090005" w:tentative="1">
+      <w:start w:val="1"/>
+      <w:numFmt w:val="bullet"/>
+      <w:lvlText w:val=""/>
+      <w:lvlJc w:val="left"/>
+      <w:pPr>
+        <w:ind w:left="5040" w:hanging="360"/>
+      </w:pPr>
+      <w:rPr>
+        <w:rFonts w:ascii="Wingdings" w:hAnsi="Wingdings" w:hint="default"/>
+      </w:rPr>
+    </w:lvl>
+    <w:lvl w:ilvl="6" w:tplc="04090001" w:tentative="1">
+      <w:start w:val="1"/>
+      <w:numFmt w:val="bullet"/>
+      <w:lvlText w:val=""/>
+      <w:lvlJc w:val="left"/>
+      <w:pPr>
+        <w:ind w:left="5760" w:hanging="360"/>
+      </w:pPr>
+      <w:rPr>
+        <w:rFonts w:ascii="Symbol" w:hAnsi="Symbol" w:hint="default"/>
+      </w:rPr>
+    </w:lvl>
+    <w:lvl w:ilvl="7" w:tplc="04090003" w:tentative="1">
+      <w:start w:val="1"/>
+      <w:numFmt w:val="bullet"/>
+      <w:lvlText w:val="o"/>
+      <w:lvlJc w:val="left"/>
+      <w:pPr>
+        <w:ind w:left="6480" w:hanging="360"/>
+      </w:pPr>
+      <w:rPr>
+        <w:rFonts w:ascii="Courier New" w:hAnsi="Courier New" w:cs="Courier New" w:hint="default"/>
+      </w:rPr>
+    </w:lvl>
+    <w:lvl w:ilvl="8" w:tplc="04090005" w:tentative="1">
+      <w:start w:val="1"/>
+      <w:numFmt w:val="bullet"/>
+      <w:lvlText w:val=""/>
+      <w:lvlJc w:val="left"/>
+      <w:pPr>
+        <w:ind w:left="7200" w:hanging="360"/>
+      </w:pPr>
+      <w:rPr>
+        <w:rFonts w:ascii="Wingdings" w:hAnsi="Wingdings" w:hint="default"/>
+      </w:rPr>
+    </w:lvl>
+  </w:abstractNum>
+  <w:abstractNum w:abstractNumId="3" w15:restartNumberingAfterBreak="0">
+    <w:nsid w:val="28B30E90"/>
+    <w:multiLevelType w:val="hybridMultilevel"/>
+    <w:tmpl w:val="83B08C0C"/>
+    <w:lvl w:ilvl="0" w:tplc="04090001">
+      <w:start w:val="1"/>
+      <w:numFmt w:val="bullet"/>
+      <w:lvlText w:val=""/>
+      <w:lvlJc w:val="left"/>
+      <w:pPr>
+        <w:ind w:left="720" w:hanging="360"/>
+      </w:pPr>
+      <w:rPr>
+        <w:rFonts w:ascii="Symbol" w:hAnsi="Symbol" w:hint="default"/>
+      </w:rPr>
+    </w:lvl>
+    <w:lvl w:ilvl="1" w:tplc="04090003" w:tentative="1">
+      <w:start w:val="1"/>
+      <w:numFmt w:val="bullet"/>
+      <w:lvlText w:val="o"/>
+      <w:lvlJc w:val="left"/>
+      <w:pPr>
+        <w:ind w:left="1440" w:hanging="360"/>
+      </w:pPr>
+      <w:rPr>
+        <w:rFonts w:ascii="Courier New" w:hAnsi="Courier New" w:cs="Courier New" w:hint="default"/>
+      </w:rPr>
+    </w:lvl>
+    <w:lvl w:ilvl="2" w:tplc="04090005" w:tentative="1">
+      <w:start w:val="1"/>
+      <w:numFmt w:val="bullet"/>
+      <w:lvlText w:val=""/>
+      <w:lvlJc w:val="left"/>
+      <w:pPr>
+        <w:ind w:left="2160" w:hanging="360"/>
+      </w:pPr>
+      <w:rPr>
+        <w:rFonts w:ascii="Wingdings" w:hAnsi="Wingdings" w:hint="default"/>
+      </w:rPr>
+    </w:lvl>
+    <w:lvl w:ilvl="3" w:tplc="04090001" w:tentative="1">
+      <w:start w:val="1"/>
+      <w:numFmt w:val="bullet"/>
+      <w:lvlText w:val=""/>
+      <w:lvlJc w:val="left"/>
+      <w:pPr>
+        <w:ind w:left="2880" w:hanging="360"/>
+      </w:pPr>
+      <w:rPr>
+        <w:rFonts w:ascii="Symbol" w:hAnsi="Symbol" w:hint="default"/>
+      </w:rPr>
+    </w:lvl>
+    <w:lvl w:ilvl="4" w:tplc="04090003" w:tentative="1">
+      <w:start w:val="1"/>
+      <w:numFmt w:val="bullet"/>
+      <w:lvlText w:val="o"/>
+      <w:lvlJc w:val="left"/>
+      <w:pPr>
+        <w:ind w:left="3600" w:hanging="360"/>
+      </w:pPr>
+      <w:rPr>
+        <w:rFonts w:ascii="Courier New" w:hAnsi="Courier New" w:cs="Courier New" w:hint="default"/>
+      </w:rPr>
+    </w:lvl>
+    <w:lvl w:ilvl="5" w:tplc="04090005" w:tentative="1">
+      <w:start w:val="1"/>
+      <w:numFmt w:val="bullet"/>
+      <w:lvlText w:val=""/>
+      <w:lvlJc w:val="left"/>
+      <w:pPr>
+        <w:ind w:left="4320" w:hanging="360"/>
+      </w:pPr>
+      <w:rPr>
+        <w:rFonts w:ascii="Wingdings" w:hAnsi="Wingdings" w:hint="default"/>
+      </w:rPr>
+    </w:lvl>
+    <w:lvl w:ilvl="6" w:tplc="04090001" w:tentative="1">
+      <w:start w:val="1"/>
+      <w:numFmt w:val="bullet"/>
+      <w:lvlText w:val=""/>
+      <w:lvlJc w:val="left"/>
+      <w:pPr>
+        <w:ind w:left="5040" w:hanging="360"/>
+      </w:pPr>
+      <w:rPr>
+        <w:rFonts w:ascii="Symbol" w:hAnsi="Symbol" w:hint="default"/>
+      </w:rPr>
+    </w:lvl>
+    <w:lvl w:ilvl="7" w:tplc="04090003" w:tentative="1">
+      <w:start w:val="1"/>
+      <w:numFmt w:val="bullet"/>
+      <w:lvlText w:val="o"/>
+      <w:lvlJc w:val="left"/>
+      <w:pPr>
+        <w:ind w:left="5760" w:hanging="360"/>
+      </w:pPr>
+      <w:rPr>
+        <w:rFonts w:ascii="Courier New" w:hAnsi="Courier New" w:cs="Courier New" w:hint="default"/>
+      </w:rPr>
+    </w:lvl>
+    <w:lvl w:ilvl="8" w:tplc="04090005" w:tentative="1">
+      <w:start w:val="1"/>
+      <w:numFmt w:val="bullet"/>
+      <w:lvlText w:val=""/>
+      <w:lvlJc w:val="left"/>
+      <w:pPr>
+        <w:ind w:left="6480" w:hanging="360"/>
+      </w:pPr>
+      <w:rPr>
+        <w:rFonts w:ascii="Wingdings" w:hAnsi="Wingdings" w:hint="default"/>
+      </w:rPr>
+    </w:lvl>
+  </w:abstractNum>
+  <w:abstractNum w:abstractNumId="4" w15:restartNumberingAfterBreak="0">
+    <w:nsid w:val="3D3428BC"/>
+    <w:multiLevelType w:val="hybridMultilevel"/>
+    <w:tmpl w:val="E26266BC"/>
+    <w:lvl w:ilvl="0" w:tplc="04090001">
+      <w:start w:val="1"/>
+      <w:numFmt w:val="bullet"/>
+      <w:lvlText w:val=""/>
+      <w:lvlJc w:val="left"/>
+      <w:pPr>
+        <w:ind w:left="781" w:hanging="360"/>
+      </w:pPr>
+      <w:rPr>
+        <w:rFonts w:ascii="Symbol" w:hAnsi="Symbol" w:hint="default"/>
+      </w:rPr>
+    </w:lvl>
+    <w:lvl w:ilvl="1" w:tplc="04090003" w:tentative="1">
+      <w:start w:val="1"/>
+      <w:numFmt w:val="bullet"/>
+      <w:lvlText w:val="o"/>
+      <w:lvlJc w:val="left"/>
+      <w:pPr>
+        <w:ind w:left="1501" w:hanging="360"/>
+      </w:pPr>
+      <w:rPr>
+        <w:rFonts w:ascii="Courier New" w:hAnsi="Courier New" w:cs="Courier New" w:hint="default"/>
+      </w:rPr>
+    </w:lvl>
+    <w:lvl w:ilvl="2" w:tplc="04090005" w:tentative="1">
+      <w:start w:val="1"/>
+      <w:numFmt w:val="bullet"/>
+      <w:lvlText w:val=""/>
+      <w:lvlJc w:val="left"/>
+      <w:pPr>
+        <w:ind w:left="2221" w:hanging="360"/>
+      </w:pPr>
+      <w:rPr>
+        <w:rFonts w:ascii="Wingdings" w:hAnsi="Wingdings" w:hint="default"/>
+      </w:rPr>
+    </w:lvl>
+    <w:lvl w:ilvl="3" w:tplc="04090001" w:tentative="1">
+      <w:start w:val="1"/>
+      <w:numFmt w:val="bullet"/>
+      <w:lvlText w:val=""/>
+      <w:lvlJc w:val="left"/>
+      <w:pPr>
+        <w:ind w:left="2941" w:hanging="360"/>
+      </w:pPr>
+      <w:rPr>
+        <w:rFonts w:ascii="Symbol" w:hAnsi="Symbol" w:hint="default"/>
+      </w:rPr>
+    </w:lvl>
+    <w:lvl w:ilvl="4" w:tplc="04090003" w:tentative="1">
+      <w:start w:val="1"/>
+      <w:numFmt w:val="bullet"/>
+      <w:lvlText w:val="o"/>
+      <w:lvlJc w:val="left"/>
+      <w:pPr>
+        <w:ind w:left="3661" w:hanging="360"/>
+      </w:pPr>
+      <w:rPr>
+        <w:rFonts w:ascii="Courier New" w:hAnsi="Courier New" w:cs="Courier New" w:hint="default"/>
+      </w:rPr>
+    </w:lvl>
+    <w:lvl w:ilvl="5" w:tplc="04090005" w:tentative="1">
+      <w:start w:val="1"/>
+      <w:numFmt w:val="bullet"/>
+      <w:lvlText w:val=""/>
+      <w:lvlJc w:val="left"/>
+      <w:pPr>
+        <w:ind w:left="4381" w:hanging="360"/>
+      </w:pPr>
+      <w:rPr>
+        <w:rFonts w:ascii="Wingdings" w:hAnsi="Wingdings" w:hint="default"/>
+      </w:rPr>
+    </w:lvl>
+    <w:lvl w:ilvl="6" w:tplc="04090001" w:tentative="1">
+      <w:start w:val="1"/>
+      <w:numFmt w:val="bullet"/>
+      <w:lvlText w:val=""/>
+      <w:lvlJc w:val="left"/>
+      <w:pPr>
+        <w:ind w:left="5101" w:hanging="360"/>
+      </w:pPr>
+      <w:rPr>
+        <w:rFonts w:ascii="Symbol" w:hAnsi="Symbol" w:hint="default"/>
+      </w:rPr>
+    </w:lvl>
+    <w:lvl w:ilvl="7" w:tplc="04090003" w:tentative="1">
+      <w:start w:val="1"/>
+      <w:numFmt w:val="bullet"/>
+      <w:lvlText w:val="o"/>
+      <w:lvlJc w:val="left"/>
+      <w:pPr>
+        <w:ind w:left="5821" w:hanging="360"/>
+      </w:pPr>
+      <w:rPr>
+        <w:rFonts w:ascii="Courier New" w:hAnsi="Courier New" w:cs="Courier New" w:hint="default"/>
+      </w:rPr>
+    </w:lvl>
+    <w:lvl w:ilvl="8" w:tplc="04090005" w:tentative="1">
+      <w:start w:val="1"/>
+      <w:numFmt w:val="bullet"/>
+      <w:lvlText w:val=""/>
+      <w:lvlJc w:val="left"/>
+      <w:pPr>
+        <w:ind w:left="6541" w:hanging="360"/>
+      </w:pPr>
+      <w:rPr>
+        <w:rFonts w:ascii="Wingdings" w:hAnsi="Wingdings" w:hint="default"/>
+      </w:rPr>
+    </w:lvl>
+  </w:abstractNum>
+  <w:abstractNum w:abstractNumId="5" w15:restartNumberingAfterBreak="0">
+    <w:nsid w:val="456620AD"/>
+    <w:multiLevelType w:val="hybridMultilevel"/>
+    <w:tmpl w:val="7D3AAD4E"/>
+    <w:lvl w:ilvl="0" w:tplc="04090001">
+      <w:start w:val="1"/>
+      <w:numFmt w:val="bullet"/>
+      <w:lvlText w:val=""/>
+      <w:lvlJc w:val="left"/>
+      <w:pPr>
+        <w:ind w:left="1440" w:hanging="360"/>
+      </w:pPr>
+      <w:rPr>
+        <w:rFonts w:ascii="Symbol" w:hAnsi="Symbol" w:hint="default"/>
+      </w:rPr>
+    </w:lvl>
+    <w:lvl w:ilvl="1" w:tplc="04090003" w:tentative="1">
+      <w:start w:val="1"/>
+      <w:numFmt w:val="bullet"/>
+      <w:lvlText w:val="o"/>
+      <w:lvlJc w:val="left"/>
+      <w:pPr>
+        <w:ind w:left="2160" w:hanging="360"/>
+      </w:pPr>
+      <w:rPr>
+        <w:rFonts w:ascii="Courier New" w:hAnsi="Courier New" w:cs="Courier New" w:hint="default"/>
+      </w:rPr>
+    </w:lvl>
+    <w:lvl w:ilvl="2" w:tplc="04090005" w:tentative="1">
+      <w:start w:val="1"/>
+      <w:numFmt w:val="bullet"/>
+      <w:lvlText w:val=""/>
+      <w:lvlJc w:val="left"/>
+      <w:pPr>
+        <w:ind w:left="2880" w:hanging="360"/>
+      </w:pPr>
+      <w:rPr>
+        <w:rFonts w:ascii="Wingdings" w:hAnsi="Wingdings" w:hint="default"/>
+      </w:rPr>
+    </w:lvl>
+    <w:lvl w:ilvl="3" w:tplc="04090001" w:tentative="1">
+      <w:start w:val="1"/>
+      <w:numFmt w:val="bullet"/>
+      <w:lvlText w:val=""/>
+      <w:lvlJc w:val="left"/>
+      <w:pPr>
+        <w:ind w:left="3600" w:hanging="360"/>
+      </w:pPr>
+      <w:rPr>
+        <w:rFonts w:ascii="Symbol" w:hAnsi="Symbol" w:hint="default"/>
+      </w:rPr>
+    </w:lvl>
+    <w:lvl w:ilvl="4" w:tplc="04090003" w:tentative="1">
+      <w:start w:val="1"/>
+      <w:numFmt w:val="bullet"/>
+      <w:lvlText w:val="o"/>
+      <w:lvlJc w:val="left"/>
+      <w:pPr>
+        <w:ind w:left="4320" w:hanging="360"/>
+      </w:pPr>
+      <w:rPr>
+        <w:rFonts w:ascii="Courier New" w:hAnsi="Courier New" w:cs="Courier New" w:hint="default"/>
+      </w:rPr>
+    </w:lvl>
+    <w:lvl w:ilvl="5" w:tplc="04090005" w:tentative="1">
+      <w:start w:val="1"/>
+      <w:numFmt w:val="bullet"/>
+      <w:lvlText w:val=""/>
+      <w:lvlJc w:val="left"/>
+      <w:pPr>
+        <w:ind w:left="5040" w:hanging="360"/>
+      </w:pPr>
+      <w:rPr>
+        <w:rFonts w:ascii="Wingdings" w:hAnsi="Wingdings" w:hint="default"/>
+      </w:rPr>
+    </w:lvl>
+    <w:lvl w:ilvl="6" w:tplc="04090001" w:tentative="1">
+      <w:start w:val="1"/>
+      <w:numFmt w:val="bullet"/>
+      <w:lvlText w:val=""/>
+      <w:lvlJc w:val="left"/>
+      <w:pPr>
+        <w:ind w:left="5760" w:hanging="360"/>
+      </w:pPr>
+      <w:rPr>
+        <w:rFonts w:ascii="Symbol" w:hAnsi="Symbol" w:hint="default"/>
+      </w:rPr>
+    </w:lvl>
+    <w:lvl w:ilvl="7" w:tplc="04090003" w:tentative="1">
+      <w:start w:val="1"/>
+      <w:numFmt w:val="bullet"/>
+      <w:lvlText w:val="o"/>
+      <w:lvlJc w:val="left"/>
+      <w:pPr>
+        <w:ind w:left="6480" w:hanging="360"/>
+      </w:pPr>
+      <w:rPr>
+        <w:rFonts w:ascii="Courier New" w:hAnsi="Courier New" w:cs="Courier New" w:hint="default"/>
+      </w:rPr>
+    </w:lvl>
+    <w:lvl w:ilvl="8" w:tplc="04090005" w:tentative="1">
+      <w:start w:val="1"/>
+      <w:numFmt w:val="bullet"/>
+      <w:lvlText w:val=""/>
+      <w:lvlJc w:val="left"/>
+      <w:pPr>
+        <w:ind w:left="7200" w:hanging="360"/>
+      </w:pPr>
+      <w:rPr>
+        <w:rFonts w:ascii="Wingdings" w:hAnsi="Wingdings" w:hint="default"/>
+      </w:rPr>
+    </w:lvl>
+  </w:abstractNum>
+  <w:abstractNum w:abstractNumId="6" w15:restartNumberingAfterBreak="0">
+    <w:nsid w:val="4AFC7388"/>
+    <w:multiLevelType w:val="hybridMultilevel"/>
+    <w:tmpl w:val="D8BC1F02"/>
+    <w:lvl w:ilvl="0" w:tplc="04090001">
+      <w:start w:val="1"/>
+      <w:numFmt w:val="bullet"/>
+      <w:lvlText w:val=""/>
+      <w:lvlJc w:val="left"/>
+      <w:pPr>
+        <w:ind w:left="720" w:hanging="360"/>
+      </w:pPr>
+      <w:rPr>
+        <w:rFonts w:ascii="Symbol" w:hAnsi="Symbol" w:hint="default"/>
+      </w:rPr>
+    </w:lvl>
+    <w:lvl w:ilvl="1" w:tplc="04090003" w:tentative="1">
+      <w:start w:val="1"/>
+      <w:numFmt w:val="bullet"/>
+      <w:lvlText w:val="o"/>
+      <w:lvlJc w:val="left"/>
+      <w:pPr>
+        <w:ind w:left="1440" w:hanging="360"/>
+      </w:pPr>
+      <w:rPr>
+        <w:rFonts w:ascii="Courier New" w:hAnsi="Courier New" w:cs="Courier New" w:hint="default"/>
+      </w:rPr>
+    </w:lvl>
+    <w:lvl w:ilvl="2" w:tplc="04090005" w:tentative="1">
+      <w:start w:val="1"/>
+      <w:numFmt w:val="bullet"/>
+      <w:lvlText w:val=""/>
+      <w:lvlJc w:val="left"/>
+      <w:pPr>
+        <w:ind w:left="2160" w:hanging="360"/>
+      </w:pPr>
+      <w:rPr>
+        <w:rFonts w:ascii="Wingdings" w:hAnsi="Wingdings" w:hint="default"/>
+      </w:rPr>
+    </w:lvl>
+    <w:lvl w:ilvl="3" w:tplc="04090001" w:tentative="1">
+      <w:start w:val="1"/>
+      <w:numFmt w:val="bullet"/>
+      <w:lvlText w:val=""/>
+      <w:lvlJc w:val="left"/>
+      <w:pPr>
+        <w:ind w:left="2880" w:hanging="360"/>
+      </w:pPr>
+      <w:rPr>
+        <w:rFonts w:ascii="Symbol" w:hAnsi="Symbol" w:hint="default"/>
+      </w:rPr>
+    </w:lvl>
+    <w:lvl w:ilvl="4" w:tplc="04090003" w:tentative="1">
+      <w:start w:val="1"/>
+      <w:numFmt w:val="bullet"/>
+      <w:lvlText w:val="o"/>
+      <w:lvlJc w:val="left"/>
+      <w:pPr>
+        <w:ind w:left="3600" w:hanging="360"/>
+      </w:pPr>
+      <w:rPr>
+        <w:rFonts w:ascii="Courier New" w:hAnsi="Courier New" w:cs="Courier New" w:hint="default"/>
+      </w:rPr>
+    </w:lvl>
+    <w:lvl w:ilvl="5" w:tplc="04090005" w:tentative="1">
+      <w:start w:val="1"/>
+      <w:numFmt w:val="bullet"/>
+      <w:lvlText w:val=""/>
+      <w:lvlJc w:val="left"/>
+      <w:pPr>
+        <w:ind w:left="4320" w:hanging="360"/>
+      </w:pPr>
+      <w:rPr>
+        <w:rFonts w:ascii="Wingdings" w:hAnsi="Wingdings" w:hint="default"/>
+      </w:rPr>
+    </w:lvl>
+    <w:lvl w:ilvl="6" w:tplc="04090001" w:tentative="1">
+      <w:start w:val="1"/>
+      <w:numFmt w:val="bullet"/>
+      <w:lvlText w:val=""/>
+      <w:lvlJc w:val="left"/>
+      <w:pPr>
+        <w:ind w:left="5040" w:hanging="360"/>
+      </w:pPr>
+      <w:rPr>
+        <w:rFonts w:ascii="Symbol" w:hAnsi="Symbol" w:hint="default"/>
+      </w:rPr>
+    </w:lvl>
+    <w:lvl w:ilvl="7" w:tplc="04090003" w:tentative="1">
+      <w:start w:val="1"/>
+      <w:numFmt w:val="bullet"/>
+      <w:lvlText w:val="o"/>
+      <w:lvlJc w:val="left"/>
+      <w:pPr>
+        <w:ind w:left="5760" w:hanging="360"/>
+      </w:pPr>
+      <w:rPr>
+        <w:rFonts w:ascii="Courier New" w:hAnsi="Courier New" w:cs="Courier New" w:hint="default"/>
+      </w:rPr>
+    </w:lvl>
+    <w:lvl w:ilvl="8" w:tplc="04090005" w:tentative="1">
+      <w:start w:val="1"/>
+      <w:numFmt w:val="bullet"/>
+      <w:lvlText w:val=""/>
+      <w:lvlJc w:val="left"/>
+      <w:pPr>
+        <w:ind w:left="6480" w:hanging="360"/>
+      </w:pPr>
+      <w:rPr>
+        <w:rFonts w:ascii="Wingdings" w:hAnsi="Wingdings" w:hint="default"/>
+      </w:rPr>
+    </w:lvl>
+  </w:abstractNum>
+  <w:abstractNum w:abstractNumId="7" w15:restartNumberingAfterBreak="0">
+    <w:nsid w:val="65FF3B60"/>
+    <w:multiLevelType w:val="hybridMultilevel"/>
+    <w:tmpl w:val="45287034"/>
+    <w:lvl w:ilvl="0" w:tplc="E9561654">
+      <w:start w:val="1"/>
+      <w:numFmt w:val="bullet"/>
+      <w:lvlText w:val="•"/>
+      <w:lvlJc w:val="left"/>
+      <w:pPr>
+        <w:ind w:left="720" w:hanging="360"/>
+      </w:pPr>
+    </w:lvl>
+    <w:lvl w:ilvl="1" w:tplc="D49C1F6A">
+      <w:numFmt w:val="decimal"/>
+      <w:lvlText w:val=""/>
+      <w:lvlJc w:val="left"/>
+    </w:lvl>
+    <w:lvl w:ilvl="2" w:tplc="AE883ABE">
+      <w:numFmt w:val="decimal"/>
+      <w:lvlText w:val=""/>
+      <w:lvlJc w:val="left"/>
+    </w:lvl>
+    <w:lvl w:ilvl="3" w:tplc="1C822F14">
+      <w:numFmt w:val="decimal"/>
+      <w:lvlText w:val=""/>
+      <w:lvlJc w:val="left"/>
+    </w:lvl>
+    <w:lvl w:ilvl="4" w:tplc="5FE40222">
+      <w:numFmt w:val="decimal"/>
+      <w:lvlText w:val=""/>
+      <w:lvlJc w:val="left"/>
+    </w:lvl>
+    <w:lvl w:ilvl="5" w:tplc="18AE21E8">
+      <w:numFmt w:val="decimal"/>
+      <w:lvlText w:val=""/>
+      <w:lvlJc w:val="left"/>
+    </w:lvl>
+    <w:lvl w:ilvl="6" w:tplc="43209074">
+      <w:numFmt w:val="decimal"/>
+      <w:lvlText w:val=""/>
+      <w:lvlJc w:val="left"/>
+    </w:lvl>
+    <w:lvl w:ilvl="7" w:tplc="2D103FE8">
+      <w:numFmt w:val="decimal"/>
+      <w:lvlText w:val=""/>
+      <w:lvlJc w:val="left"/>
+    </w:lvl>
+    <w:lvl w:ilvl="8" w:tplc="25F0B382">
+      <w:numFmt w:val="decimal"/>
+      <w:lvlText w:val=""/>
+      <w:lvlJc w:val="left"/>
+    </w:lvl>
+  </w:abstractNum>
+  <w:abstractNum w:abstractNumId="8" w15:restartNumberingAfterBreak="0">
+    <w:nsid w:val="74EF5193"/>
+    <w:multiLevelType w:val="hybridMultilevel"/>
+    <w:tmpl w:val="8C1ED55C"/>
+    <w:lvl w:ilvl="0" w:tplc="04090001">
+      <w:start w:val="1"/>
+      <w:numFmt w:val="bullet"/>
+      <w:lvlText w:val=""/>
+      <w:lvlJc w:val="left"/>
+      <w:pPr>
+        <w:ind w:left="720" w:hanging="360"/>
+      </w:pPr>
+      <w:rPr>
+        <w:rFonts w:ascii="Symbol" w:hAnsi="Symbol" w:hint="default"/>
+      </w:rPr>
+    </w:lvl>
+    <w:lvl w:ilvl="1" w:tplc="04090003" w:tentative="1">
+      <w:start w:val="1"/>
+      <w:numFmt w:val="bullet"/>
+      <w:lvlText w:val="o"/>
+      <w:lvlJc w:val="left"/>
+      <w:pPr>
+        <w:ind w:left="1440" w:hanging="360"/>
+      </w:pPr>
+      <w:rPr>
+        <w:rFonts w:ascii="Courier New" w:hAnsi="Courier New" w:cs="Courier New" w:hint="default"/>
+      </w:rPr>
+    </w:lvl>
+    <w:lvl w:ilvl="2" w:tplc="04090005" w:tentative="1">
+      <w:start w:val="1"/>
+      <w:numFmt w:val="bullet"/>
+      <w:lvlText w:val=""/>
+      <w:lvlJc w:val="left"/>
+      <w:pPr>
+        <w:ind w:left="2160" w:hanging="360"/>
+      </w:pPr>
+      <w:rPr>
+        <w:rFonts w:ascii="Wingdings" w:hAnsi="Wingdings" w:hint="default"/>
+      </w:rPr>
+    </w:lvl>
+    <w:lvl w:ilvl="3" w:tplc="04090001" w:tentative="1">
+      <w:start w:val="1"/>
+      <w:numFmt w:val="bullet"/>
+      <w:lvlText w:val=""/>
+      <w:lvlJc w:val="left"/>
+      <w:pPr>
+        <w:ind w:left="2880" w:hanging="360"/>
+      </w:pPr>
+      <w:rPr>
+        <w:rFonts w:ascii="Symbol" w:hAnsi="Symbol" w:hint="default"/>
+      </w:rPr>
+    </w:lvl>
+    <w:lvl w:ilvl="4" w:tplc="04090003" w:tentative="1">
+      <w:start w:val="1"/>
+      <w:numFmt w:val="bullet"/>
+      <w:lvlText w:val="o"/>
+      <w:lvlJc w:val="left"/>
+      <w:pPr>
+        <w:ind w:left="3600" w:hanging="360"/>
+      </w:pPr>
+      <w:rPr>
+        <w:rFonts w:ascii="Courier New" w:hAnsi="Courier New" w:cs="Courier New" w:hint="default"/>
+      </w:rPr>
+    </w:lvl>
+    <w:lvl w:ilvl="5" w:tplc="04090005" w:tentative="1">
+      <w:start w:val="1"/>
+      <w:numFmt w:val="bullet"/>
+      <w:lvlText w:val=""/>
+      <w:lvlJc w:val="left"/>
+      <w:pPr>
+        <w:ind w:left="4320" w:hanging="360"/>
+      </w:pPr>
+      <w:rPr>
+        <w:rFonts w:ascii="Wingdings" w:hAnsi="Wingdings" w:hint="default"/>
+      </w:rPr>
+    </w:lvl>
+    <w:lvl w:ilvl="6" w:tplc="04090001" w:tentative="1">
+      <w:start w:val="1"/>
+      <w:numFmt w:val="bullet"/>
+      <w:lvlText w:val=""/>
+      <w:lvlJc w:val="left"/>
+      <w:pPr>
+        <w:ind w:left="5040" w:hanging="360"/>
+      </w:pPr>
+      <w:rPr>
+        <w:rFonts w:ascii="Symbol" w:hAnsi="Symbol" w:hint="default"/>
+      </w:rPr>
+    </w:lvl>
+    <w:lvl w:ilvl="7" w:tplc="04090003" w:tentative="1">
+      <w:start w:val="1"/>
+      <w:numFmt w:val="bullet"/>
+      <w:lvlText w:val="o"/>
+      <w:lvlJc w:val="left"/>
+      <w:pPr>
+        <w:ind w:left="5760" w:hanging="360"/>
+      </w:pPr>
+      <w:rPr>
+        <w:rFonts w:ascii="Courier New" w:hAnsi="Courier New" w:cs="Courier New" w:hint="default"/>
+      </w:rPr>
+    </w:lvl>
+    <w:lvl w:ilvl="8" w:tplc="04090005" w:tentative="1">
+      <w:start w:val="1"/>
+      <w:numFmt w:val="bullet"/>
+      <w:lvlText w:val=""/>
+      <w:lvlJc w:val="left"/>
+      <w:pPr>
+        <w:ind w:left="6480" w:hanging="360"/>
+      </w:pPr>
+      <w:rPr>
+        <w:rFonts w:ascii="Wingdings" w:hAnsi="Wingdings" w:hint="default"/>
+      </w:rPr>
+    </w:lvl>
+  </w:abstractNum>
+  <w:num w:numId="1" w16cid:durableId="1394281571">
+    <w:abstractNumId w:val="7"/>
+    <w:lvlOverride w:ilvl="0">
+      <w:startOverride w:val="1"/>
+    </w:lvlOverride>
+  </w:num>
+  <w:num w:numId="2" w16cid:durableId="597445803">
+    <w:abstractNumId w:val="8"/>
+  </w:num>
+  <w:num w:numId="3" w16cid:durableId="1353073506">
+    <w:abstractNumId w:val="4"/>
+  </w:num>
+  <w:num w:numId="4" w16cid:durableId="1501778342">
+    <w:abstractNumId w:val="1"/>
+  </w:num>
+  <w:num w:numId="5" w16cid:durableId="730731414">
+    <w:abstractNumId w:val="0"/>
+  </w:num>
+  <w:num w:numId="6" w16cid:durableId="751199303">
+    <w:abstractNumId w:val="6"/>
+  </w:num>
+  <w:num w:numId="7" w16cid:durableId="420025786">
+    <w:abstractNumId w:val="3"/>
+  </w:num>
+  <w:num w:numId="8" w16cid:durableId="1738359426">
+    <w:abstractNumId w:val="5"/>
+  </w:num>
+  <w:num w:numId="9" w16cid:durableId="145512047">
+    <w:abstractNumId w:val="2"/>
+  </w:num>
+</w:numbering>
 </file>
 
 <file path=word/styles.xml><?xml version="1.0" encoding="utf-8"?>
@@ -491,7 +4921,7 @@
     <w:lsdException w:name="Medium Shading 2 Accent 1" w:uiPriority="64"/>
     <w:lsdException w:name="Medium List 1 Accent 1" w:uiPriority="65"/>
     <w:lsdException w:name="Revision" w:semiHidden="1"/>
-    <w:lsdException w:name="List Paragraph" w:uiPriority="34" w:qFormat="1"/>
+    <w:lsdException w:name="List Paragraph" w:uiPriority="0" w:qFormat="1"/>
     <w:lsdException w:name="Quote" w:uiPriority="29" w:qFormat="1"/>
     <w:lsdException w:name="Intense Quote" w:uiPriority="30" w:qFormat="1"/>
     <w:lsdException w:name="Medium List 2 Accent 1" w:uiPriority="66"/>
@@ -895,7 +5325,6 @@
   <w:style w:type="character" w:default="1" w:styleId="DefaultParagraphFont">
     <w:name w:val="Default Paragraph Font"/>
     <w:uiPriority w:val="1"/>
-    <w:semiHidden/>
     <w:unhideWhenUsed/>
   </w:style>
   <w:style w:type="table" w:default="1" w:styleId="TableNormal">
@@ -1140,7 +5569,6 @@
   <w:style w:type="paragraph" w:styleId="ListParagraph">
     <w:name w:val="List Paragraph"/>
     <w:basedOn w:val="Normal"/>
-    <w:uiPriority w:val="34"/>
     <w:qFormat/>
     <w:rsid w:val="00BE3F33"/>
     <w:pPr>
@@ -1207,6 +5635,240 @@
       <w:smallCaps/>
       <w:color w:val="0F4761" w:themeColor="accent1" w:themeShade="BF"/>
       <w:spacing w:val="5"/>
+    </w:rPr>
+  </w:style>
+  <w:style w:type="table" w:styleId="TableGrid">
+    <w:name w:val="Table Grid"/>
+    <w:basedOn w:val="TableNormal"/>
+    <w:uiPriority w:val="39"/>
+    <w:rsid w:val="00106282"/>
+    <w:pPr>
+      <w:spacing w:after="0" w:line="240" w:lineRule="auto"/>
+    </w:pPr>
+    <w:tblPr>
+      <w:tblBorders>
+        <w:top w:val="single" w:sz="4" w:space="0" w:color="auto"/>
+        <w:left w:val="single" w:sz="4" w:space="0" w:color="auto"/>
+        <w:bottom w:val="single" w:sz="4" w:space="0" w:color="auto"/>
+        <w:right w:val="single" w:sz="4" w:space="0" w:color="auto"/>
+        <w:insideH w:val="single" w:sz="4" w:space="0" w:color="auto"/>
+        <w:insideV w:val="single" w:sz="4" w:space="0" w:color="auto"/>
+      </w:tblBorders>
+    </w:tblPr>
+  </w:style>
+  <w:style w:type="table" w:styleId="TableGridLight">
+    <w:name w:val="Grid Table Light"/>
+    <w:basedOn w:val="TableNormal"/>
+    <w:uiPriority w:val="40"/>
+    <w:rsid w:val="00106282"/>
+    <w:pPr>
+      <w:spacing w:after="0" w:line="240" w:lineRule="auto"/>
+    </w:pPr>
+    <w:tblPr>
+      <w:tblBorders>
+        <w:top w:val="single" w:sz="4" w:space="0" w:color="BFBFBF" w:themeColor="background1" w:themeShade="BF"/>
+        <w:left w:val="single" w:sz="4" w:space="0" w:color="BFBFBF" w:themeColor="background1" w:themeShade="BF"/>
+        <w:bottom w:val="single" w:sz="4" w:space="0" w:color="BFBFBF" w:themeColor="background1" w:themeShade="BF"/>
+        <w:right w:val="single" w:sz="4" w:space="0" w:color="BFBFBF" w:themeColor="background1" w:themeShade="BF"/>
+        <w:insideH w:val="single" w:sz="4" w:space="0" w:color="BFBFBF" w:themeColor="background1" w:themeShade="BF"/>
+        <w:insideV w:val="single" w:sz="4" w:space="0" w:color="BFBFBF" w:themeColor="background1" w:themeShade="BF"/>
+      </w:tblBorders>
+    </w:tblPr>
+  </w:style>
+  <w:style w:type="paragraph" w:styleId="TOCHeading">
+    <w:name w:val="TOC Heading"/>
+    <w:basedOn w:val="Heading1"/>
+    <w:next w:val="Normal"/>
+    <w:uiPriority w:val="39"/>
+    <w:unhideWhenUsed/>
+    <w:qFormat/>
+    <w:rsid w:val="00963AE3"/>
+    <w:pPr>
+      <w:spacing w:before="480" w:after="0" w:line="276" w:lineRule="auto"/>
+      <w:outlineLvl w:val="9"/>
+    </w:pPr>
+    <w:rPr>
+      <w:b/>
+      <w:bCs/>
+      <w:kern w:val="0"/>
+      <w:sz w:val="28"/>
+      <w:szCs w:val="28"/>
+      <w:lang w:val="en-US"/>
+      <w14:ligatures w14:val="none"/>
+    </w:rPr>
+  </w:style>
+  <w:style w:type="paragraph" w:styleId="TOC1">
+    <w:name w:val="toc 1"/>
+    <w:basedOn w:val="Normal"/>
+    <w:next w:val="Normal"/>
+    <w:autoRedefine/>
+    <w:uiPriority w:val="39"/>
+    <w:unhideWhenUsed/>
+    <w:rsid w:val="00963AE3"/>
+    <w:pPr>
+      <w:spacing w:before="120" w:after="0"/>
+    </w:pPr>
+    <w:rPr>
+      <w:b/>
+      <w:bCs/>
+      <w:i/>
+      <w:iCs/>
+    </w:rPr>
+  </w:style>
+  <w:style w:type="paragraph" w:styleId="TOC2">
+    <w:name w:val="toc 2"/>
+    <w:basedOn w:val="Normal"/>
+    <w:next w:val="Normal"/>
+    <w:autoRedefine/>
+    <w:uiPriority w:val="39"/>
+    <w:unhideWhenUsed/>
+    <w:rsid w:val="00963AE3"/>
+    <w:pPr>
+      <w:spacing w:before="120" w:after="0"/>
+      <w:ind w:left="240"/>
+    </w:pPr>
+    <w:rPr>
+      <w:b/>
+      <w:bCs/>
+      <w:sz w:val="22"/>
+      <w:szCs w:val="22"/>
+    </w:rPr>
+  </w:style>
+  <w:style w:type="character" w:styleId="Hyperlink">
+    <w:name w:val="Hyperlink"/>
+    <w:basedOn w:val="DefaultParagraphFont"/>
+    <w:uiPriority w:val="99"/>
+    <w:unhideWhenUsed/>
+    <w:rsid w:val="00963AE3"/>
+    <w:rPr>
+      <w:color w:val="467886" w:themeColor="hyperlink"/>
+      <w:u w:val="single"/>
+    </w:rPr>
+  </w:style>
+  <w:style w:type="paragraph" w:styleId="TOC3">
+    <w:name w:val="toc 3"/>
+    <w:basedOn w:val="Normal"/>
+    <w:next w:val="Normal"/>
+    <w:autoRedefine/>
+    <w:uiPriority w:val="39"/>
+    <w:semiHidden/>
+    <w:unhideWhenUsed/>
+    <w:rsid w:val="00963AE3"/>
+    <w:pPr>
+      <w:spacing w:after="0"/>
+      <w:ind w:left="480"/>
+    </w:pPr>
+    <w:rPr>
+      <w:sz w:val="20"/>
+      <w:szCs w:val="20"/>
+    </w:rPr>
+  </w:style>
+  <w:style w:type="paragraph" w:styleId="TOC4">
+    <w:name w:val="toc 4"/>
+    <w:basedOn w:val="Normal"/>
+    <w:next w:val="Normal"/>
+    <w:autoRedefine/>
+    <w:uiPriority w:val="39"/>
+    <w:semiHidden/>
+    <w:unhideWhenUsed/>
+    <w:rsid w:val="00963AE3"/>
+    <w:pPr>
+      <w:spacing w:after="0"/>
+      <w:ind w:left="720"/>
+    </w:pPr>
+    <w:rPr>
+      <w:sz w:val="20"/>
+      <w:szCs w:val="20"/>
+    </w:rPr>
+  </w:style>
+  <w:style w:type="paragraph" w:styleId="TOC5">
+    <w:name w:val="toc 5"/>
+    <w:basedOn w:val="Normal"/>
+    <w:next w:val="Normal"/>
+    <w:autoRedefine/>
+    <w:uiPriority w:val="39"/>
+    <w:semiHidden/>
+    <w:unhideWhenUsed/>
+    <w:rsid w:val="00963AE3"/>
+    <w:pPr>
+      <w:spacing w:after="0"/>
+      <w:ind w:left="960"/>
+    </w:pPr>
+    <w:rPr>
+      <w:sz w:val="20"/>
+      <w:szCs w:val="20"/>
+    </w:rPr>
+  </w:style>
+  <w:style w:type="paragraph" w:styleId="TOC6">
+    <w:name w:val="toc 6"/>
+    <w:basedOn w:val="Normal"/>
+    <w:next w:val="Normal"/>
+    <w:autoRedefine/>
+    <w:uiPriority w:val="39"/>
+    <w:semiHidden/>
+    <w:unhideWhenUsed/>
+    <w:rsid w:val="00963AE3"/>
+    <w:pPr>
+      <w:spacing w:after="0"/>
+      <w:ind w:left="1200"/>
+    </w:pPr>
+    <w:rPr>
+      <w:sz w:val="20"/>
+      <w:szCs w:val="20"/>
+    </w:rPr>
+  </w:style>
+  <w:style w:type="paragraph" w:styleId="TOC7">
+    <w:name w:val="toc 7"/>
+    <w:basedOn w:val="Normal"/>
+    <w:next w:val="Normal"/>
+    <w:autoRedefine/>
+    <w:uiPriority w:val="39"/>
+    <w:semiHidden/>
+    <w:unhideWhenUsed/>
+    <w:rsid w:val="00963AE3"/>
+    <w:pPr>
+      <w:spacing w:after="0"/>
+      <w:ind w:left="1440"/>
+    </w:pPr>
+    <w:rPr>
+      <w:sz w:val="20"/>
+      <w:szCs w:val="20"/>
+    </w:rPr>
+  </w:style>
+  <w:style w:type="paragraph" w:styleId="TOC8">
+    <w:name w:val="toc 8"/>
+    <w:basedOn w:val="Normal"/>
+    <w:next w:val="Normal"/>
+    <w:autoRedefine/>
+    <w:uiPriority w:val="39"/>
+    <w:semiHidden/>
+    <w:unhideWhenUsed/>
+    <w:rsid w:val="00963AE3"/>
+    <w:pPr>
+      <w:spacing w:after="0"/>
+      <w:ind w:left="1680"/>
+    </w:pPr>
+    <w:rPr>
+      <w:sz w:val="20"/>
+      <w:szCs w:val="20"/>
+    </w:rPr>
+  </w:style>
+  <w:style w:type="paragraph" w:styleId="TOC9">
+    <w:name w:val="toc 9"/>
+    <w:basedOn w:val="Normal"/>
+    <w:next w:val="Normal"/>
+    <w:autoRedefine/>
+    <w:uiPriority w:val="39"/>
+    <w:semiHidden/>
+    <w:unhideWhenUsed/>
+    <w:rsid w:val="00963AE3"/>
+    <w:pPr>
+      <w:spacing w:after="0"/>
+      <w:ind w:left="1920"/>
+    </w:pPr>
+    <w:rPr>
+      <w:sz w:val="20"/>
+      <w:szCs w:val="20"/>
     </w:rPr>
   </w:style>
 </w:styles>
@@ -1525,4 +6187,16 @@
     </a:ext>
   </a:extLst>
 </a:theme>
+</file>
+
+<file path=customXml/item1.xml><?xml version="1.0" encoding="utf-8"?>
+<b:Sources xmlns:b="http://schemas.openxmlformats.org/officeDocument/2006/bibliography" xmlns="http://schemas.openxmlformats.org/officeDocument/2006/bibliography" SelectedStyle="/APASixthEditionOfficeOnline.xsl" StyleName="APA" Version="6"/>
+</file>
+
+<file path=customXml/itemProps1.xml><?xml version="1.0" encoding="utf-8"?>
+<ds:datastoreItem xmlns:ds="http://schemas.openxmlformats.org/officeDocument/2006/customXml" ds:itemID="{78CFB775-77B8-4B44-998C-C37B382D0B3C}">
+  <ds:schemaRefs>
+    <ds:schemaRef ds:uri="http://schemas.openxmlformats.org/officeDocument/2006/bibliography"/>
+  </ds:schemaRefs>
+</ds:datastoreItem>
 </file>
</xml_diff>